<commit_message>
Resolving the md layout v3
</commit_message>
<xml_diff>
--- a/diploma.docx
+++ b/diploma.docx
@@ -2,1276 +2,6 @@
 <file path=word/document.xml><?xml version="1.0" encoding="utf-8"?>
 <w:document xmlns:wpc="http://schemas.microsoft.com/office/word/2010/wordprocessingCanvas" xmlns:cx="http://schemas.microsoft.com/office/drawing/2014/chartex" xmlns:cx1="http://schemas.microsoft.com/office/drawing/2015/9/8/chartex" xmlns:cx2="http://schemas.microsoft.com/office/drawing/2015/10/21/chartex" xmlns:cx3="http://schemas.microsoft.com/office/drawing/2016/5/9/chartex" xmlns:cx4="http://schemas.microsoft.com/office/drawing/2016/5/10/chartex" xmlns:cx5="http://schemas.microsoft.com/office/drawing/2016/5/11/chartex" xmlns:cx6="http://schemas.microsoft.com/office/drawing/2016/5/12/chartex" xmlns:cx7="http://schemas.microsoft.com/office/drawing/2016/5/13/chartex" xmlns:cx8="http://schemas.microsoft.com/office/drawing/2016/5/14/chartex" xmlns:mc="http://schemas.openxmlformats.org/markup-compatibility/2006" xmlns:aink="http://schemas.microsoft.com/office/drawing/2016/ink" xmlns:am3d="http://schemas.microsoft.com/office/drawing/2017/model3d" xmlns:o="urn:schemas-microsoft-com:office:office" xmlns:r="http://schemas.openxmlformats.org/officeDocument/2006/relationships" xmlns:m="http://schemas.openxmlformats.org/officeDocument/2006/math" xmlns:v="urn:schemas-microsoft-com:vml" xmlns:wp14="http://schemas.microsoft.com/office/word/2010/wordprocessingDrawing" xmlns:wp="http://schemas.openxmlformats.org/drawingml/2006/wordprocessingDrawing" xmlns:w10="urn:schemas-microsoft-com:office:word" xmlns:w="http://schemas.openxmlformats.org/wordprocessingml/2006/main" xmlns:w14="http://schemas.microsoft.com/office/word/2010/wordml" xmlns:w15="http://schemas.microsoft.com/office/word/2012/wordml" xmlns:w16cid="http://schemas.microsoft.com/office/word/2016/wordml/cid" xmlns:w16se="http://schemas.microsoft.com/office/word/2015/wordml/symex" xmlns:wpg="http://schemas.microsoft.com/office/word/2010/wordprocessingGroup" xmlns:wpi="http://schemas.microsoft.com/office/word/2010/wordprocessingInk" xmlns:wne="http://schemas.microsoft.com/office/word/2006/wordml" xmlns:wps="http://schemas.microsoft.com/office/word/2010/wordprocessingShape" mc:Ignorable="w14 w15 w16se w16cid wp14">
   <w:body>
-    <w:bookmarkStart w:id="0" w:name="_Hlk215519849" w:displacedByCustomXml="next"/>
-    <w:sdt>
-      <w:sdtPr>
-        <w:rPr>
-          <w:rFonts w:asciiTheme="minorHAnsi" w:eastAsiaTheme="minorHAnsi" w:hAnsiTheme="minorHAnsi" w:cstheme="minorBidi"/>
-          <w:b w:val="0"/>
-          <w:color w:val="auto"/>
-          <w:kern w:val="2"/>
-          <w:sz w:val="24"/>
-          <w:szCs w:val="24"/>
-          <w14:ligatures w14:val="standardContextual"/>
-        </w:rPr>
-        <w:id w:val="-1492015592"/>
-        <w:docPartObj>
-          <w:docPartGallery w:val="Table of Contents"/>
-          <w:docPartUnique/>
-        </w:docPartObj>
-      </w:sdtPr>
-      <w:sdtEndPr>
-        <w:rPr>
-          <w:bCs/>
-          <w:noProof/>
-        </w:rPr>
-      </w:sdtEndPr>
-      <w:sdtContent>
-        <w:p>
-          <w:pPr>
-            <w:pStyle w:val="TOCHeading"/>
-            <w:rPr>
-              <w:lang w:val="hy-AM"/>
-            </w:rPr>
-          </w:pPr>
-          <w:r>
-            <w:rPr>
-              <w:lang w:val="hy-AM"/>
-            </w:rPr>
-            <w:t>Բովանդակություն</w:t>
-          </w:r>
-        </w:p>
-        <w:p>
-          <w:pPr>
-            <w:rPr>
-              <w:rFonts w:ascii="Sylfaen" w:hAnsi="Sylfaen"/>
-              <w:lang w:val="hy-AM"/>
-            </w:rPr>
-          </w:pPr>
-        </w:p>
-        <w:p>
-          <w:pPr>
-            <w:pStyle w:val="TOC1"/>
-            <w:rPr>
-              <w:rFonts w:eastAsiaTheme="minorEastAsia"/>
-              <w:b w:val="0"/>
-              <w:kern w:val="0"/>
-              <w:sz w:val="22"/>
-              <w:szCs w:val="22"/>
-              <w:lang w:val="en-US"/>
-              <w14:ligatures w14:val="none"/>
-            </w:rPr>
-          </w:pPr>
-          <w:r>
-            <w:rPr>
-              <w:bCs/>
-            </w:rPr>
-            <w:fldChar w:fldCharType="begin"/>
-          </w:r>
-          <w:r>
-            <w:rPr>
-              <w:bCs/>
-            </w:rPr>
-            <w:instrText xml:space="preserve"> TOC \o "1-3" \h \z \u </w:instrText>
-          </w:r>
-          <w:r>
-            <w:rPr>
-              <w:bCs/>
-            </w:rPr>
-            <w:fldChar w:fldCharType="separate"/>
-          </w:r>
-          <w:hyperlink w:anchor="_Toc215522700" w:history="1">
-            <w:r>
-              <w:rPr>
-                <w:rStyle w:val="Hyperlink"/>
-              </w:rPr>
-              <w:t>Գլուխ 1</w:t>
-            </w:r>
-            <w:r>
-              <w:rPr>
-                <w:rStyle w:val="Hyperlink"/>
-                <w:rFonts w:ascii="Cambria Math" w:hAnsi="Cambria Math" w:cs="Cambria Math"/>
-              </w:rPr>
-              <w:t>․</w:t>
-            </w:r>
-            <w:r>
-              <w:rPr>
-                <w:rStyle w:val="Hyperlink"/>
-              </w:rPr>
-              <w:t xml:space="preserve"> Գրաֆների հիմնական սահմանումները և հատկությունները</w:t>
-            </w:r>
-            <w:r>
-              <w:rPr>
-                <w:webHidden/>
-              </w:rPr>
-              <w:tab/>
-            </w:r>
-            <w:r>
-              <w:rPr>
-                <w:webHidden/>
-              </w:rPr>
-              <w:fldChar w:fldCharType="begin"/>
-            </w:r>
-            <w:r>
-              <w:rPr>
-                <w:webHidden/>
-              </w:rPr>
-              <w:instrText xml:space="preserve"> PAGEREF _Toc215522700 \h </w:instrText>
-            </w:r>
-            <w:r>
-              <w:rPr>
-                <w:webHidden/>
-              </w:rPr>
-            </w:r>
-            <w:r>
-              <w:rPr>
-                <w:webHidden/>
-              </w:rPr>
-              <w:fldChar w:fldCharType="separate"/>
-            </w:r>
-            <w:r>
-              <w:rPr>
-                <w:webHidden/>
-              </w:rPr>
-              <w:t>3</w:t>
-            </w:r>
-            <w:r>
-              <w:rPr>
-                <w:webHidden/>
-              </w:rPr>
-              <w:fldChar w:fldCharType="end"/>
-            </w:r>
-          </w:hyperlink>
-        </w:p>
-        <w:p>
-          <w:pPr>
-            <w:pStyle w:val="TOC2"/>
-            <w:tabs>
-              <w:tab w:val="right" w:leader="dot" w:pos="9969"/>
-            </w:tabs>
-            <w:rPr>
-              <w:rFonts w:cstheme="minorBidi"/>
-              <w:noProof/>
-            </w:rPr>
-          </w:pPr>
-          <w:hyperlink w:anchor="_Toc215522701" w:history="1">
-            <w:r>
-              <w:rPr>
-                <w:rStyle w:val="Hyperlink"/>
-                <w:rFonts w:ascii="Sylfaen" w:hAnsi="Sylfaen"/>
-                <w:b/>
-                <w:noProof/>
-                <w:lang w:val="hy-AM"/>
-              </w:rPr>
-              <w:t>1</w:t>
-            </w:r>
-            <w:r>
-              <w:rPr>
-                <w:rStyle w:val="Hyperlink"/>
-                <w:rFonts w:ascii="Sylfaen" w:hAnsi="Sylfaen"/>
-                <w:b/>
-                <w:noProof/>
-              </w:rPr>
-              <w:t xml:space="preserve">.1 </w:t>
-            </w:r>
-            <w:r>
-              <w:rPr>
-                <w:rStyle w:val="Hyperlink"/>
-                <w:b/>
-                <w:noProof/>
-              </w:rPr>
-              <w:t xml:space="preserve">Գրաֆների վերաբերյալ հիմնական </w:t>
-            </w:r>
-            <w:r>
-              <w:rPr>
-                <w:rStyle w:val="Hyperlink"/>
-                <w:b/>
-                <w:noProof/>
-                <w:lang w:val="hy-AM"/>
-              </w:rPr>
-              <w:t>տեղեկություններ</w:t>
-            </w:r>
-            <w:r>
-              <w:rPr>
-                <w:noProof/>
-                <w:webHidden/>
-              </w:rPr>
-              <w:tab/>
-            </w:r>
-            <w:r>
-              <w:rPr>
-                <w:noProof/>
-                <w:webHidden/>
-              </w:rPr>
-              <w:fldChar w:fldCharType="begin"/>
-            </w:r>
-            <w:r>
-              <w:rPr>
-                <w:noProof/>
-                <w:webHidden/>
-              </w:rPr>
-              <w:instrText xml:space="preserve"> PAGEREF _Toc215522701 \h </w:instrText>
-            </w:r>
-            <w:r>
-              <w:rPr>
-                <w:noProof/>
-                <w:webHidden/>
-              </w:rPr>
-            </w:r>
-            <w:r>
-              <w:rPr>
-                <w:noProof/>
-                <w:webHidden/>
-              </w:rPr>
-              <w:fldChar w:fldCharType="separate"/>
-            </w:r>
-            <w:r>
-              <w:rPr>
-                <w:noProof/>
-                <w:webHidden/>
-              </w:rPr>
-              <w:t>3</w:t>
-            </w:r>
-            <w:r>
-              <w:rPr>
-                <w:noProof/>
-                <w:webHidden/>
-              </w:rPr>
-              <w:fldChar w:fldCharType="end"/>
-            </w:r>
-          </w:hyperlink>
-        </w:p>
-        <w:p>
-          <w:pPr>
-            <w:pStyle w:val="TOC2"/>
-            <w:tabs>
-              <w:tab w:val="right" w:leader="dot" w:pos="9969"/>
-            </w:tabs>
-            <w:rPr>
-              <w:rFonts w:cstheme="minorBidi"/>
-              <w:noProof/>
-            </w:rPr>
-          </w:pPr>
-          <w:hyperlink w:anchor="_Toc215522702" w:history="1">
-            <w:r>
-              <w:rPr>
-                <w:rStyle w:val="Hyperlink"/>
-                <w:b/>
-                <w:noProof/>
-                <w:lang w:val="hy-AM"/>
-              </w:rPr>
-              <w:t>1</w:t>
-            </w:r>
-            <w:r>
-              <w:rPr>
-                <w:rStyle w:val="Hyperlink"/>
-                <w:rFonts w:ascii="Cambria Math" w:eastAsia="MS Mincho" w:hAnsi="Cambria Math" w:cs="Cambria Math"/>
-                <w:b/>
-                <w:noProof/>
-                <w:lang w:val="hy-AM"/>
-              </w:rPr>
-              <w:t>․</w:t>
-            </w:r>
-            <w:r>
-              <w:rPr>
-                <w:rStyle w:val="Hyperlink"/>
-                <w:rFonts w:eastAsia="MS Mincho" w:cs="MS Mincho"/>
-                <w:b/>
-                <w:noProof/>
-                <w:lang w:val="hy-AM"/>
-              </w:rPr>
-              <w:t>2</w:t>
-            </w:r>
-            <w:r>
-              <w:rPr>
-                <w:rStyle w:val="Hyperlink"/>
-                <w:b/>
-                <w:noProof/>
-                <w:lang w:val="hy-AM"/>
-              </w:rPr>
-              <w:t xml:space="preserve"> Աստիճաններ, ենթագրաֆներ և ճանապարհներ</w:t>
-            </w:r>
-            <w:r>
-              <w:rPr>
-                <w:noProof/>
-                <w:webHidden/>
-              </w:rPr>
-              <w:tab/>
-            </w:r>
-            <w:r>
-              <w:rPr>
-                <w:noProof/>
-                <w:webHidden/>
-              </w:rPr>
-              <w:fldChar w:fldCharType="begin"/>
-            </w:r>
-            <w:r>
-              <w:rPr>
-                <w:noProof/>
-                <w:webHidden/>
-              </w:rPr>
-              <w:instrText xml:space="preserve"> PAGEREF _Toc215522702 \h </w:instrText>
-            </w:r>
-            <w:r>
-              <w:rPr>
-                <w:noProof/>
-                <w:webHidden/>
-              </w:rPr>
-            </w:r>
-            <w:r>
-              <w:rPr>
-                <w:noProof/>
-                <w:webHidden/>
-              </w:rPr>
-              <w:fldChar w:fldCharType="separate"/>
-            </w:r>
-            <w:r>
-              <w:rPr>
-                <w:noProof/>
-                <w:webHidden/>
-              </w:rPr>
-              <w:t>6</w:t>
-            </w:r>
-            <w:r>
-              <w:rPr>
-                <w:noProof/>
-                <w:webHidden/>
-              </w:rPr>
-              <w:fldChar w:fldCharType="end"/>
-            </w:r>
-          </w:hyperlink>
-        </w:p>
-        <w:p>
-          <w:pPr>
-            <w:pStyle w:val="TOC2"/>
-            <w:tabs>
-              <w:tab w:val="right" w:leader="dot" w:pos="9969"/>
-            </w:tabs>
-            <w:rPr>
-              <w:rFonts w:cstheme="minorBidi"/>
-              <w:noProof/>
-            </w:rPr>
-          </w:pPr>
-          <w:hyperlink w:anchor="_Toc215522703" w:history="1">
-            <w:r>
-              <w:rPr>
-                <w:rStyle w:val="Hyperlink"/>
-                <w:b/>
-                <w:noProof/>
-              </w:rPr>
-              <w:t>1.3. Կապակցվածության բաղադրիչներ և կապակցված գրաֆներ</w:t>
-            </w:r>
-            <w:r>
-              <w:rPr>
-                <w:noProof/>
-                <w:webHidden/>
-              </w:rPr>
-              <w:tab/>
-            </w:r>
-            <w:r>
-              <w:rPr>
-                <w:noProof/>
-                <w:webHidden/>
-              </w:rPr>
-              <w:fldChar w:fldCharType="begin"/>
-            </w:r>
-            <w:r>
-              <w:rPr>
-                <w:noProof/>
-                <w:webHidden/>
-              </w:rPr>
-              <w:instrText xml:space="preserve"> PAGEREF _Toc215522703 \h </w:instrText>
-            </w:r>
-            <w:r>
-              <w:rPr>
-                <w:noProof/>
-                <w:webHidden/>
-              </w:rPr>
-            </w:r>
-            <w:r>
-              <w:rPr>
-                <w:noProof/>
-                <w:webHidden/>
-              </w:rPr>
-              <w:fldChar w:fldCharType="separate"/>
-            </w:r>
-            <w:r>
-              <w:rPr>
-                <w:noProof/>
-                <w:webHidden/>
-              </w:rPr>
-              <w:t>10</w:t>
-            </w:r>
-            <w:r>
-              <w:rPr>
-                <w:noProof/>
-                <w:webHidden/>
-              </w:rPr>
-              <w:fldChar w:fldCharType="end"/>
-            </w:r>
-          </w:hyperlink>
-        </w:p>
-        <w:p>
-          <w:pPr>
-            <w:pStyle w:val="TOC2"/>
-            <w:tabs>
-              <w:tab w:val="right" w:leader="dot" w:pos="9969"/>
-            </w:tabs>
-            <w:rPr>
-              <w:rFonts w:cstheme="minorBidi"/>
-              <w:noProof/>
-            </w:rPr>
-          </w:pPr>
-          <w:hyperlink w:anchor="_Toc215522704" w:history="1">
-            <w:r>
-              <w:rPr>
-                <w:rStyle w:val="Hyperlink"/>
-                <w:b/>
-                <w:noProof/>
-              </w:rPr>
-              <w:t>1.4 Գրաֆի Կշիռ</w:t>
-            </w:r>
-            <w:r>
-              <w:rPr>
-                <w:noProof/>
-                <w:webHidden/>
-              </w:rPr>
-              <w:tab/>
-            </w:r>
-            <w:r>
-              <w:rPr>
-                <w:noProof/>
-                <w:webHidden/>
-              </w:rPr>
-              <w:fldChar w:fldCharType="begin"/>
-            </w:r>
-            <w:r>
-              <w:rPr>
-                <w:noProof/>
-                <w:webHidden/>
-              </w:rPr>
-              <w:instrText xml:space="preserve"> PAGEREF _Toc215522704 \h </w:instrText>
-            </w:r>
-            <w:r>
-              <w:rPr>
-                <w:noProof/>
-                <w:webHidden/>
-              </w:rPr>
-            </w:r>
-            <w:r>
-              <w:rPr>
-                <w:noProof/>
-                <w:webHidden/>
-              </w:rPr>
-              <w:fldChar w:fldCharType="separate"/>
-            </w:r>
-            <w:r>
-              <w:rPr>
-                <w:noProof/>
-                <w:webHidden/>
-              </w:rPr>
-              <w:t>11</w:t>
-            </w:r>
-            <w:r>
-              <w:rPr>
-                <w:noProof/>
-                <w:webHidden/>
-              </w:rPr>
-              <w:fldChar w:fldCharType="end"/>
-            </w:r>
-          </w:hyperlink>
-        </w:p>
-        <w:p>
-          <w:pPr>
-            <w:pStyle w:val="TOC2"/>
-            <w:tabs>
-              <w:tab w:val="right" w:leader="dot" w:pos="9969"/>
-            </w:tabs>
-            <w:rPr>
-              <w:rFonts w:cstheme="minorBidi"/>
-              <w:noProof/>
-            </w:rPr>
-          </w:pPr>
-          <w:hyperlink w:anchor="_Toc215522705" w:history="1">
-            <w:r>
-              <w:rPr>
-                <w:rStyle w:val="Hyperlink"/>
-                <w:b/>
-                <w:noProof/>
-                <w:lang w:val="hy-AM"/>
-              </w:rPr>
-              <w:t>1</w:t>
-            </w:r>
-            <w:r>
-              <w:rPr>
-                <w:rStyle w:val="Hyperlink"/>
-                <w:rFonts w:ascii="Cambria Math" w:hAnsi="Cambria Math"/>
-                <w:b/>
-                <w:noProof/>
-                <w:lang w:val="hy-AM"/>
-              </w:rPr>
-              <w:t>․</w:t>
-            </w:r>
-            <w:r>
-              <w:rPr>
-                <w:rStyle w:val="Hyperlink"/>
-                <w:rFonts w:ascii="Cambria Math" w:hAnsi="Cambria Math"/>
-                <w:b/>
-                <w:noProof/>
-              </w:rPr>
-              <w:t>5</w:t>
-            </w:r>
-            <w:r>
-              <w:rPr>
-                <w:rStyle w:val="Hyperlink"/>
-                <w:rFonts w:ascii="Cambria Math" w:hAnsi="Cambria Math"/>
-                <w:b/>
-                <w:noProof/>
-                <w:lang w:val="hy-AM"/>
-              </w:rPr>
-              <w:t xml:space="preserve"> </w:t>
-            </w:r>
-            <w:r>
-              <w:rPr>
-                <w:rStyle w:val="Hyperlink"/>
-                <w:b/>
-                <w:noProof/>
-              </w:rPr>
-              <w:t>Էվրիստիկ Ֆունկցիա</w:t>
-            </w:r>
-            <w:r>
-              <w:rPr>
-                <w:noProof/>
-                <w:webHidden/>
-              </w:rPr>
-              <w:tab/>
-            </w:r>
-            <w:r>
-              <w:rPr>
-                <w:noProof/>
-                <w:webHidden/>
-              </w:rPr>
-              <w:fldChar w:fldCharType="begin"/>
-            </w:r>
-            <w:r>
-              <w:rPr>
-                <w:noProof/>
-                <w:webHidden/>
-              </w:rPr>
-              <w:instrText xml:space="preserve"> PAGEREF _Toc215522705 \h </w:instrText>
-            </w:r>
-            <w:r>
-              <w:rPr>
-                <w:noProof/>
-                <w:webHidden/>
-              </w:rPr>
-            </w:r>
-            <w:r>
-              <w:rPr>
-                <w:noProof/>
-                <w:webHidden/>
-              </w:rPr>
-              <w:fldChar w:fldCharType="separate"/>
-            </w:r>
-            <w:r>
-              <w:rPr>
-                <w:noProof/>
-                <w:webHidden/>
-              </w:rPr>
-              <w:t>13</w:t>
-            </w:r>
-            <w:r>
-              <w:rPr>
-                <w:noProof/>
-                <w:webHidden/>
-              </w:rPr>
-              <w:fldChar w:fldCharType="end"/>
-            </w:r>
-          </w:hyperlink>
-        </w:p>
-        <w:p>
-          <w:pPr>
-            <w:pStyle w:val="TOC1"/>
-            <w:rPr>
-              <w:rFonts w:eastAsiaTheme="minorEastAsia"/>
-              <w:b w:val="0"/>
-              <w:kern w:val="0"/>
-              <w:sz w:val="22"/>
-              <w:szCs w:val="22"/>
-              <w:lang w:val="en-US"/>
-              <w14:ligatures w14:val="none"/>
-            </w:rPr>
-          </w:pPr>
-          <w:hyperlink w:anchor="_Toc215522706" w:history="1">
-            <w:r>
-              <w:rPr>
-                <w:rStyle w:val="Hyperlink"/>
-              </w:rPr>
-              <w:t>Գլուխ 2. Կարճագույն Ճանապարհի Որոնման Հիմնական Ալգորիթմներ</w:t>
-            </w:r>
-            <w:r>
-              <w:rPr>
-                <w:webHidden/>
-              </w:rPr>
-              <w:tab/>
-            </w:r>
-            <w:r>
-              <w:rPr>
-                <w:webHidden/>
-              </w:rPr>
-              <w:fldChar w:fldCharType="begin"/>
-            </w:r>
-            <w:r>
-              <w:rPr>
-                <w:webHidden/>
-              </w:rPr>
-              <w:instrText xml:space="preserve"> PAGEREF _Toc215522706 \h </w:instrText>
-            </w:r>
-            <w:r>
-              <w:rPr>
-                <w:webHidden/>
-              </w:rPr>
-            </w:r>
-            <w:r>
-              <w:rPr>
-                <w:webHidden/>
-              </w:rPr>
-              <w:fldChar w:fldCharType="separate"/>
-            </w:r>
-            <w:r>
-              <w:rPr>
-                <w:webHidden/>
-              </w:rPr>
-              <w:t>15</w:t>
-            </w:r>
-            <w:r>
-              <w:rPr>
-                <w:webHidden/>
-              </w:rPr>
-              <w:fldChar w:fldCharType="end"/>
-            </w:r>
-          </w:hyperlink>
-        </w:p>
-        <w:p>
-          <w:pPr>
-            <w:pStyle w:val="TOC2"/>
-            <w:tabs>
-              <w:tab w:val="right" w:leader="dot" w:pos="9969"/>
-            </w:tabs>
-            <w:rPr>
-              <w:rFonts w:cstheme="minorBidi"/>
-              <w:noProof/>
-            </w:rPr>
-          </w:pPr>
-          <w:hyperlink w:anchor="_Toc215522707" w:history="1">
-            <w:r>
-              <w:rPr>
-                <w:rStyle w:val="Hyperlink"/>
-                <w:rFonts w:ascii="GHEA Grapalat" w:hAnsi="GHEA Grapalat"/>
-                <w:b/>
-                <w:noProof/>
-              </w:rPr>
-              <w:t>2.1. Դեյքստրայի Ալգորիթմ</w:t>
-            </w:r>
-            <w:r>
-              <w:rPr>
-                <w:noProof/>
-                <w:webHidden/>
-              </w:rPr>
-              <w:tab/>
-            </w:r>
-            <w:r>
-              <w:rPr>
-                <w:noProof/>
-                <w:webHidden/>
-              </w:rPr>
-              <w:fldChar w:fldCharType="begin"/>
-            </w:r>
-            <w:r>
-              <w:rPr>
-                <w:noProof/>
-                <w:webHidden/>
-              </w:rPr>
-              <w:instrText xml:space="preserve"> PAGEREF _Toc215522707 \h </w:instrText>
-            </w:r>
-            <w:r>
-              <w:rPr>
-                <w:noProof/>
-                <w:webHidden/>
-              </w:rPr>
-            </w:r>
-            <w:r>
-              <w:rPr>
-                <w:noProof/>
-                <w:webHidden/>
-              </w:rPr>
-              <w:fldChar w:fldCharType="separate"/>
-            </w:r>
-            <w:r>
-              <w:rPr>
-                <w:noProof/>
-                <w:webHidden/>
-              </w:rPr>
-              <w:t>15</w:t>
-            </w:r>
-            <w:r>
-              <w:rPr>
-                <w:noProof/>
-                <w:webHidden/>
-              </w:rPr>
-              <w:fldChar w:fldCharType="end"/>
-            </w:r>
-          </w:hyperlink>
-        </w:p>
-        <w:p>
-          <w:pPr>
-            <w:pStyle w:val="TOC3"/>
-            <w:tabs>
-              <w:tab w:val="right" w:leader="dot" w:pos="9969"/>
-            </w:tabs>
-            <w:rPr>
-              <w:rFonts w:cstheme="minorBidi"/>
-              <w:noProof/>
-            </w:rPr>
-          </w:pPr>
-          <w:hyperlink w:anchor="_Toc215522708" w:history="1">
-            <w:r>
-              <w:rPr>
-                <w:rStyle w:val="Hyperlink"/>
-                <w:rFonts w:ascii="GHEA Grapalat" w:hAnsi="GHEA Grapalat"/>
-                <w:b/>
-                <w:noProof/>
-              </w:rPr>
-              <w:t>2.1.2 Դեյքստրայի Ալգորիթմի Քայլերի Մեխանիզմը</w:t>
-            </w:r>
-            <w:r>
-              <w:rPr>
-                <w:noProof/>
-                <w:webHidden/>
-              </w:rPr>
-              <w:tab/>
-            </w:r>
-            <w:r>
-              <w:rPr>
-                <w:noProof/>
-                <w:webHidden/>
-              </w:rPr>
-              <w:fldChar w:fldCharType="begin"/>
-            </w:r>
-            <w:r>
-              <w:rPr>
-                <w:noProof/>
-                <w:webHidden/>
-              </w:rPr>
-              <w:instrText xml:space="preserve"> PAGEREF _Toc215522708 \h </w:instrText>
-            </w:r>
-            <w:r>
-              <w:rPr>
-                <w:noProof/>
-                <w:webHidden/>
-              </w:rPr>
-            </w:r>
-            <w:r>
-              <w:rPr>
-                <w:noProof/>
-                <w:webHidden/>
-              </w:rPr>
-              <w:fldChar w:fldCharType="separate"/>
-            </w:r>
-            <w:r>
-              <w:rPr>
-                <w:noProof/>
-                <w:webHidden/>
-              </w:rPr>
-              <w:t>15</w:t>
-            </w:r>
-            <w:r>
-              <w:rPr>
-                <w:noProof/>
-                <w:webHidden/>
-              </w:rPr>
-              <w:fldChar w:fldCharType="end"/>
-            </w:r>
-          </w:hyperlink>
-        </w:p>
-        <w:p>
-          <w:pPr>
-            <w:pStyle w:val="TOC2"/>
-            <w:tabs>
-              <w:tab w:val="right" w:leader="dot" w:pos="9969"/>
-            </w:tabs>
-            <w:rPr>
-              <w:rFonts w:cstheme="minorBidi"/>
-              <w:noProof/>
-            </w:rPr>
-          </w:pPr>
-          <w:hyperlink w:anchor="_Toc215522709" w:history="1">
-            <w:r>
-              <w:rPr>
-                <w:rStyle w:val="Hyperlink"/>
-                <w:rFonts w:ascii="GHEA Grapalat" w:hAnsi="GHEA Grapalat"/>
-                <w:b/>
-                <w:noProof/>
-              </w:rPr>
-              <w:t xml:space="preserve">2.2. </w:t>
-            </w:r>
-            <w:r>
-              <w:rPr>
-                <w:rStyle w:val="Hyperlink"/>
-                <w:rFonts w:ascii="GHEA Grapalat" w:hAnsi="GHEA Grapalat"/>
-                <w:b/>
-                <w:noProof/>
-                <w:lang w:val="hy-AM"/>
-              </w:rPr>
-              <w:t>Ա</w:t>
-            </w:r>
-            <w:r>
-              <w:rPr>
-                <w:rStyle w:val="Hyperlink"/>
-                <w:rFonts w:ascii="GHEA Grapalat" w:hAnsi="GHEA Grapalat"/>
-                <w:b/>
-                <w:noProof/>
-              </w:rPr>
-              <w:t>* Ալգորիթմ</w:t>
-            </w:r>
-            <w:r>
-              <w:rPr>
-                <w:noProof/>
-                <w:webHidden/>
-              </w:rPr>
-              <w:tab/>
-            </w:r>
-            <w:r>
-              <w:rPr>
-                <w:noProof/>
-                <w:webHidden/>
-              </w:rPr>
-              <w:fldChar w:fldCharType="begin"/>
-            </w:r>
-            <w:r>
-              <w:rPr>
-                <w:noProof/>
-                <w:webHidden/>
-              </w:rPr>
-              <w:instrText xml:space="preserve"> PAGEREF _Toc215522709 \h </w:instrText>
-            </w:r>
-            <w:r>
-              <w:rPr>
-                <w:noProof/>
-                <w:webHidden/>
-              </w:rPr>
-            </w:r>
-            <w:r>
-              <w:rPr>
-                <w:noProof/>
-                <w:webHidden/>
-              </w:rPr>
-              <w:fldChar w:fldCharType="separate"/>
-            </w:r>
-            <w:r>
-              <w:rPr>
-                <w:noProof/>
-                <w:webHidden/>
-              </w:rPr>
-              <w:t>17</w:t>
-            </w:r>
-            <w:r>
-              <w:rPr>
-                <w:noProof/>
-                <w:webHidden/>
-              </w:rPr>
-              <w:fldChar w:fldCharType="end"/>
-            </w:r>
-          </w:hyperlink>
-        </w:p>
-        <w:p>
-          <w:pPr>
-            <w:pStyle w:val="TOC3"/>
-            <w:tabs>
-              <w:tab w:val="right" w:leader="dot" w:pos="9969"/>
-            </w:tabs>
-            <w:rPr>
-              <w:rFonts w:cstheme="minorBidi"/>
-              <w:noProof/>
-            </w:rPr>
-          </w:pPr>
-          <w:hyperlink w:anchor="_Toc215522710" w:history="1">
-            <w:r>
-              <w:rPr>
-                <w:rStyle w:val="Hyperlink"/>
-                <w:rFonts w:ascii="GHEA Grapalat" w:hAnsi="GHEA Grapalat"/>
-                <w:b/>
-                <w:noProof/>
-              </w:rPr>
-              <w:t>2.</w:t>
-            </w:r>
-            <w:r>
-              <w:rPr>
-                <w:rStyle w:val="Hyperlink"/>
-                <w:rFonts w:ascii="GHEA Grapalat" w:hAnsi="GHEA Grapalat"/>
-                <w:b/>
-                <w:noProof/>
-                <w:lang w:val="hy-AM"/>
-              </w:rPr>
-              <w:t>2</w:t>
-            </w:r>
-            <w:r>
-              <w:rPr>
-                <w:rStyle w:val="Hyperlink"/>
-                <w:rFonts w:ascii="GHEA Grapalat" w:hAnsi="GHEA Grapalat"/>
-                <w:b/>
-                <w:noProof/>
-              </w:rPr>
-              <w:t>.</w:t>
-            </w:r>
-            <w:r>
-              <w:rPr>
-                <w:rStyle w:val="Hyperlink"/>
-                <w:rFonts w:ascii="GHEA Grapalat" w:hAnsi="GHEA Grapalat"/>
-                <w:b/>
-                <w:noProof/>
-                <w:lang w:val="hy-AM"/>
-              </w:rPr>
-              <w:t>2</w:t>
-            </w:r>
-            <w:r>
-              <w:rPr>
-                <w:rStyle w:val="Hyperlink"/>
-                <w:rFonts w:ascii="GHEA Grapalat" w:hAnsi="GHEA Grapalat"/>
-                <w:b/>
-                <w:noProof/>
-              </w:rPr>
-              <w:t xml:space="preserve"> </w:t>
-            </w:r>
-            <w:r>
-              <w:rPr>
-                <w:rStyle w:val="Hyperlink"/>
-                <w:rFonts w:ascii="GHEA Grapalat" w:hAnsi="GHEA Grapalat"/>
-                <w:b/>
-                <w:noProof/>
-                <w:lang w:val="hy-AM"/>
-              </w:rPr>
-              <w:t>Ա</w:t>
-            </w:r>
-            <w:r>
-              <w:rPr>
-                <w:rStyle w:val="Hyperlink"/>
-                <w:rFonts w:ascii="GHEA Grapalat" w:hAnsi="GHEA Grapalat"/>
-                <w:b/>
-                <w:noProof/>
-              </w:rPr>
-              <w:t>* Ալգորիթմի Քայլերի Մեխանիզմը</w:t>
-            </w:r>
-            <w:r>
-              <w:rPr>
-                <w:noProof/>
-                <w:webHidden/>
-              </w:rPr>
-              <w:tab/>
-            </w:r>
-            <w:r>
-              <w:rPr>
-                <w:noProof/>
-                <w:webHidden/>
-              </w:rPr>
-              <w:fldChar w:fldCharType="begin"/>
-            </w:r>
-            <w:r>
-              <w:rPr>
-                <w:noProof/>
-                <w:webHidden/>
-              </w:rPr>
-              <w:instrText xml:space="preserve"> PAGEREF _Toc215522710 \h </w:instrText>
-            </w:r>
-            <w:r>
-              <w:rPr>
-                <w:noProof/>
-                <w:webHidden/>
-              </w:rPr>
-            </w:r>
-            <w:r>
-              <w:rPr>
-                <w:noProof/>
-                <w:webHidden/>
-              </w:rPr>
-              <w:fldChar w:fldCharType="separate"/>
-            </w:r>
-            <w:r>
-              <w:rPr>
-                <w:noProof/>
-                <w:webHidden/>
-              </w:rPr>
-              <w:t>17</w:t>
-            </w:r>
-            <w:r>
-              <w:rPr>
-                <w:noProof/>
-                <w:webHidden/>
-              </w:rPr>
-              <w:fldChar w:fldCharType="end"/>
-            </w:r>
-          </w:hyperlink>
-        </w:p>
-        <w:p>
-          <w:pPr>
-            <w:pStyle w:val="TOC2"/>
-            <w:tabs>
-              <w:tab w:val="right" w:leader="dot" w:pos="9969"/>
-            </w:tabs>
-            <w:rPr>
-              <w:rFonts w:cstheme="minorBidi"/>
-              <w:noProof/>
-            </w:rPr>
-          </w:pPr>
-          <w:hyperlink w:anchor="_Toc215522711" w:history="1">
-            <w:r>
-              <w:rPr>
-                <w:rStyle w:val="Hyperlink"/>
-                <w:b/>
-                <w:noProof/>
-              </w:rPr>
-              <w:t>2.3. Ալգորիթմների Համեմատություն և Դիտողություններ</w:t>
-            </w:r>
-            <w:r>
-              <w:rPr>
-                <w:noProof/>
-                <w:webHidden/>
-              </w:rPr>
-              <w:tab/>
-            </w:r>
-            <w:r>
-              <w:rPr>
-                <w:noProof/>
-                <w:webHidden/>
-              </w:rPr>
-              <w:fldChar w:fldCharType="begin"/>
-            </w:r>
-            <w:r>
-              <w:rPr>
-                <w:noProof/>
-                <w:webHidden/>
-              </w:rPr>
-              <w:instrText xml:space="preserve"> PAGEREF _Toc215522711 \h </w:instrText>
-            </w:r>
-            <w:r>
-              <w:rPr>
-                <w:noProof/>
-                <w:webHidden/>
-              </w:rPr>
-            </w:r>
-            <w:r>
-              <w:rPr>
-                <w:noProof/>
-                <w:webHidden/>
-              </w:rPr>
-              <w:fldChar w:fldCharType="separate"/>
-            </w:r>
-            <w:r>
-              <w:rPr>
-                <w:noProof/>
-                <w:webHidden/>
-              </w:rPr>
-              <w:t>19</w:t>
-            </w:r>
-            <w:r>
-              <w:rPr>
-                <w:noProof/>
-                <w:webHidden/>
-              </w:rPr>
-              <w:fldChar w:fldCharType="end"/>
-            </w:r>
-          </w:hyperlink>
-        </w:p>
-        <w:p>
-          <w:pPr>
-            <w:pStyle w:val="TOC2"/>
-            <w:tabs>
-              <w:tab w:val="right" w:leader="dot" w:pos="9969"/>
-            </w:tabs>
-            <w:rPr>
-              <w:rFonts w:cstheme="minorBidi"/>
-              <w:noProof/>
-            </w:rPr>
-          </w:pPr>
-          <w:hyperlink w:anchor="_Toc215522712" w:history="1">
-            <w:r>
-              <w:rPr>
-                <w:rStyle w:val="Hyperlink"/>
-                <w:b/>
-                <w:noProof/>
-              </w:rPr>
-              <w:t>2.4. Տվյալների Բազաների Կառավարման Համակարգերը (DBMS) և Ոչ Ռելացիոն (NoSQL) Մոդելները</w:t>
-            </w:r>
-            <w:r>
-              <w:rPr>
-                <w:noProof/>
-                <w:webHidden/>
-              </w:rPr>
-              <w:tab/>
-            </w:r>
-            <w:r>
-              <w:rPr>
-                <w:noProof/>
-                <w:webHidden/>
-              </w:rPr>
-              <w:fldChar w:fldCharType="begin"/>
-            </w:r>
-            <w:r>
-              <w:rPr>
-                <w:noProof/>
-                <w:webHidden/>
-              </w:rPr>
-              <w:instrText xml:space="preserve"> PAGEREF _Toc215522712 \h </w:instrText>
-            </w:r>
-            <w:r>
-              <w:rPr>
-                <w:noProof/>
-                <w:webHidden/>
-              </w:rPr>
-            </w:r>
-            <w:r>
-              <w:rPr>
-                <w:noProof/>
-                <w:webHidden/>
-              </w:rPr>
-              <w:fldChar w:fldCharType="separate"/>
-            </w:r>
-            <w:r>
-              <w:rPr>
-                <w:noProof/>
-                <w:webHidden/>
-              </w:rPr>
-              <w:t>20</w:t>
-            </w:r>
-            <w:r>
-              <w:rPr>
-                <w:noProof/>
-                <w:webHidden/>
-              </w:rPr>
-              <w:fldChar w:fldCharType="end"/>
-            </w:r>
-          </w:hyperlink>
-        </w:p>
-        <w:p>
-          <w:pPr>
-            <w:rPr>
-              <w:b/>
-              <w:bCs/>
-              <w:noProof/>
-            </w:rPr>
-          </w:pPr>
-          <w:r>
-            <w:rPr>
-              <w:b/>
-              <w:bCs/>
-              <w:noProof/>
-            </w:rPr>
-            <w:fldChar w:fldCharType="end"/>
-          </w:r>
-        </w:p>
-      </w:sdtContent>
-    </w:sdt>
-    <w:p>
-      <w:pPr>
-        <w:pStyle w:val="Heading9"/>
-        <w:spacing w:before="224"/>
-        <w:rPr>
-          <w:rFonts w:ascii="GHEA Grapalat" w:hAnsi="GHEA Grapalat"/>
-          <w:b/>
-          <w:sz w:val="32"/>
-          <w:szCs w:val="32"/>
-          <w:lang w:val="hy-AM"/>
-        </w:rPr>
-      </w:pPr>
-    </w:p>
-    <w:p>
-      <w:pPr>
-        <w:rPr>
-          <w:rFonts w:ascii="Arial" w:hAnsi="Arial"/>
-          <w:lang w:val="hy-AM"/>
-        </w:rPr>
-      </w:pPr>
-    </w:p>
-    <w:p>
-      <w:pPr>
-        <w:rPr>
-          <w:rFonts w:ascii="Arial" w:hAnsi="Arial"/>
-          <w:lang w:val="hy-AM"/>
-        </w:rPr>
-      </w:pPr>
-    </w:p>
-    <w:p>
-      <w:pPr>
-        <w:rPr>
-          <w:rFonts w:ascii="Arial" w:hAnsi="Arial"/>
-          <w:lang w:val="hy-AM"/>
-        </w:rPr>
-      </w:pPr>
-    </w:p>
-    <w:p>
-      <w:pPr>
-        <w:rPr>
-          <w:rFonts w:ascii="Arial" w:hAnsi="Arial"/>
-          <w:lang w:val="hy-AM"/>
-        </w:rPr>
-      </w:pPr>
-    </w:p>
-    <w:p>
-      <w:pPr>
-        <w:rPr>
-          <w:rFonts w:ascii="Arial" w:hAnsi="Arial"/>
-          <w:lang w:val="hy-AM"/>
-        </w:rPr>
-      </w:pPr>
-    </w:p>
-    <w:p>
-      <w:pPr>
-        <w:rPr>
-          <w:rFonts w:ascii="Arial" w:hAnsi="Arial"/>
-          <w:lang w:val="hy-AM"/>
-        </w:rPr>
-      </w:pPr>
-    </w:p>
-    <w:p>
-      <w:pPr>
-        <w:rPr>
-          <w:rFonts w:ascii="Arial" w:hAnsi="Arial"/>
-          <w:lang w:val="hy-AM"/>
-        </w:rPr>
-      </w:pPr>
-    </w:p>
-    <w:p>
-      <w:pPr>
-        <w:rPr>
-          <w:rFonts w:ascii="Arial" w:hAnsi="Arial"/>
-          <w:lang w:val="hy-AM"/>
-        </w:rPr>
-      </w:pPr>
-    </w:p>
-    <w:p>
-      <w:pPr>
-        <w:rPr>
-          <w:rFonts w:ascii="Arial" w:hAnsi="Arial"/>
-          <w:lang w:val="hy-AM"/>
-        </w:rPr>
-      </w:pPr>
-    </w:p>
-    <w:p>
-      <w:pPr>
-        <w:rPr>
-          <w:rFonts w:ascii="Arial" w:hAnsi="Arial"/>
-          <w:lang w:val="hy-AM"/>
-        </w:rPr>
-      </w:pPr>
-    </w:p>
-    <w:p>
-      <w:pPr>
-        <w:rPr>
-          <w:rFonts w:ascii="Arial" w:hAnsi="Arial"/>
-          <w:lang w:val="hy-AM"/>
-        </w:rPr>
-      </w:pPr>
-    </w:p>
     <w:p>
       <w:pPr>
         <w:pStyle w:val="Heading9"/>
@@ -1286,6 +16,9 @@
           <w:lang w:val="hy-AM"/>
         </w:rPr>
       </w:pPr>
+      <w:bookmarkStart w:id="0" w:name="_Hlk215519849"/>
+      <w:bookmarkStart w:id="1" w:name="_GoBack"/>
+      <w:bookmarkEnd w:id="1"/>
       <w:r>
         <w:rPr>
           <w:rFonts w:ascii="GHEA Grapalat" w:hAnsi="GHEA Grapalat"/>
@@ -1294,7 +27,6 @@
           <w:szCs w:val="32"/>
           <w:lang w:val="hy-AM"/>
         </w:rPr>
-        <w:lastRenderedPageBreak/>
         <w:t>Նախաբան</w:t>
       </w:r>
     </w:p>
@@ -1429,7 +161,7 @@
           <w:lang w:val="hy-AM"/>
         </w:rPr>
       </w:pPr>
-      <w:bookmarkStart w:id="1" w:name="_Toc215522700"/>
+      <w:bookmarkStart w:id="2" w:name="_Toc215522700"/>
       <w:r>
         <w:rPr>
           <w:lang w:val="hy-AM"/>
@@ -1449,75 +181,75 @@
           <w:lang w:val="hy-AM"/>
         </w:rPr>
         <w:t xml:space="preserve"> Գրաֆների հիմնական սահմանումները և հատկությունները</w:t>
-      </w:r>
-      <w:bookmarkEnd w:id="1"/>
-    </w:p>
-    <w:p>
-      <w:pPr>
-        <w:spacing w:after="0"/>
-        <w:ind w:left="720"/>
-        <w:rPr>
-          <w:rFonts w:ascii="GHEA Grapalat" w:hAnsi="GHEA Grapalat"/>
-        </w:rPr>
-      </w:pPr>
-    </w:p>
-    <w:p>
-      <w:pPr>
-        <w:ind w:left="720"/>
-        <w:jc w:val="center"/>
-        <w:rPr>
-          <w:rFonts w:ascii="GHEA Grapalat" w:hAnsi="GHEA Grapalat"/>
-          <w:b/>
-          <w:bCs/>
-        </w:rPr>
-      </w:pPr>
-    </w:p>
-    <w:p>
-      <w:pPr>
-        <w:pStyle w:val="Heading2"/>
-        <w:rPr>
-          <w:b/>
-          <w:color w:val="auto"/>
-          <w:lang w:val="hy-AM"/>
-        </w:rPr>
-      </w:pPr>
-      <w:bookmarkStart w:id="2" w:name="_Toc215522701"/>
-      <w:r>
-        <w:rPr>
-          <w:rFonts w:ascii="Sylfaen" w:hAnsi="Sylfaen"/>
-          <w:b/>
-          <w:color w:val="auto"/>
-          <w:lang w:val="hy-AM"/>
-        </w:rPr>
-        <w:t>1</w:t>
-      </w:r>
-      <w:r>
-        <w:rPr>
-          <w:rFonts w:ascii="Sylfaen" w:hAnsi="Sylfaen"/>
-          <w:b/>
-          <w:color w:val="auto"/>
-        </w:rPr>
-        <w:t xml:space="preserve">.1 </w:t>
-      </w:r>
-      <w:r>
-        <w:rPr>
-          <w:b/>
-          <w:color w:val="auto"/>
-        </w:rPr>
-        <w:t xml:space="preserve">Գրաֆների վերաբերյալ հիմնական </w:t>
-      </w:r>
-      <w:r>
-        <w:rPr>
-          <w:b/>
-          <w:color w:val="auto"/>
-          <w:lang w:val="hy-AM"/>
-        </w:rPr>
-        <w:t>տեղեկություններ</w:t>
       </w:r>
       <w:bookmarkEnd w:id="2"/>
     </w:p>
     <w:p>
       <w:pPr>
+        <w:spacing w:after="0"/>
+        <w:ind w:left="720"/>
+        <w:rPr>
+          <w:rFonts w:ascii="GHEA Grapalat" w:hAnsi="GHEA Grapalat"/>
+        </w:rPr>
+      </w:pPr>
+    </w:p>
+    <w:p>
+      <w:pPr>
+        <w:ind w:left="720"/>
+        <w:jc w:val="center"/>
+        <w:rPr>
+          <w:rFonts w:ascii="GHEA Grapalat" w:hAnsi="GHEA Grapalat"/>
+          <w:b/>
+          <w:bCs/>
+        </w:rPr>
+      </w:pPr>
+    </w:p>
+    <w:p>
+      <w:pPr>
+        <w:pStyle w:val="Heading2"/>
+        <w:rPr>
+          <w:b/>
+          <w:color w:val="auto"/>
+          <w:lang w:val="hy-AM"/>
+        </w:rPr>
+      </w:pPr>
+      <w:bookmarkStart w:id="3" w:name="_Toc215522701"/>
+      <w:r>
+        <w:rPr>
+          <w:rFonts w:ascii="Sylfaen" w:hAnsi="Sylfaen"/>
+          <w:b/>
+          <w:color w:val="auto"/>
+          <w:lang w:val="hy-AM"/>
+        </w:rPr>
+        <w:t>1</w:t>
+      </w:r>
+      <w:r>
+        <w:rPr>
+          <w:rFonts w:ascii="Sylfaen" w:hAnsi="Sylfaen"/>
+          <w:b/>
+          <w:color w:val="auto"/>
+        </w:rPr>
+        <w:t xml:space="preserve">.1 </w:t>
+      </w:r>
+      <w:r>
+        <w:rPr>
+          <w:b/>
+          <w:color w:val="auto"/>
+        </w:rPr>
+        <w:t xml:space="preserve">Գրաֆների վերաբերյալ հիմնական </w:t>
+      </w:r>
+      <w:r>
+        <w:rPr>
+          <w:b/>
+          <w:color w:val="auto"/>
+          <w:lang w:val="hy-AM"/>
+        </w:rPr>
+        <w:t>տեղեկություններ</w:t>
+      </w:r>
+      <w:bookmarkEnd w:id="3"/>
+    </w:p>
+    <w:p>
+      <w:pPr>
         <w:pStyle w:val="ListParagraph"/>
         <w:ind w:left="1440"/>
         <w:rPr>
@@ -1627,7 +359,7 @@
         <w:t xml:space="preserve">-ը ցանկացած ոչ դատարկ վերջավոր բազմություն է, եւ դիցուք </w:t>
       </w:r>
     </w:p>
-    <w:bookmarkStart w:id="3" w:name="OLE_LINK1"/>
+    <w:bookmarkStart w:id="4" w:name="OLE_LINK1"/>
     <w:p>
       <w:pPr>
         <w:ind w:left="720"/>
@@ -1682,7 +414,7 @@
         </w:rPr>
         <w:t>-</w:t>
       </w:r>
-      <w:bookmarkEnd w:id="3"/>
+      <w:bookmarkEnd w:id="4"/>
       <w:r>
         <w:rPr>
           <w:rFonts w:ascii="GHEA Grapalat" w:hAnsi="GHEA Grapalat"/>
@@ -12175,7 +10907,7 @@
         </w:rPr>
         <w:t xml:space="preserve"> </w:t>
       </w:r>
-      <w:bookmarkStart w:id="4" w:name="_Toc215522702"/>
+      <w:bookmarkStart w:id="5" w:name="_Toc215522702"/>
       <w:r>
         <w:rPr>
           <w:b/>
@@ -12210,7 +10942,7 @@
         </w:rPr>
         <w:t xml:space="preserve"> Աստիճաններ, ենթագրաֆներ և ճանապարհներ</w:t>
       </w:r>
-      <w:bookmarkEnd w:id="4"/>
+      <w:bookmarkEnd w:id="5"/>
     </w:p>
     <w:p>
       <w:pPr>
@@ -23121,7 +21853,7 @@
         <w:lastRenderedPageBreak/>
         <w:t xml:space="preserve"> </w:t>
       </w:r>
-      <w:bookmarkStart w:id="5" w:name="_Toc215522703"/>
+      <w:bookmarkStart w:id="6" w:name="_Toc215522703"/>
       <w:r>
         <w:rPr>
           <w:b/>
@@ -23129,7 +21861,7 @@
         </w:rPr>
         <w:t>1.3. Կապակցվածության բաղադրիչներ և կապակցված գրաֆներ</w:t>
       </w:r>
-      <w:bookmarkEnd w:id="5"/>
+      <w:bookmarkEnd w:id="6"/>
     </w:p>
     <w:p>
       <w:pPr>
@@ -25148,15 +23880,7 @@
         <w:rPr>
           <w:rFonts w:ascii="GHEA Grapalat" w:hAnsi="GHEA Grapalat"/>
         </w:rPr>
-        <w:t xml:space="preserve"> գրաֆում </w:t>
-      </w:r>
-      <w:bookmarkStart w:id="6" w:name="_GoBack"/>
-      <w:bookmarkEnd w:id="6"/>
-      <w:r>
-        <w:rPr>
-          <w:rFonts w:ascii="GHEA Grapalat" w:hAnsi="GHEA Grapalat"/>
-        </w:rPr>
-        <w:t xml:space="preserve">ցիկլ չկա, </w:t>
+        <w:t xml:space="preserve"> գրաֆում ցիկլ չկա, </w:t>
       </w:r>
     </w:p>
     <w:p>
@@ -38912,7 +37636,7 @@
 </file>
 
 <file path=customXml/itemProps1.xml><?xml version="1.0" encoding="utf-8"?>
-<ds:datastoreItem xmlns:ds="http://schemas.openxmlformats.org/officeDocument/2006/customXml" ds:itemID="{74FF2CA2-2C61-4874-BEB8-9B8D4E1DBB44}">
+<ds:datastoreItem xmlns:ds="http://schemas.openxmlformats.org/officeDocument/2006/customXml" ds:itemID="{6E08678B-F32E-4BFD-8758-FA23F89D7648}">
   <ds:schemaRefs>
     <ds:schemaRef ds:uri="http://schemas.openxmlformats.org/officeDocument/2006/bibliography"/>
   </ds:schemaRefs>

</xml_diff>

<commit_message>
Modified the second part added differences
</commit_message>
<xml_diff>
--- a/diploma.docx
+++ b/diploma.docx
@@ -27108,6 +27108,7 @@
           <w:rFonts w:ascii="GHEA Grapalat" w:hAnsi="GHEA Grapalat"/>
           <w:b/>
           <w:color w:val="auto"/>
+          <w:lang w:val="hy-AM"/>
         </w:rPr>
       </w:pPr>
       <w:bookmarkStart w:id="9" w:name="_Toc215522707"/>
@@ -27117,9 +27118,18 @@
           <w:b/>
           <w:color w:val="auto"/>
         </w:rPr>
-        <w:t>2.1. Դեյքստրայի Ալգորիթմ</w:t>
+        <w:t xml:space="preserve">2.1. </w:t>
       </w:r>
       <w:bookmarkEnd w:id="9"/>
+      <w:r>
+        <w:rPr>
+          <w:rFonts w:ascii="GHEA Grapalat" w:hAnsi="GHEA Grapalat"/>
+          <w:b/>
+          <w:color w:val="auto"/>
+          <w:lang w:val="hy-AM"/>
+        </w:rPr>
+        <w:t>Գլխում օգտագործվող սահմանումներ և հատկություններ</w:t>
+      </w:r>
     </w:p>
     <w:p/>
     <w:p>
@@ -27138,7 +27148,24 @@
           <w:b/>
           <w:color w:val="auto"/>
         </w:rPr>
-        <w:t>2.1.1. Սահմանում և Հատկություններ</w:t>
+        <w:t xml:space="preserve">2.1.1. </w:t>
+      </w:r>
+      <w:r>
+        <w:rPr>
+          <w:rFonts w:ascii="GHEA Grapalat" w:hAnsi="GHEA Grapalat"/>
+          <w:b/>
+          <w:color w:val="auto"/>
+          <w:lang w:val="hy-AM"/>
+        </w:rPr>
+        <w:t xml:space="preserve">Դեյքստրայի ալգորիթմ։ </w:t>
+      </w:r>
+      <w:r>
+        <w:rPr>
+          <w:rFonts w:ascii="GHEA Grapalat" w:hAnsi="GHEA Grapalat"/>
+          <w:b/>
+          <w:color w:val="auto"/>
+        </w:rPr>
+        <w:t>Սահմանում և Հատկություններ</w:t>
       </w:r>
     </w:p>
     <w:p>
@@ -27350,7 +27377,24 @@
           <w:b/>
           <w:color w:val="auto"/>
         </w:rPr>
-        <w:t>2.1.2 Դեյքստրայի Ալգորիթմի Քայլերի Մեխանիզմը</w:t>
+        <w:t>2.1.</w:t>
+      </w:r>
+      <w:r>
+        <w:rPr>
+          <w:rFonts w:ascii="GHEA Grapalat" w:hAnsi="GHEA Grapalat"/>
+          <w:b/>
+          <w:color w:val="auto"/>
+          <w:lang w:val="hy-AM"/>
+        </w:rPr>
+        <w:t>2</w:t>
+      </w:r>
+      <w:r>
+        <w:rPr>
+          <w:rFonts w:ascii="GHEA Grapalat" w:hAnsi="GHEA Grapalat"/>
+          <w:b/>
+          <w:color w:val="auto"/>
+        </w:rPr>
+        <w:t xml:space="preserve"> Դեյքստրայի Ալգորիթմի Քայլերի Մեխանիզմը</w:t>
       </w:r>
       <w:bookmarkEnd w:id="10"/>
     </w:p>
@@ -28498,131 +28542,127 @@
         </w:rPr>
       </w:pPr>
     </w:p>
+    <w:p/>
     <w:p>
       <w:pPr>
-        <w:pStyle w:val="NormalWeb"/>
-        <w:rPr>
-          <w:rFonts w:ascii="GHEA Grapalat" w:hAnsi="GHEA Grapalat"/>
-        </w:rPr>
-      </w:pPr>
+        <w:pStyle w:val="Heading4"/>
+        <w:ind w:left="720"/>
+        <w:rPr>
+          <w:rFonts w:ascii="GHEA Grapalat" w:hAnsi="GHEA Grapalat"/>
+          <w:b/>
+          <w:color w:val="auto"/>
+        </w:rPr>
+      </w:pPr>
+      <w:r>
+        <w:rPr>
+          <w:rFonts w:ascii="GHEA Grapalat" w:hAnsi="GHEA Grapalat"/>
+          <w:b/>
+          <w:color w:val="auto"/>
+        </w:rPr>
+        <w:lastRenderedPageBreak/>
+        <w:t>2.</w:t>
+      </w:r>
+      <w:r>
+        <w:rPr>
+          <w:rFonts w:ascii="GHEA Grapalat" w:hAnsi="GHEA Grapalat"/>
+          <w:b/>
+          <w:color w:val="auto"/>
+          <w:lang w:val="hy-AM"/>
+        </w:rPr>
+        <w:t>1</w:t>
+      </w:r>
+      <w:r>
+        <w:rPr>
+          <w:rFonts w:ascii="GHEA Grapalat" w:hAnsi="GHEA Grapalat"/>
+          <w:b/>
+          <w:color w:val="auto"/>
+        </w:rPr>
+        <w:t>.1.</w:t>
+      </w:r>
+      <w:r>
+        <w:rPr>
+          <w:rFonts w:ascii="GHEA Grapalat" w:hAnsi="GHEA Grapalat"/>
+          <w:b/>
+          <w:color w:val="auto"/>
+          <w:lang w:val="hy-AM"/>
+        </w:rPr>
+        <w:t xml:space="preserve"> </w:t>
+      </w:r>
+      <w:r>
+        <w:rPr>
+          <w:rFonts w:ascii="GHEA Grapalat" w:hAnsi="GHEA Grapalat"/>
+          <w:b/>
+          <w:color w:val="auto"/>
+          <w:lang w:val="hy-AM"/>
+        </w:rPr>
+        <w:t>Ա</w:t>
+      </w:r>
+      <w:r>
+        <w:rPr>
+          <w:rFonts w:ascii="GHEA Grapalat" w:hAnsi="GHEA Grapalat"/>
+          <w:b/>
+          <w:color w:val="auto"/>
+        </w:rPr>
+        <w:t>* Ալգորիթմ</w:t>
+      </w:r>
+      <w:r>
+        <w:rPr>
+          <w:rFonts w:ascii="GHEA Grapalat" w:hAnsi="GHEA Grapalat"/>
+          <w:b/>
+          <w:color w:val="auto"/>
+          <w:lang w:val="hy-AM"/>
+        </w:rPr>
+        <w:t>։</w:t>
+      </w:r>
+      <w:r>
+        <w:rPr>
+          <w:rFonts w:ascii="GHEA Grapalat" w:hAnsi="GHEA Grapalat"/>
+          <w:b/>
+          <w:color w:val="auto"/>
+        </w:rPr>
+        <w:t xml:space="preserve"> Սահմանում և Հատկություններ</w:t>
+      </w:r>
     </w:p>
     <w:p>
       <w:pPr>
         <w:pStyle w:val="NormalWeb"/>
-        <w:rPr>
-          <w:rFonts w:ascii="GHEA Grapalat" w:hAnsi="GHEA Grapalat"/>
-        </w:rPr>
-      </w:pPr>
+        <w:ind w:left="720"/>
+        <w:rPr>
+          <w:rFonts w:ascii="GHEA Grapalat" w:hAnsi="GHEA Grapalat"/>
+        </w:rPr>
+      </w:pPr>
+      <w:r>
+        <w:rPr>
+          <w:rFonts w:ascii="GHEA Grapalat" w:hAnsi="GHEA Grapalat"/>
+          <w:lang w:val="hy-AM"/>
+        </w:rPr>
+        <w:t>Ա</w:t>
+      </w:r>
+      <w:r>
+        <w:rPr>
+          <w:rFonts w:ascii="GHEA Grapalat" w:hAnsi="GHEA Grapalat"/>
+        </w:rPr>
+        <w:t xml:space="preserve">* ալգորիթմը կարճագույն ճանապարհի որոնման ընդլայնված ալգորիթմ է, որը ներկայացվել է 1968 թվականին Պիտեր Հարթի, Նիլսոնի և Ռաֆայելի կողմից։ Այն կարելի է դիտարկել որպես Դեյքստրայի ալգորիթմի ընդլայնում, որն օգտագործում է </w:t>
+      </w:r>
+      <w:r>
+        <w:rPr>
+          <w:rFonts w:ascii="GHEA Grapalat" w:hAnsi="GHEA Grapalat"/>
+          <w:b/>
+          <w:bCs/>
+        </w:rPr>
+        <w:t>էվրիստիկ ֆունկցիա</w:t>
+      </w:r>
+      <w:r>
+        <w:rPr>
+          <w:rFonts w:ascii="GHEA Grapalat" w:hAnsi="GHEA Grapalat"/>
+        </w:rPr>
+        <w:t>՝ որոնումն ուղղորդելու նպատակակետի ուղղությամբ։</w:t>
+      </w:r>
     </w:p>
     <w:p>
       <w:pPr>
         <w:pStyle w:val="NormalWeb"/>
-        <w:rPr>
-          <w:rFonts w:ascii="GHEA Grapalat" w:hAnsi="GHEA Grapalat"/>
-        </w:rPr>
-      </w:pPr>
-    </w:p>
-    <w:p>
-      <w:pPr>
-        <w:pStyle w:val="Heading2"/>
-        <w:rPr>
-          <w:rFonts w:ascii="GHEA Grapalat" w:hAnsi="GHEA Grapalat"/>
-          <w:b/>
-          <w:color w:val="auto"/>
-        </w:rPr>
-      </w:pPr>
-      <w:bookmarkStart w:id="11" w:name="_Toc215522709"/>
-      <w:r>
-        <w:rPr>
-          <w:rFonts w:ascii="GHEA Grapalat" w:hAnsi="GHEA Grapalat"/>
-          <w:b/>
-          <w:color w:val="auto"/>
-        </w:rPr>
-        <w:t xml:space="preserve">2.2. </w:t>
-      </w:r>
-      <w:r>
-        <w:rPr>
-          <w:rFonts w:ascii="GHEA Grapalat" w:hAnsi="GHEA Grapalat"/>
-          <w:b/>
-          <w:color w:val="auto"/>
-          <w:lang w:val="hy-AM"/>
-        </w:rPr>
-        <w:t>Ա</w:t>
-      </w:r>
-      <w:r>
-        <w:rPr>
-          <w:rFonts w:ascii="GHEA Grapalat" w:hAnsi="GHEA Grapalat"/>
-          <w:b/>
-          <w:color w:val="auto"/>
-        </w:rPr>
-        <w:t>* Ալգորիթմ</w:t>
-      </w:r>
-      <w:bookmarkEnd w:id="11"/>
-    </w:p>
-    <w:p/>
-    <w:p>
-      <w:pPr>
-        <w:pStyle w:val="Heading4"/>
         <w:ind w:left="720"/>
-        <w:rPr>
-          <w:rFonts w:ascii="GHEA Grapalat" w:hAnsi="GHEA Grapalat"/>
-          <w:b/>
-          <w:color w:val="auto"/>
-        </w:rPr>
-      </w:pPr>
-      <w:r>
-        <w:rPr>
-          <w:rFonts w:ascii="GHEA Grapalat" w:hAnsi="GHEA Grapalat"/>
-          <w:b/>
-          <w:color w:val="auto"/>
-        </w:rPr>
-        <w:t>2.2.1. Սահմանում և Հատկություններ</w:t>
-      </w:r>
-    </w:p>
-    <w:p>
-      <w:pPr>
-        <w:pStyle w:val="NormalWeb"/>
-        <w:ind w:left="720"/>
-        <w:rPr>
-          <w:rFonts w:ascii="GHEA Grapalat" w:hAnsi="GHEA Grapalat"/>
-        </w:rPr>
-      </w:pPr>
-      <w:r>
-        <w:rPr>
-          <w:rFonts w:ascii="GHEA Grapalat" w:hAnsi="GHEA Grapalat"/>
-          <w:lang w:val="hy-AM"/>
-        </w:rPr>
-        <w:t>Ա</w:t>
-      </w:r>
-      <w:r>
-        <w:rPr>
-          <w:rFonts w:ascii="GHEA Grapalat" w:hAnsi="GHEA Grapalat"/>
-        </w:rPr>
-        <w:t xml:space="preserve">* ալգորիթմը կարճագույն ճանապարհի որոնման ընդլայնված ալգորիթմ է, որը ներկայացվել է 1968 թվականին Պիտեր Հարթի, Նիլսոնի և Ռաֆայելի կողմից։ Այն կարելի է դիտարկել որպես Դեյքստրայի ալգորիթմի ընդլայնում, որն օգտագործում է </w:t>
-      </w:r>
-      <w:r>
-        <w:rPr>
-          <w:rFonts w:ascii="GHEA Grapalat" w:hAnsi="GHEA Grapalat"/>
-          <w:b/>
-          <w:bCs/>
-        </w:rPr>
-        <w:t>էվրիստիկ ֆունկցիա</w:t>
-      </w:r>
-      <w:r>
-        <w:rPr>
-          <w:rFonts w:ascii="GHEA Grapalat" w:hAnsi="GHEA Grapalat"/>
-        </w:rPr>
-        <w:t>՝ որոնումն ուղղորդելու նպատակակետի ուղղությամբ։</w:t>
-      </w:r>
-    </w:p>
-    <w:p>
-      <w:pPr>
-        <w:pStyle w:val="NormalWeb"/>
-        <w:numPr>
-          <w:ilvl w:val="0"/>
-          <w:numId w:val="12"/>
-        </w:numPr>
-        <w:ind w:firstLine="0"/>
         <w:rPr>
           <w:rFonts w:ascii="GHEA Grapalat" w:hAnsi="GHEA Grapalat"/>
         </w:rPr>
@@ -28679,11 +28719,7 @@
     <w:p>
       <w:pPr>
         <w:pStyle w:val="NormalWeb"/>
-        <w:numPr>
-          <w:ilvl w:val="1"/>
-          <w:numId w:val="12"/>
-        </w:numPr>
-        <w:ind w:left="720" w:firstLine="0"/>
+        <w:ind w:left="720"/>
         <w:rPr>
           <w:rFonts w:ascii="GHEA Grapalat" w:hAnsi="GHEA Grapalat"/>
         </w:rPr>
@@ -28735,11 +28771,7 @@
     <w:p>
       <w:pPr>
         <w:pStyle w:val="NormalWeb"/>
-        <w:numPr>
-          <w:ilvl w:val="1"/>
-          <w:numId w:val="12"/>
-        </w:numPr>
-        <w:ind w:left="720" w:firstLine="0"/>
+        <w:ind w:left="720"/>
         <w:rPr>
           <w:rFonts w:ascii="GHEA Grapalat" w:hAnsi="GHEA Grapalat"/>
         </w:rPr>
@@ -28804,11 +28836,7 @@
     <w:p>
       <w:pPr>
         <w:pStyle w:val="NormalWeb"/>
-        <w:numPr>
-          <w:ilvl w:val="0"/>
-          <w:numId w:val="12"/>
-        </w:numPr>
-        <w:ind w:firstLine="0"/>
+        <w:ind w:left="720"/>
         <w:rPr>
           <w:rFonts w:ascii="GHEA Grapalat" w:hAnsi="GHEA Grapalat"/>
         </w:rPr>
@@ -28904,11 +28932,7 @@
     <w:p>
       <w:pPr>
         <w:pStyle w:val="NormalWeb"/>
-        <w:numPr>
-          <w:ilvl w:val="0"/>
-          <w:numId w:val="12"/>
-        </w:numPr>
-        <w:ind w:firstLine="0"/>
+        <w:ind w:left="720"/>
         <w:rPr>
           <w:rFonts w:ascii="GHEA Grapalat" w:hAnsi="GHEA Grapalat"/>
         </w:rPr>
@@ -28954,15 +28978,7 @@
         </w:rPr>
         <w:t xml:space="preserve"> է, ինչը նշանակում է, որ այն Դեյքստրայի ալգորիթմի համեմատ դիտարկում է շատ ավելի քիչ գագաթներ՝ զգալիորեն արագացնելով որոնումը։</w:t>
       </w:r>
-    </w:p>
-    <w:bookmarkEnd w:id="0"/>
-    <w:p>
-      <w:pPr>
-        <w:spacing w:line="360" w:lineRule="auto"/>
-        <w:rPr>
-          <w:rFonts w:ascii="GHEA Grapalat" w:hAnsi="GHEA Grapalat"/>
-        </w:rPr>
-      </w:pPr>
+      <w:bookmarkEnd w:id="0"/>
     </w:p>
     <w:p>
       <w:pPr>
@@ -28980,35 +28996,1325 @@
     </w:p>
     <w:p>
       <w:pPr>
-        <w:rPr>
-          <w:rFonts w:ascii="GHEA Grapalat" w:hAnsi="GHEA Grapalat"/>
-        </w:rPr>
-      </w:pPr>
+        <w:pStyle w:val="Heading2"/>
+        <w:rPr>
+          <w:rFonts w:ascii="GHEA Grapalat" w:eastAsia="Times New Roman" w:hAnsi="GHEA Grapalat"/>
+          <w:b/>
+          <w:color w:val="auto"/>
+          <w:lang w:val="hy-AM"/>
+        </w:rPr>
+      </w:pPr>
+      <w:r>
+        <w:rPr>
+          <w:rFonts w:ascii="GHEA Grapalat" w:eastAsia="Times New Roman" w:hAnsi="GHEA Grapalat"/>
+          <w:b/>
+          <w:color w:val="auto"/>
+          <w:lang w:val="hy-AM"/>
+        </w:rPr>
+        <w:t>2</w:t>
+      </w:r>
+      <w:r>
+        <w:rPr>
+          <w:rFonts w:ascii="Cambria Math" w:eastAsia="Times New Roman" w:hAnsi="Cambria Math"/>
+          <w:b/>
+          <w:color w:val="auto"/>
+          <w:lang w:val="hy-AM"/>
+        </w:rPr>
+        <w:t>․</w:t>
+      </w:r>
+      <w:r>
+        <w:rPr>
+          <w:rFonts w:ascii="GHEA Grapalat" w:eastAsia="Times New Roman" w:hAnsi="GHEA Grapalat"/>
+          <w:b/>
+          <w:color w:val="auto"/>
+          <w:lang w:val="hy-AM"/>
+        </w:rPr>
+        <w:t xml:space="preserve">2 </w:t>
+      </w:r>
+      <w:r>
+        <w:rPr>
+          <w:rFonts w:ascii="Cambria Math" w:eastAsia="Times New Roman" w:hAnsi="Cambria Math"/>
+          <w:b/>
+          <w:color w:val="auto"/>
+          <w:lang w:val="hy-AM"/>
+        </w:rPr>
+        <w:t xml:space="preserve"> </w:t>
+      </w:r>
+      <w:r>
+        <w:rPr>
+          <w:rFonts w:ascii="GHEA Grapalat" w:eastAsia="Times New Roman" w:hAnsi="GHEA Grapalat"/>
+          <w:b/>
+          <w:color w:val="auto"/>
+          <w:lang w:val="hy-AM"/>
+        </w:rPr>
+        <w:t>Խնդրի համատեքստ և մոտիվացիա</w:t>
+      </w:r>
     </w:p>
     <w:p>
       <w:pPr>
         <w:rPr>
-          <w:rFonts w:ascii="GHEA Grapalat" w:hAnsi="GHEA Grapalat"/>
+          <w:rFonts w:ascii="Arial" w:hAnsi="Arial"/>
+          <w:lang w:val="hy-AM"/>
         </w:rPr>
       </w:pPr>
     </w:p>
     <w:p>
       <w:pPr>
-        <w:tabs>
-          <w:tab w:val="left" w:pos="2520"/>
-        </w:tabs>
-        <w:rPr>
-          <w:rFonts w:ascii="GHEA Grapalat" w:hAnsi="GHEA Grapalat"/>
-        </w:rPr>
-      </w:pPr>
-      <w:r>
-        <w:rPr>
-          <w:rFonts w:ascii="GHEA Grapalat" w:hAnsi="GHEA Grapalat"/>
-        </w:rPr>
-        <w:tab/>
-      </w:r>
-      <w:bookmarkStart w:id="12" w:name="_GoBack"/>
-      <w:bookmarkEnd w:id="12"/>
+        <w:pStyle w:val="NormalWeb"/>
+        <w:rPr>
+          <w:rFonts w:ascii="GHEA Grapalat" w:hAnsi="GHEA Grapalat"/>
+          <w:lang w:val="hy-AM"/>
+        </w:rPr>
+      </w:pPr>
+      <w:r>
+        <w:rPr>
+          <w:rFonts w:ascii="GHEA Grapalat" w:hAnsi="GHEA Grapalat"/>
+          <w:lang w:val="hy-AM"/>
+        </w:rPr>
+        <w:t>Կարճագույն ճանապարհի հաշվարկը կենտրոնական դեր է զբաղեցնում ժամանակակից ինֆորմատիկայում, քանի որ այն հիմք է հանդիսանում համակարգային մակարդակի բազմազան աբստրակցիաների համար՝ հաղորդակցության ցանցերում փաթեթների երթուղևորումից</w:t>
+      </w:r>
+      <w:r>
+        <w:rPr>
+          <w:rFonts w:ascii="GHEA Grapalat" w:hAnsi="GHEA Grapalat"/>
+          <w:lang w:val="hy-AM"/>
+        </w:rPr>
+        <w:t>, տրանսպորտային ցանցերի նախագծումից և այլն</w:t>
+      </w:r>
+      <w:r>
+        <w:rPr>
+          <w:rFonts w:ascii="GHEA Grapalat" w:hAnsi="GHEA Grapalat"/>
+          <w:lang w:val="hy-AM"/>
+        </w:rPr>
+        <w:t>։ Գրաֆ</w:t>
+      </w:r>
+      <w:r>
+        <w:rPr>
+          <w:rFonts w:ascii="GHEA Grapalat" w:hAnsi="GHEA Grapalat"/>
+          <w:lang w:val="hy-AM"/>
+        </w:rPr>
+        <w:t>երի</w:t>
+      </w:r>
+      <w:r>
+        <w:rPr>
+          <w:rFonts w:ascii="GHEA Grapalat" w:hAnsi="GHEA Grapalat"/>
+          <w:lang w:val="hy-AM"/>
+        </w:rPr>
+        <w:t xml:space="preserve"> տեսության տերմինաբանությամբ՝ երկու գագաթների միջև նվազագույն արժեքով ճանապարհը որոշելու խնդիրը համարժեք է կոմբինատոր տարածության վրա օպտիմալացման խնդրի լուծմանը, որը էքսպոնենցիալ ընդլայնվում է</w:t>
+      </w:r>
+      <w:r>
+        <w:rPr>
+          <w:rFonts w:ascii="GHEA Grapalat" w:hAnsi="GHEA Grapalat"/>
+          <w:lang w:val="hy-AM"/>
+        </w:rPr>
+        <w:t>՝</w:t>
+      </w:r>
+      <w:r>
+        <w:rPr>
+          <w:rFonts w:ascii="GHEA Grapalat" w:hAnsi="GHEA Grapalat"/>
+          <w:lang w:val="hy-AM"/>
+        </w:rPr>
+        <w:t xml:space="preserve"> հիմքում ընկած գրաֆի չափի աճին զուգընթաց։ Հետևաբար, ճանապարհի որոնման համար կիրառվող ալգորիթմական ընտրությունները ուղղակիորեն ազդում են հաշվողական ռեսուրսների, </w:t>
+      </w:r>
+      <w:r>
+        <w:rPr>
+          <w:rFonts w:ascii="GHEA Grapalat" w:hAnsi="GHEA Grapalat"/>
+          <w:lang w:val="hy-AM"/>
+        </w:rPr>
+        <w:t>արձագանքման ժամանակի,</w:t>
+      </w:r>
+      <w:r>
+        <w:rPr>
+          <w:rFonts w:ascii="GHEA Grapalat" w:hAnsi="GHEA Grapalat"/>
+          <w:lang w:val="hy-AM"/>
+        </w:rPr>
+        <w:t xml:space="preserve"> և ծառայությունների հուսալիության վրա։</w:t>
+      </w:r>
+    </w:p>
+    <w:p>
+      <w:pPr>
+        <w:pStyle w:val="NormalWeb"/>
+        <w:rPr>
+          <w:rFonts w:ascii="GHEA Grapalat" w:hAnsi="GHEA Grapalat"/>
+          <w:lang w:val="hy-AM"/>
+        </w:rPr>
+      </w:pPr>
+    </w:p>
+    <w:p>
+      <w:pPr>
+        <w:pStyle w:val="NormalWeb"/>
+        <w:rPr>
+          <w:rFonts w:ascii="GHEA Grapalat" w:hAnsi="GHEA Grapalat"/>
+          <w:lang w:val="hy-AM"/>
+        </w:rPr>
+      </w:pPr>
+      <w:r>
+        <w:rPr>
+          <w:rFonts w:ascii="GHEA Grapalat" w:hAnsi="GHEA Grapalat"/>
+          <w:lang w:val="hy-AM"/>
+        </w:rPr>
+        <w:lastRenderedPageBreak/>
+        <w:t xml:space="preserve">Իրական աշխարհի տիրույթները ցուցադրում են առանձնահատուկ սահմանափակումներ, որոնք ազդում են ճանապարհի որոնման կոնկրետ մեթոդների հարմարելիության վրա։ Գլոբալ դիրքորոշման համակարգերում (GPS) և </w:t>
+      </w:r>
+      <w:r>
+        <w:rPr>
+          <w:rFonts w:ascii="GHEA Grapalat" w:hAnsi="GHEA Grapalat"/>
+          <w:lang w:val="hy-AM"/>
+        </w:rPr>
+        <w:t>ինտերնետ</w:t>
+      </w:r>
+      <w:r>
+        <w:rPr>
+          <w:rFonts w:ascii="GHEA Grapalat" w:hAnsi="GHEA Grapalat"/>
+          <w:lang w:val="hy-AM"/>
+        </w:rPr>
+        <w:t xml:space="preserve"> հավելվածներում ճանապարհային ցանցերի հիմքում ընկած ներկայացումը խիստ նոսր է, ընդ որում՝ գեոդեզիական հեռավորությունները ծառայում են որպես բնական էվրիստիկաներ։ Ռոբոտաշինության մեջ ճանապարհի պլանավորումը հաճախ իրականացվում է խիտ ցանցային քարտեզների կամ անընդհատ միջավայրերի վրա, որտեղ ծախսերի մոդելը կարող է ներառել տեղանքը, խոչընդոտները և դինամիկ խոչընդոտները։ Գլոբալ ցանցային երթուղևորման մեջ ստատիկ երթուղային աղյուսակները հաճախ թարմացվում են ինկրեմենտալ</w:t>
+      </w:r>
+      <w:r>
+        <w:rPr>
+          <w:rFonts w:ascii="GHEA Grapalat" w:hAnsi="GHEA Grapalat"/>
+          <w:lang w:val="hy-AM"/>
+        </w:rPr>
+        <w:t xml:space="preserve">, </w:t>
+      </w:r>
+      <w:r>
+        <w:rPr>
+          <w:rFonts w:ascii="GHEA Grapalat" w:hAnsi="GHEA Grapalat"/>
+          <w:lang w:val="hy-AM"/>
+        </w:rPr>
+        <w:t>որոնք նախապատվությունը տալիս են դետերմինիզմին և պարզությանը՝ էվրիստիկ հապճեպ լուծումների նկատմամբ</w:t>
+      </w:r>
+    </w:p>
+    <w:p>
+      <w:pPr>
+        <w:pStyle w:val="NormalWeb"/>
+        <w:rPr>
+          <w:rFonts w:ascii="GHEA Grapalat" w:hAnsi="GHEA Grapalat"/>
+          <w:lang w:val="hy-AM"/>
+        </w:rPr>
+      </w:pPr>
+    </w:p>
+    <w:p>
+      <w:pPr>
+        <w:pStyle w:val="Heading2"/>
+        <w:rPr>
+          <w:rFonts w:ascii="Arial" w:eastAsia="Times New Roman" w:hAnsi="Arial"/>
+          <w:b/>
+          <w:color w:val="auto"/>
+          <w:lang w:val="hy-AM"/>
+        </w:rPr>
+      </w:pPr>
+      <w:r>
+        <w:rPr>
+          <w:b/>
+          <w:color w:val="auto"/>
+          <w:lang w:val="hy-AM"/>
+        </w:rPr>
+        <w:t>2</w:t>
+      </w:r>
+      <w:r>
+        <w:rPr>
+          <w:rFonts w:ascii="Cambria Math" w:hAnsi="Cambria Math"/>
+          <w:b/>
+          <w:color w:val="auto"/>
+          <w:lang w:val="hy-AM"/>
+        </w:rPr>
+        <w:t>․2</w:t>
+      </w:r>
+      <w:r>
+        <w:rPr>
+          <w:rFonts w:ascii="Cambria Math" w:hAnsi="Cambria Math"/>
+          <w:b/>
+          <w:color w:val="auto"/>
+          <w:lang w:val="hy-AM"/>
+        </w:rPr>
+        <w:t>․1</w:t>
+      </w:r>
+      <w:r>
+        <w:rPr>
+          <w:rFonts w:ascii="Cambria Math" w:hAnsi="Cambria Math"/>
+          <w:b/>
+          <w:color w:val="auto"/>
+          <w:lang w:val="hy-AM"/>
+        </w:rPr>
+        <w:t xml:space="preserve"> </w:t>
+      </w:r>
+      <w:r>
+        <w:rPr>
+          <w:rFonts w:eastAsia="Times New Roman"/>
+          <w:b/>
+          <w:color w:val="auto"/>
+          <w:lang w:val="hy-AM"/>
+        </w:rPr>
+        <w:t>Ալգորիթմական համեմատություն</w:t>
+      </w:r>
+    </w:p>
+    <w:p>
+      <w:pPr>
+        <w:rPr>
+          <w:rFonts w:ascii="Arial" w:hAnsi="Arial"/>
+          <w:lang w:val="hy-AM"/>
+        </w:rPr>
+      </w:pPr>
+    </w:p>
+    <w:p>
+      <w:pPr>
+        <w:pStyle w:val="NormalWeb"/>
+        <w:rPr>
+          <w:rFonts w:ascii="GHEA Grapalat" w:hAnsi="GHEA Grapalat"/>
+          <w:lang w:val="hy-AM"/>
+        </w:rPr>
+      </w:pPr>
+      <w:r>
+        <w:rPr>
+          <w:rFonts w:ascii="GHEA Grapalat" w:hAnsi="GHEA Grapalat"/>
+          <w:lang w:val="hy-AM"/>
+        </w:rPr>
+        <w:t xml:space="preserve">Ինչպես </w:t>
+      </w:r>
+      <w:r>
+        <w:rPr>
+          <w:rFonts w:ascii="GHEA Grapalat" w:hAnsi="GHEA Grapalat"/>
+          <w:lang w:val="hy-AM"/>
+        </w:rPr>
+        <w:t>Ա</w:t>
+      </w:r>
+      <w:r>
+        <w:rPr>
+          <w:rFonts w:ascii="GHEA Grapalat" w:hAnsi="GHEA Grapalat"/>
+          <w:lang w:val="hy-AM"/>
+        </w:rPr>
+        <w:t>*</w:t>
+      </w:r>
+      <w:r>
+        <w:rPr>
+          <w:rFonts w:ascii="GHEA Grapalat" w:hAnsi="GHEA Grapalat"/>
+          <w:lang w:val="hy-AM"/>
+        </w:rPr>
+        <w:t>-ն</w:t>
+      </w:r>
+      <w:r>
+        <w:rPr>
+          <w:rFonts w:ascii="GHEA Grapalat" w:hAnsi="GHEA Grapalat"/>
+          <w:lang w:val="hy-AM"/>
+        </w:rPr>
+        <w:t xml:space="preserve">, այնպես էլ </w:t>
+      </w:r>
+      <w:r>
+        <w:rPr>
+          <w:rFonts w:ascii="GHEA Grapalat" w:hAnsi="GHEA Grapalat"/>
+          <w:lang w:val="hy-AM"/>
+        </w:rPr>
+        <w:t>Դեյքստրայի</w:t>
+      </w:r>
+      <w:r>
+        <w:rPr>
+          <w:rFonts w:ascii="GHEA Grapalat" w:hAnsi="GHEA Grapalat"/>
+          <w:lang w:val="hy-AM"/>
+        </w:rPr>
+        <w:t xml:space="preserve"> ալգորիթմը պատկանում են գրաֆի </w:t>
+      </w:r>
+      <w:r>
+        <w:rPr>
+          <w:rFonts w:ascii="GHEA Grapalat" w:hAnsi="GHEA Grapalat"/>
+          <w:b/>
+          <w:lang w:val="hy-AM"/>
+        </w:rPr>
+        <w:t>լավագույն-առաջին</w:t>
+      </w:r>
+      <w:r>
+        <w:rPr>
+          <w:rFonts w:ascii="GHEA Grapalat" w:hAnsi="GHEA Grapalat"/>
+          <w:lang w:val="hy-AM"/>
+        </w:rPr>
+        <w:t xml:space="preserve"> որոնման ընտանիքին, սակայն նրանց հիմքում ընկած սկզբունքները </w:t>
+      </w:r>
+      <w:r>
+        <w:rPr>
+          <w:rFonts w:ascii="GHEA Grapalat" w:hAnsi="GHEA Grapalat"/>
+          <w:lang w:val="hy-AM"/>
+        </w:rPr>
+        <w:t>մասամբ</w:t>
+      </w:r>
+      <w:r>
+        <w:rPr>
+          <w:rFonts w:ascii="GHEA Grapalat" w:hAnsi="GHEA Grapalat"/>
+          <w:lang w:val="hy-AM"/>
+        </w:rPr>
+        <w:t xml:space="preserve"> տարբերվում են։ </w:t>
+      </w:r>
+      <w:r>
+        <w:rPr>
+          <w:rFonts w:ascii="GHEA Grapalat" w:hAnsi="GHEA Grapalat"/>
+          <w:lang w:val="hy-AM"/>
+        </w:rPr>
+        <w:t>Դեյքստրայի</w:t>
+      </w:r>
+      <w:r>
+        <w:rPr>
+          <w:rFonts w:ascii="GHEA Grapalat" w:hAnsi="GHEA Grapalat"/>
+          <w:lang w:val="hy-AM"/>
+        </w:rPr>
+        <w:t xml:space="preserve"> ալգորիթմը իրականացվում է իտերատիվ կերպով</w:t>
+      </w:r>
+      <w:r>
+        <w:rPr>
+          <w:rFonts w:ascii="GHEA Grapalat" w:hAnsi="GHEA Grapalat"/>
+          <w:lang w:val="hy-AM"/>
+        </w:rPr>
+        <w:t>՝</w:t>
+      </w:r>
+      <w:r>
+        <w:rPr>
+          <w:rFonts w:ascii="GHEA Grapalat" w:hAnsi="GHEA Grapalat"/>
+          <w:lang w:val="hy-AM"/>
+        </w:rPr>
+        <w:t xml:space="preserve"> ընտրելով չհետազոտված գագաթը, որն ունի նվազագույն նախնական հեռավորություն (հաճախ նշանակվում է g(v)) աղբյուրից, և կատարում է կից կողերի ռելակսացիա։ Ալգորիթմը պահպանում է հեռավորության պիտակ յուրաքանչյուր գագաթի համար և ավարտվում է, երբ </w:t>
+      </w:r>
+      <w:r>
+        <w:rPr>
+          <w:rFonts w:ascii="GHEA Grapalat" w:hAnsi="GHEA Grapalat"/>
+          <w:lang w:val="hy-AM"/>
+        </w:rPr>
+        <w:t>«վերջնակետ»</w:t>
+      </w:r>
+      <w:r>
+        <w:rPr>
+          <w:rFonts w:ascii="GHEA Grapalat" w:hAnsi="GHEA Grapalat"/>
+          <w:lang w:val="hy-AM"/>
+        </w:rPr>
+        <w:t xml:space="preserve"> գագաթը դուրս է բերվում պրիորիտետային հերթից։</w:t>
+      </w:r>
+      <w:r>
+        <w:rPr>
+          <w:rFonts w:ascii="GHEA Grapalat" w:hAnsi="GHEA Grapalat"/>
+          <w:lang w:val="hy-AM"/>
+        </w:rPr>
+        <w:br/>
+      </w:r>
+      <w:r>
+        <w:rPr>
+          <w:rFonts w:ascii="GHEA Grapalat" w:hAnsi="GHEA Grapalat"/>
+          <w:lang w:val="hy-AM"/>
+        </w:rPr>
+        <w:br/>
+      </w:r>
+      <w:r>
+        <w:rPr>
+          <w:rFonts w:ascii="GHEA Grapalat" w:hAnsi="GHEA Grapalat"/>
+          <w:lang w:val="hy-AM"/>
+        </w:rPr>
+        <w:t xml:space="preserve"> </w:t>
+      </w:r>
+      <w:r>
+        <w:rPr>
+          <w:rFonts w:ascii="GHEA Grapalat" w:hAnsi="GHEA Grapalat"/>
+          <w:lang w:val="hy-AM"/>
+        </w:rPr>
+        <w:t>Ա</w:t>
+      </w:r>
+      <w:r>
+        <w:rPr>
+          <w:rFonts w:ascii="GHEA Grapalat" w:hAnsi="GHEA Grapalat"/>
+          <w:lang w:val="hy-AM"/>
+        </w:rPr>
+        <w:t>*-ն լրացնում է այս սխեման՝ ներառելով էվրիստիկ ֆունկցիա h(v), դրանով իսկ սահմանելով f(v) = g(v) + h(v) պրիորիտետային արժեքը յուրաքանչյուր հանգույցի համար։ Էվրիստիկան ուղղորդում է որոնումը դեպի նպատակային ուղղված տարածքներ, կրճատելով որոնման տարածությունը, որը պետք է քննարկվի մինչև օպտիմալության երաշխավորումը։</w:t>
+      </w:r>
+    </w:p>
+    <w:p>
+      <w:pPr>
+        <w:pStyle w:val="NormalWeb"/>
+        <w:rPr>
+          <w:rFonts w:ascii="GHEA Grapalat" w:hAnsi="GHEA Grapalat"/>
+          <w:lang w:val="hy-AM"/>
+        </w:rPr>
+      </w:pPr>
+      <w:r>
+        <w:rPr>
+          <w:rFonts w:ascii="GHEA Grapalat" w:hAnsi="GHEA Grapalat"/>
+          <w:lang w:val="hy-AM"/>
+        </w:rPr>
+        <w:t xml:space="preserve">Ֆորմալ առումով </w:t>
+      </w:r>
+      <w:r>
+        <w:rPr>
+          <w:rFonts w:ascii="GHEA Grapalat" w:hAnsi="GHEA Grapalat"/>
+          <w:lang w:val="hy-AM"/>
+        </w:rPr>
+        <w:t>Դեյքստրայի</w:t>
+      </w:r>
+      <w:r>
+        <w:rPr>
+          <w:rFonts w:ascii="GHEA Grapalat" w:hAnsi="GHEA Grapalat"/>
+          <w:lang w:val="hy-AM"/>
+        </w:rPr>
+        <w:t xml:space="preserve"> ալգորիթմը կարելի է դիտարկել որպես ռելակսացիայի վրա հիմնված մեթոդ, ըստ որի՝ հերթից հեռացված ցանկացած գագաթի հեռավորությունը վերջնական է։ </w:t>
+      </w:r>
+      <w:r>
+        <w:rPr>
+          <w:rFonts w:ascii="GHEA Grapalat" w:hAnsi="GHEA Grapalat"/>
+          <w:lang w:val="hy-AM"/>
+        </w:rPr>
+        <w:t>Ա</w:t>
+      </w:r>
+      <w:r>
+        <w:rPr>
+          <w:rFonts w:ascii="GHEA Grapalat" w:hAnsi="GHEA Grapalat"/>
+          <w:lang w:val="hy-AM"/>
+        </w:rPr>
+        <w:t xml:space="preserve">*-ն ժառանգում է ռելակսացիայի գործընթացը, բայց ավելացնում է այն պայմանը, որ օպտիմալությունը երաշխավորվում է միայն այն դեպքում, եթե h էվրիստիկան թույլատրելի է (երբեք չի գերագնահատում իրական ծախսը դեպի նպատակը) և համաձայնեցված </w:t>
+      </w:r>
+      <w:r>
+        <w:rPr>
+          <w:rFonts w:ascii="GHEA Grapalat" w:hAnsi="GHEA Grapalat"/>
+          <w:lang w:val="hy-AM"/>
+        </w:rPr>
+        <w:t xml:space="preserve"> է </w:t>
+      </w:r>
+      <w:r>
+        <w:rPr>
+          <w:rFonts w:ascii="GHEA Grapalat" w:hAnsi="GHEA Grapalat"/>
+          <w:lang w:val="hy-AM"/>
+        </w:rPr>
+        <w:t>(բավարարում է եռանկյունու անհավասարությանը)։ Այս տեսական տարբերությունը ուղղակիորեն ազդում է ալգորիթմների լրիվության և օպտիմալության երաշխիքների վրա։</w:t>
+      </w:r>
+    </w:p>
+    <w:p>
+      <w:pPr>
+        <w:pStyle w:val="NormalWeb"/>
+        <w:rPr>
+          <w:rFonts w:ascii="GHEA Grapalat" w:hAnsi="GHEA Grapalat"/>
+          <w:lang w:val="hy-AM"/>
+        </w:rPr>
+      </w:pPr>
+    </w:p>
+    <w:p>
+      <w:pPr>
+        <w:pStyle w:val="Heading2"/>
+        <w:rPr>
+          <w:b/>
+          <w:color w:val="auto"/>
+          <w:lang w:val="hy-AM"/>
+        </w:rPr>
+      </w:pPr>
+      <w:r>
+        <w:rPr>
+          <w:b/>
+          <w:color w:val="auto"/>
+          <w:lang w:val="hy-AM"/>
+        </w:rPr>
+        <w:lastRenderedPageBreak/>
+        <w:t>2</w:t>
+      </w:r>
+      <w:r>
+        <w:rPr>
+          <w:rFonts w:ascii="Cambria Math" w:hAnsi="Cambria Math"/>
+          <w:b/>
+          <w:color w:val="auto"/>
+          <w:lang w:val="hy-AM"/>
+        </w:rPr>
+        <w:t>․2․2</w:t>
+      </w:r>
+      <w:r>
+        <w:rPr>
+          <w:rFonts w:ascii="Cambria Math" w:hAnsi="Cambria Math"/>
+          <w:b/>
+          <w:color w:val="auto"/>
+          <w:lang w:val="hy-AM"/>
+        </w:rPr>
+        <w:t xml:space="preserve"> </w:t>
+      </w:r>
+      <w:r>
+        <w:rPr>
+          <w:rFonts w:eastAsia="Times New Roman"/>
+          <w:b/>
+          <w:color w:val="auto"/>
+          <w:lang w:val="hy-AM"/>
+        </w:rPr>
+        <w:t xml:space="preserve">Որոնման ռազմավարություններ </w:t>
+      </w:r>
+    </w:p>
+    <w:p>
+      <w:pPr>
+        <w:pStyle w:val="NormalWeb"/>
+        <w:rPr>
+          <w:rFonts w:ascii="GHEA Grapalat" w:hAnsi="GHEA Grapalat"/>
+          <w:lang w:val="hy-AM"/>
+        </w:rPr>
+      </w:pPr>
+    </w:p>
+    <w:p>
+      <w:pPr>
+        <w:pStyle w:val="NormalWeb"/>
+        <w:rPr>
+          <w:rFonts w:ascii="GHEA Grapalat" w:hAnsi="GHEA Grapalat"/>
+          <w:lang w:val="hy-AM"/>
+        </w:rPr>
+      </w:pPr>
+      <w:r>
+        <w:rPr>
+          <w:rFonts w:ascii="GHEA Grapalat" w:hAnsi="GHEA Grapalat"/>
+          <w:lang w:val="hy-AM"/>
+        </w:rPr>
+        <w:t xml:space="preserve">Կառավարման տեսության տեսանկյունից </w:t>
+      </w:r>
+      <w:r>
+        <w:rPr>
+          <w:rFonts w:ascii="GHEA Grapalat" w:hAnsi="GHEA Grapalat"/>
+          <w:lang w:val="hy-AM"/>
+        </w:rPr>
+        <w:t>Դեյքստրան</w:t>
+      </w:r>
+      <w:r>
+        <w:rPr>
+          <w:rFonts w:ascii="GHEA Grapalat" w:hAnsi="GHEA Grapalat"/>
+          <w:lang w:val="hy-AM"/>
+        </w:rPr>
+        <w:t xml:space="preserve"> գործում է</w:t>
+      </w:r>
+      <w:r>
+        <w:rPr>
+          <w:rFonts w:ascii="GHEA Grapalat" w:hAnsi="GHEA Grapalat"/>
+          <w:lang w:val="hy-AM"/>
+        </w:rPr>
+        <w:t xml:space="preserve"> հետևյալ կերպ</w:t>
+      </w:r>
+      <w:r>
+        <w:rPr>
+          <w:rFonts w:ascii="GHEA Grapalat" w:hAnsi="GHEA Grapalat"/>
+          <w:lang w:val="hy-AM"/>
+        </w:rPr>
+        <w:t xml:space="preserve">. յուրաքանչյուր քայլ ընդլայնում է այն հանգույցը, որն ունի ամենափոքր կուտակված ճշգրիտ ծախսը դեպի աղբյուր։ Ալգորիթմի կառավարման քաղաքականությունը չի կոդավորում որևէ </w:t>
+      </w:r>
+      <w:r>
+        <w:rPr>
+          <w:rFonts w:ascii="GHEA Grapalat" w:hAnsi="GHEA Grapalat"/>
+          <w:lang w:val="hy-AM"/>
+        </w:rPr>
+        <w:t>ինֆորմացիա</w:t>
+      </w:r>
+      <w:r>
+        <w:rPr>
+          <w:rFonts w:ascii="GHEA Grapalat" w:hAnsi="GHEA Grapalat"/>
+          <w:lang w:val="hy-AM"/>
+        </w:rPr>
+        <w:t xml:space="preserve"> նպատակային հեռավորությունների բաշխման մասին՝ բացի ընթացիկ հեռավորության պիտակից։ Ի հակադրություն, </w:t>
+      </w:r>
+      <w:r>
+        <w:rPr>
+          <w:rFonts w:ascii="GHEA Grapalat" w:hAnsi="GHEA Grapalat"/>
+          <w:lang w:val="hy-AM"/>
+        </w:rPr>
+        <w:t>Ա</w:t>
+      </w:r>
+      <w:r>
+        <w:rPr>
+          <w:rFonts w:ascii="GHEA Grapalat" w:hAnsi="GHEA Grapalat"/>
+          <w:lang w:val="hy-AM"/>
+        </w:rPr>
+        <w:t xml:space="preserve">*-ն իրականացնում է ինֆորմացված ծախսերի քաղաքականություն, որտեղ պրիորիտետային հերթի </w:t>
+      </w:r>
+      <w:r>
+        <w:rPr>
+          <w:rFonts w:ascii="GHEA Grapalat" w:hAnsi="GHEA Grapalat"/>
+          <w:lang w:val="hy-AM"/>
+        </w:rPr>
+        <w:t>գործող էլեմենտը</w:t>
+      </w:r>
+      <w:r>
+        <w:rPr>
+          <w:rFonts w:ascii="GHEA Grapalat" w:hAnsi="GHEA Grapalat"/>
+          <w:lang w:val="hy-AM"/>
+        </w:rPr>
+        <w:t xml:space="preserve"> ներառում է մնացորդային ծախսի գնահատական։ Այս քաղաքականությունը կարելի է մեկնաբանել որպես երկու ծախսային բաղադրիչների կշռված գումար՝ ճշգրիտ կուտակային ծախս g և օպտիմիստական գնահատական h։ Հետևաբար, </w:t>
+      </w:r>
+      <w:r>
+        <w:rPr>
+          <w:rFonts w:ascii="GHEA Grapalat" w:hAnsi="GHEA Grapalat"/>
+          <w:lang w:val="hy-AM"/>
+        </w:rPr>
+        <w:t>Ա</w:t>
+      </w:r>
+      <w:r>
+        <w:rPr>
+          <w:rFonts w:ascii="GHEA Grapalat" w:hAnsi="GHEA Grapalat"/>
+          <w:lang w:val="hy-AM"/>
+        </w:rPr>
+        <w:t>*-ում ընդլայնման կարգը կողմնակալ է դեպի այն հանգույցները, որոնք և՛ էժան են հասնելու համար, և՛ թվում են, թե մոտ են նպատակին։</w:t>
+      </w:r>
+    </w:p>
+    <w:p>
+      <w:pPr>
+        <w:pStyle w:val="NormalWeb"/>
+        <w:rPr>
+          <w:rFonts w:ascii="GHEA Grapalat" w:hAnsi="GHEA Grapalat"/>
+          <w:lang w:val="hy-AM"/>
+        </w:rPr>
+      </w:pPr>
+    </w:p>
+    <w:p>
+      <w:pPr>
+        <w:pStyle w:val="Heading2"/>
+        <w:rPr>
+          <w:rFonts w:ascii="Arial" w:eastAsia="Times New Roman" w:hAnsi="Arial"/>
+          <w:b/>
+          <w:color w:val="auto"/>
+          <w:lang w:val="hy-AM"/>
+        </w:rPr>
+      </w:pPr>
+      <w:r>
+        <w:rPr>
+          <w:rFonts w:eastAsia="Times New Roman"/>
+          <w:b/>
+          <w:color w:val="auto"/>
+          <w:lang w:val="hy-AM"/>
+        </w:rPr>
+        <w:t>2.</w:t>
+      </w:r>
+      <w:r>
+        <w:rPr>
+          <w:b/>
+          <w:color w:val="auto"/>
+          <w:lang w:val="hy-AM"/>
+        </w:rPr>
+        <w:t>2</w:t>
+      </w:r>
+      <w:r>
+        <w:rPr>
+          <w:rFonts w:ascii="Cambria Math" w:hAnsi="Cambria Math"/>
+          <w:b/>
+          <w:color w:val="auto"/>
+          <w:lang w:val="hy-AM"/>
+        </w:rPr>
+        <w:t>․3</w:t>
+      </w:r>
+      <w:r>
+        <w:rPr>
+          <w:rFonts w:eastAsia="Times New Roman"/>
+          <w:b/>
+          <w:color w:val="auto"/>
+          <w:lang w:val="hy-AM"/>
+        </w:rPr>
+        <w:t xml:space="preserve"> Էվրիստիկաների դերը </w:t>
+      </w:r>
+    </w:p>
+    <w:p>
+      <w:pPr>
+        <w:rPr>
+          <w:rFonts w:ascii="Arial" w:hAnsi="Arial"/>
+          <w:lang w:val="hy-AM"/>
+        </w:rPr>
+      </w:pPr>
+    </w:p>
+    <w:p>
+      <w:pPr>
+        <w:pStyle w:val="NormalWeb"/>
+        <w:rPr>
+          <w:rFonts w:ascii="GHEA Grapalat" w:hAnsi="GHEA Grapalat"/>
+          <w:lang w:val="hy-AM"/>
+        </w:rPr>
+      </w:pPr>
+      <w:r>
+        <w:rPr>
+          <w:rFonts w:ascii="GHEA Grapalat" w:hAnsi="GHEA Grapalat"/>
+          <w:lang w:val="hy-AM"/>
+        </w:rPr>
+        <w:t>Ա</w:t>
+      </w:r>
+      <w:r>
+        <w:rPr>
+          <w:rFonts w:ascii="GHEA Grapalat" w:hAnsi="GHEA Grapalat"/>
+          <w:lang w:val="hy-AM"/>
+        </w:rPr>
+        <w:t>*-ի h էվրիստիկ ֆունկցիան սպասարկում է երեք փոխկապակցված նպատակների.</w:t>
+      </w:r>
+      <w:r>
+        <w:rPr>
+          <w:rFonts w:ascii="GHEA Grapalat" w:hAnsi="GHEA Grapalat"/>
+          <w:lang w:val="hy-AM"/>
+        </w:rPr>
+        <w:t xml:space="preserve"> </w:t>
+      </w:r>
+      <w:r>
+        <w:rPr>
+          <w:rFonts w:ascii="GHEA Grapalat" w:hAnsi="GHEA Grapalat"/>
+          <w:lang w:val="hy-AM"/>
+        </w:rPr>
+        <w:t xml:space="preserve">այն կրճատում է այն հանգույցները, որոնք ապացուցելիորեն ենթաօպտիմալ են ընթացիկ լավագույն լուծման նկատմամբ, այն ձևավորում է որոնման ճակատը՝ </w:t>
+      </w:r>
+      <w:r>
+        <w:rPr>
+          <w:rFonts w:ascii="GHEA Grapalat" w:hAnsi="GHEA Grapalat"/>
+          <w:lang w:val="hy-AM"/>
+        </w:rPr>
+        <w:t>ն</w:t>
+      </w:r>
+      <w:r>
+        <w:rPr>
+          <w:rFonts w:ascii="GHEA Grapalat" w:hAnsi="GHEA Grapalat"/>
+          <w:lang w:val="hy-AM"/>
+        </w:rPr>
+        <w:t>ախապատվությունը տալով խոստումնալից տարածաշրջանների հետախուզմանը, և այն հաստատում է տեսական հիմքը օպտիմալության համար, երբ բավարարված են թույլատրելիությունը և համաձայնեցվածությունը։</w:t>
+      </w:r>
+      <w:r>
+        <w:rPr>
+          <w:rFonts w:ascii="GHEA Grapalat" w:hAnsi="GHEA Grapalat"/>
+          <w:lang w:val="hy-AM"/>
+        </w:rPr>
+        <w:t>Դիցուք</w:t>
+      </w:r>
+      <w:r>
+        <w:rPr>
+          <w:rFonts w:ascii="GHEA Grapalat" w:hAnsi="GHEA Grapalat"/>
+          <w:lang w:val="hy-AM"/>
+        </w:rPr>
+        <w:t xml:space="preserve"> c(v)-</w:t>
+      </w:r>
+      <w:r>
+        <w:rPr>
+          <w:rFonts w:ascii="GHEA Grapalat" w:hAnsi="GHEA Grapalat"/>
+          <w:lang w:val="hy-AM"/>
+        </w:rPr>
+        <w:t>ով նշանակենք</w:t>
+      </w:r>
+      <w:r>
+        <w:rPr>
+          <w:rFonts w:ascii="GHEA Grapalat" w:hAnsi="GHEA Grapalat"/>
+          <w:lang w:val="hy-AM"/>
+        </w:rPr>
+        <w:t xml:space="preserve"> իրական կարճագույն ճանապարհի ծախսը v</w:t>
+      </w:r>
+      <w:r>
+        <w:rPr>
+          <w:rFonts w:ascii="GHEA Grapalat" w:hAnsi="GHEA Grapalat"/>
+          <w:lang w:val="hy-AM"/>
+        </w:rPr>
+        <w:t xml:space="preserve"> սկզբնական գագաթից </w:t>
+      </w:r>
+      <w:r>
+        <w:rPr>
+          <w:rFonts w:ascii="GHEA Grapalat" w:hAnsi="GHEA Grapalat"/>
+          <w:lang w:val="hy-AM"/>
+        </w:rPr>
+        <w:t xml:space="preserve">դեպի նպատակ։ Թույլատրելի էվրիստիկան պետք է ենթարկվի h(v) ≤ c(v) </w:t>
+      </w:r>
+      <w:r>
+        <w:rPr>
+          <w:rFonts w:ascii="Cambria Math" w:hAnsi="Cambria Math" w:cs="Cambria Math"/>
+          <w:lang w:val="hy-AM"/>
+        </w:rPr>
+        <w:t>∀</w:t>
+      </w:r>
+      <w:r>
+        <w:rPr>
+          <w:rFonts w:ascii="GHEA Grapalat" w:hAnsi="GHEA Grapalat"/>
+          <w:lang w:val="hy-AM"/>
+        </w:rPr>
+        <w:t xml:space="preserve"> v </w:t>
+      </w:r>
+      <w:r>
+        <w:rPr>
+          <w:rFonts w:ascii="Cambria Math" w:hAnsi="Cambria Math" w:cs="Cambria Math"/>
+          <w:lang w:val="hy-AM"/>
+        </w:rPr>
+        <w:t>∈</w:t>
+      </w:r>
+      <w:r>
+        <w:rPr>
+          <w:rFonts w:ascii="GHEA Grapalat" w:hAnsi="GHEA Grapalat"/>
+          <w:lang w:val="hy-AM"/>
+        </w:rPr>
+        <w:t xml:space="preserve"> V պայմանին։ Համաձայնեցվածությունը պարտադրում է լրացուցիչ սահմանափակում h(u) ≤ h(v) + cost(u,v) </w:t>
+      </w:r>
+      <w:r>
+        <w:rPr>
+          <w:rFonts w:ascii="Cambria Math" w:hAnsi="Cambria Math" w:cs="Cambria Math"/>
+          <w:lang w:val="hy-AM"/>
+        </w:rPr>
+        <w:t>∀</w:t>
+      </w:r>
+      <w:r>
+        <w:rPr>
+          <w:rFonts w:ascii="GHEA Grapalat" w:hAnsi="GHEA Grapalat"/>
+          <w:lang w:val="hy-AM"/>
+        </w:rPr>
+        <w:t xml:space="preserve"> (u,v) </w:t>
+      </w:r>
+      <w:r>
+        <w:rPr>
+          <w:rFonts w:ascii="Cambria Math" w:hAnsi="Cambria Math" w:cs="Cambria Math"/>
+          <w:lang w:val="hy-AM"/>
+        </w:rPr>
+        <w:t>∈</w:t>
+      </w:r>
+      <w:r>
+        <w:rPr>
+          <w:rFonts w:ascii="GHEA Grapalat" w:hAnsi="GHEA Grapalat"/>
+          <w:lang w:val="hy-AM"/>
+        </w:rPr>
+        <w:t xml:space="preserve"> E, ինչը երաշխավորում է, որ պրիորիտետային հերթից դուրս բերված ցանկացած հանգույց ունի վերջնական g արժեք, որը հավասար է իրական կարճագույն հեռավորությանը։</w:t>
+      </w:r>
+    </w:p>
+    <w:p>
+      <w:pPr>
+        <w:pStyle w:val="NormalWeb"/>
+        <w:rPr>
+          <w:rFonts w:ascii="GHEA Grapalat" w:hAnsi="GHEA Grapalat"/>
+          <w:lang w:val="hy-AM"/>
+        </w:rPr>
+      </w:pPr>
+      <w:r>
+        <w:rPr>
+          <w:rFonts w:ascii="GHEA Grapalat" w:hAnsi="GHEA Grapalat"/>
+          <w:lang w:val="hy-AM"/>
+        </w:rPr>
+        <w:t xml:space="preserve">h-ի ազդեցությունը տարածվում է հանգույցների դասավորությունից դուրս՝ ընդգրկելով ընդհանուր ընդլայնման գործակիցը։ Էմպիրիկորեն, h(v)/c(v) </w:t>
+      </w:r>
+      <w:r>
+        <w:rPr>
+          <w:rFonts w:ascii="GHEA Grapalat" w:hAnsi="GHEA Grapalat"/>
+          <w:lang w:val="hy-AM"/>
+        </w:rPr>
+        <w:t>հարաբերությունը</w:t>
+      </w:r>
+      <w:r>
+        <w:rPr>
+          <w:rFonts w:ascii="GHEA Grapalat" w:hAnsi="GHEA Grapalat"/>
+          <w:lang w:val="hy-AM"/>
+        </w:rPr>
+        <w:t xml:space="preserve"> հաճախ անվանվում է էվրիստիկ ճշգրտություն։ Երբ այս </w:t>
+      </w:r>
+      <w:r>
+        <w:rPr>
+          <w:rFonts w:ascii="GHEA Grapalat" w:hAnsi="GHEA Grapalat"/>
+          <w:lang w:val="hy-AM"/>
+        </w:rPr>
+        <w:t>հարաբերությունը</w:t>
+      </w:r>
+      <w:r>
+        <w:rPr>
+          <w:rFonts w:ascii="GHEA Grapalat" w:hAnsi="GHEA Grapalat"/>
+          <w:lang w:val="hy-AM"/>
+        </w:rPr>
+        <w:t xml:space="preserve"> ձգտում է </w:t>
+      </w:r>
+      <w:r>
+        <w:rPr>
+          <w:rFonts w:ascii="GHEA Grapalat" w:hAnsi="GHEA Grapalat"/>
+          <w:lang w:val="hy-AM"/>
+        </w:rPr>
+        <w:t>մեկի</w:t>
+      </w:r>
+      <w:r>
+        <w:rPr>
+          <w:rFonts w:ascii="GHEA Grapalat" w:hAnsi="GHEA Grapalat"/>
+          <w:lang w:val="hy-AM"/>
+        </w:rPr>
+        <w:t>, հետազոտված հանգույցների թիվը կտրուկ նվազում է</w:t>
+      </w:r>
+      <w:r>
+        <w:rPr>
+          <w:rFonts w:ascii="GHEA Grapalat" w:hAnsi="GHEA Grapalat"/>
+          <w:lang w:val="hy-AM"/>
+        </w:rPr>
+        <w:t>, իսկ հակառակ դեպքու</w:t>
+      </w:r>
+      <w:r>
+        <w:rPr>
+          <w:rFonts w:ascii="Cambria Math" w:hAnsi="Cambria Math"/>
+          <w:lang w:val="hy-AM"/>
+        </w:rPr>
+        <w:t>․</w:t>
+      </w:r>
+      <w:r>
+        <w:rPr>
+          <w:rFonts w:ascii="GHEA Grapalat" w:hAnsi="GHEA Grapalat"/>
+          <w:lang w:val="hy-AM"/>
+        </w:rPr>
+        <w:t xml:space="preserve"> վատ ինֆորմացված էվրիստիկան մոտենում է </w:t>
+      </w:r>
+      <w:r>
+        <w:rPr>
+          <w:rFonts w:ascii="GHEA Grapalat" w:hAnsi="GHEA Grapalat"/>
+          <w:lang w:val="hy-AM"/>
+        </w:rPr>
+        <w:t>Դեյքստրայի</w:t>
+      </w:r>
+      <w:r>
+        <w:rPr>
+          <w:rFonts w:ascii="GHEA Grapalat" w:hAnsi="GHEA Grapalat"/>
+          <w:lang w:val="hy-AM"/>
+        </w:rPr>
+        <w:t xml:space="preserve"> հաշվողական վարքագծին։</w:t>
+      </w:r>
+      <w:r>
+        <w:rPr>
+          <w:rFonts w:ascii="GHEA Grapalat" w:hAnsi="GHEA Grapalat"/>
+          <w:lang w:val="hy-AM"/>
+        </w:rPr>
+        <w:br/>
+      </w:r>
+    </w:p>
+    <w:p>
+      <w:pPr>
+        <w:pStyle w:val="NormalWeb"/>
+        <w:rPr>
+          <w:rFonts w:ascii="GHEA Grapalat" w:hAnsi="GHEA Grapalat"/>
+          <w:lang w:val="hy-AM"/>
+        </w:rPr>
+      </w:pPr>
+    </w:p>
+    <w:p>
+      <w:pPr>
+        <w:pStyle w:val="Heading2"/>
+        <w:rPr>
+          <w:b/>
+          <w:color w:val="auto"/>
+          <w:lang w:val="hy-AM"/>
+        </w:rPr>
+      </w:pPr>
+      <w:r>
+        <w:rPr>
+          <w:rFonts w:eastAsia="Times New Roman"/>
+          <w:b/>
+          <w:color w:val="auto"/>
+          <w:lang w:val="hy-AM"/>
+        </w:rPr>
+        <w:lastRenderedPageBreak/>
+        <w:t>2.</w:t>
+      </w:r>
+      <w:r>
+        <w:rPr>
+          <w:b/>
+          <w:color w:val="auto"/>
+          <w:lang w:val="hy-AM"/>
+        </w:rPr>
+        <w:t>2</w:t>
+      </w:r>
+      <w:r>
+        <w:rPr>
+          <w:rFonts w:ascii="Cambria Math" w:hAnsi="Cambria Math"/>
+          <w:b/>
+          <w:color w:val="auto"/>
+          <w:lang w:val="hy-AM"/>
+        </w:rPr>
+        <w:t>․</w:t>
+      </w:r>
+      <w:r>
+        <w:rPr>
+          <w:rFonts w:eastAsia="Times New Roman"/>
+          <w:b/>
+          <w:color w:val="auto"/>
+          <w:lang w:val="hy-AM"/>
+        </w:rPr>
+        <w:t>4 Լրիվության և օպտիմալության պայմաններ</w:t>
+      </w:r>
+    </w:p>
+    <w:p>
+      <w:pPr>
+        <w:pStyle w:val="NormalWeb"/>
+        <w:rPr>
+          <w:rFonts w:ascii="GHEA Grapalat" w:hAnsi="GHEA Grapalat"/>
+          <w:lang w:val="hy-AM"/>
+        </w:rPr>
+      </w:pPr>
+    </w:p>
+    <w:p>
+      <w:pPr>
+        <w:pStyle w:val="NormalWeb"/>
+        <w:rPr>
+          <w:rFonts w:ascii="GHEA Grapalat" w:hAnsi="GHEA Grapalat"/>
+          <w:lang w:val="hy-AM"/>
+        </w:rPr>
+      </w:pPr>
+      <w:r>
+        <w:rPr>
+          <w:rFonts w:ascii="GHEA Grapalat" w:hAnsi="GHEA Grapalat"/>
+          <w:lang w:val="hy-AM"/>
+        </w:rPr>
+        <w:t>Երկու ալգորիթմներն էլ լրիվ են դետերմինիստական, վերջավոր վիճակի</w:t>
+      </w:r>
+      <w:r>
+        <w:rPr>
+          <w:rFonts w:ascii="GHEA Grapalat" w:hAnsi="GHEA Grapalat"/>
+          <w:lang w:val="hy-AM"/>
+        </w:rPr>
+        <w:t xml:space="preserve"> </w:t>
+      </w:r>
+      <w:r>
+        <w:rPr>
+          <w:rFonts w:ascii="GHEA Grapalat" w:hAnsi="GHEA Grapalat"/>
+          <w:lang w:val="hy-AM"/>
+        </w:rPr>
+        <w:t xml:space="preserve">տարածություններում պայմանով, որ գրաֆը կապակցված է և որոնումը </w:t>
+      </w:r>
+      <w:r>
+        <w:rPr>
+          <w:rFonts w:ascii="GHEA Grapalat" w:hAnsi="GHEA Grapalat"/>
+          <w:lang w:val="hy-AM"/>
+        </w:rPr>
+        <w:t>դիտարկում</w:t>
+      </w:r>
+      <w:r>
+        <w:rPr>
+          <w:rFonts w:ascii="GHEA Grapalat" w:hAnsi="GHEA Grapalat"/>
+          <w:lang w:val="hy-AM"/>
+        </w:rPr>
+        <w:t xml:space="preserve"> է բոլոր հասանելի գագաթներ</w:t>
+      </w:r>
+      <w:r>
+        <w:rPr>
+          <w:rFonts w:ascii="GHEA Grapalat" w:hAnsi="GHEA Grapalat"/>
+          <w:lang w:val="hy-AM"/>
+        </w:rPr>
+        <w:t>ը։Նրանք</w:t>
+      </w:r>
+      <w:r>
+        <w:rPr>
+          <w:rFonts w:ascii="GHEA Grapalat" w:hAnsi="GHEA Grapalat"/>
+          <w:lang w:val="hy-AM"/>
+        </w:rPr>
+        <w:t xml:space="preserve"> երաշխավորված ավարտվում </w:t>
+      </w:r>
+      <w:r>
+        <w:rPr>
+          <w:rFonts w:ascii="GHEA Grapalat" w:hAnsi="GHEA Grapalat"/>
+          <w:lang w:val="hy-AM"/>
+        </w:rPr>
+        <w:t>են</w:t>
+      </w:r>
+      <w:r>
+        <w:rPr>
+          <w:rFonts w:ascii="GHEA Grapalat" w:hAnsi="GHEA Grapalat"/>
+          <w:lang w:val="hy-AM"/>
+        </w:rPr>
+        <w:t xml:space="preserve"> լուծումով, եթե այն գոյություն ունի։ Ստոխաստիկ կամ անվերջ վիճակի միջավայրերում լրիվությունը կարող է խախտվել ցիկլերի կամ չսահմանափակված ճյուղավորման գործակիցների պատճառով։</w:t>
+      </w:r>
+    </w:p>
+    <w:p>
+      <w:pPr>
+        <w:pStyle w:val="NormalWeb"/>
+        <w:rPr>
+          <w:rFonts w:ascii="GHEA Grapalat" w:hAnsi="GHEA Grapalat"/>
+          <w:lang w:val="hy-AM"/>
+        </w:rPr>
+      </w:pPr>
+      <w:r>
+        <w:rPr>
+          <w:rFonts w:ascii="GHEA Grapalat" w:hAnsi="GHEA Grapalat"/>
+          <w:lang w:val="hy-AM"/>
+        </w:rPr>
+        <w:t xml:space="preserve">Օպտիմալության պայմանները տարբերվում են։ </w:t>
+      </w:r>
+      <w:r>
+        <w:rPr>
+          <w:rFonts w:ascii="GHEA Grapalat" w:hAnsi="GHEA Grapalat"/>
+          <w:lang w:val="hy-AM"/>
+        </w:rPr>
+        <w:t>Դեյքստրայ</w:t>
+      </w:r>
+      <w:r>
+        <w:rPr>
+          <w:rFonts w:ascii="GHEA Grapalat" w:hAnsi="GHEA Grapalat"/>
+          <w:lang w:val="hy-AM"/>
+        </w:rPr>
+        <w:t>ի օպտիմալությունը ուղղակիորեն բխում է ճշգրիտ հեռավորության պիտակների</w:t>
+      </w:r>
+      <w:r>
+        <w:rPr>
+          <w:rFonts w:ascii="GHEA Grapalat" w:hAnsi="GHEA Grapalat"/>
+          <w:lang w:val="hy-AM"/>
+        </w:rPr>
+        <w:t>՝</w:t>
+      </w:r>
+      <w:r>
+        <w:rPr>
+          <w:rFonts w:ascii="GHEA Grapalat" w:hAnsi="GHEA Grapalat"/>
+          <w:lang w:val="hy-AM"/>
+        </w:rPr>
+        <w:t xml:space="preserve"> ալգորիթմը երբեք չի ռելակսացնում հանգույցը նախնական ծախս</w:t>
+      </w:r>
+      <w:bookmarkStart w:id="11" w:name="_GoBack"/>
+      <w:bookmarkEnd w:id="11"/>
+      <w:r>
+        <w:rPr>
+          <w:rFonts w:ascii="GHEA Grapalat" w:hAnsi="GHEA Grapalat"/>
+          <w:lang w:val="hy-AM"/>
+        </w:rPr>
+        <w:t xml:space="preserve">ով, որը գերազանցում է վերջնական օպտիմումը։ </w:t>
+      </w:r>
+      <w:r>
+        <w:rPr>
+          <w:rFonts w:ascii="GHEA Grapalat" w:hAnsi="GHEA Grapalat"/>
+          <w:lang w:val="hy-AM"/>
+        </w:rPr>
+        <w:t>Ա</w:t>
+      </w:r>
+      <w:r>
+        <w:rPr>
+          <w:rFonts w:ascii="GHEA Grapalat" w:hAnsi="GHEA Grapalat"/>
+          <w:lang w:val="hy-AM"/>
+        </w:rPr>
+        <w:t xml:space="preserve">*-ի օպտիմալությունը հիմնված է թույլատրելիության և համաձայնեցվածության համադրության վրա։ Այս պայմաններում ալգորիթմը հանգույցները հեռացնում է պրիորիտետային հերթից՝ իրական ճանապարհի ծախսի չնվազող կարգով, երաշխավորելով, որ հայտնաբերված առաջին լուծումը օպտիմալ է։ Եթե h-ը թույլատրելի չէ, </w:t>
+      </w:r>
+      <w:r>
+        <w:rPr>
+          <w:rFonts w:ascii="GHEA Grapalat" w:hAnsi="GHEA Grapalat"/>
+          <w:lang w:val="hy-AM"/>
+        </w:rPr>
+        <w:t>Ա</w:t>
+      </w:r>
+      <w:r>
+        <w:rPr>
+          <w:rFonts w:ascii="GHEA Grapalat" w:hAnsi="GHEA Grapalat"/>
+          <w:lang w:val="hy-AM"/>
+        </w:rPr>
+        <w:t>*-ն կարող է վերադարձնել ենթաօպտիմալ ճանապարհ. եթե h-ը անհամաձայնեցված է, ալգորիթմը կարող է դեռևս լինել թույլատրելի, բայց կարող է ընդլայնել հանգույցները խիստ մոնոտոն կարգից դուրս։</w:t>
+      </w:r>
+    </w:p>
+    <w:p>
+      <w:pPr>
+        <w:pStyle w:val="NormalWeb"/>
+        <w:rPr>
+          <w:rFonts w:ascii="GHEA Grapalat" w:hAnsi="GHEA Grapalat"/>
+          <w:lang w:val="hy-AM"/>
+        </w:rPr>
+      </w:pPr>
+    </w:p>
+    <w:p>
+      <w:pPr>
+        <w:pStyle w:val="Heading2"/>
+        <w:rPr>
+          <w:rFonts w:ascii="GHEA Grapalat" w:hAnsi="GHEA Grapalat"/>
+          <w:b/>
+          <w:color w:val="auto"/>
+          <w:lang w:val="hy-AM"/>
+        </w:rPr>
+      </w:pPr>
+      <w:r>
+        <w:rPr>
+          <w:rFonts w:ascii="GHEA Grapalat" w:hAnsi="GHEA Grapalat"/>
+          <w:b/>
+          <w:color w:val="auto"/>
+          <w:lang w:val="hy-AM"/>
+        </w:rPr>
+        <w:t>2</w:t>
+      </w:r>
+      <w:r>
+        <w:rPr>
+          <w:rFonts w:ascii="Cambria Math" w:hAnsi="Cambria Math" w:cs="Cambria Math"/>
+          <w:b/>
+          <w:color w:val="auto"/>
+          <w:lang w:val="hy-AM"/>
+        </w:rPr>
+        <w:t>․</w:t>
+      </w:r>
+      <w:r>
+        <w:rPr>
+          <w:rFonts w:ascii="GHEA Grapalat" w:hAnsi="GHEA Grapalat"/>
+          <w:b/>
+          <w:color w:val="auto"/>
+          <w:lang w:val="hy-AM"/>
+        </w:rPr>
+        <w:t>2</w:t>
+      </w:r>
+      <w:r>
+        <w:rPr>
+          <w:rFonts w:ascii="Cambria Math" w:hAnsi="Cambria Math" w:cs="Cambria Math"/>
+          <w:b/>
+          <w:color w:val="auto"/>
+          <w:lang w:val="hy-AM"/>
+        </w:rPr>
+        <w:t>․</w:t>
+      </w:r>
+      <w:r>
+        <w:rPr>
+          <w:rFonts w:ascii="GHEA Grapalat" w:hAnsi="GHEA Grapalat"/>
+          <w:b/>
+          <w:color w:val="auto"/>
+          <w:lang w:val="hy-AM"/>
+        </w:rPr>
+        <w:t xml:space="preserve">5 </w:t>
+      </w:r>
+      <w:r>
+        <w:rPr>
+          <w:rFonts w:ascii="GHEA Grapalat" w:hAnsi="GHEA Grapalat"/>
+          <w:b/>
+          <w:color w:val="auto"/>
+          <w:lang w:val="hy-AM"/>
+        </w:rPr>
+        <w:t>Հաշվողական</w:t>
+      </w:r>
+      <w:r>
+        <w:rPr>
+          <w:rFonts w:ascii="GHEA Grapalat" w:hAnsi="GHEA Grapalat"/>
+          <w:b/>
+          <w:color w:val="auto"/>
+          <w:lang w:val="hy-AM"/>
+        </w:rPr>
+        <w:t xml:space="preserve"> և ժամանակային</w:t>
+      </w:r>
+      <w:r>
+        <w:rPr>
+          <w:rFonts w:ascii="GHEA Grapalat" w:hAnsi="GHEA Grapalat"/>
+          <w:b/>
+          <w:color w:val="auto"/>
+          <w:lang w:val="hy-AM"/>
+        </w:rPr>
+        <w:t xml:space="preserve"> բարդություն</w:t>
+      </w:r>
+    </w:p>
+    <w:p>
+      <w:pPr>
+        <w:pStyle w:val="NormalWeb"/>
+        <w:rPr>
+          <w:rFonts w:ascii="GHEA Grapalat" w:hAnsi="GHEA Grapalat"/>
+          <w:lang w:val="hy-AM"/>
+        </w:rPr>
+      </w:pPr>
+    </w:p>
+    <w:p>
+      <w:pPr>
+        <w:pStyle w:val="NormalWeb"/>
+        <w:rPr>
+          <w:rFonts w:ascii="GHEA Grapalat" w:hAnsi="GHEA Grapalat"/>
+          <w:lang w:val="hy-AM"/>
+        </w:rPr>
+      </w:pPr>
+      <w:r>
+        <w:rPr>
+          <w:rFonts w:ascii="GHEA Grapalat" w:hAnsi="GHEA Grapalat"/>
+          <w:lang w:val="hy-AM"/>
+        </w:rPr>
+        <w:t xml:space="preserve">Երկու ալգորիթմներն էլ պահանջում են տվյալների կառուցվածք՝ ճակատային հանգույցների մասնակի դասավորությունները կառավարելու համար։ Երկուական կույտի (binary heap) առկայության դեպքում մեկ extract-min կամ insert գործողության միջինացված արժեքը O(log |E|) է։ </w:t>
+      </w:r>
+      <w:r>
+        <w:rPr>
+          <w:rFonts w:ascii="GHEA Grapalat" w:hAnsi="GHEA Grapalat"/>
+          <w:lang w:val="hy-AM"/>
+        </w:rPr>
+        <w:t>Դեյքստրայ</w:t>
+      </w:r>
+      <w:r>
+        <w:rPr>
+          <w:rFonts w:ascii="GHEA Grapalat" w:hAnsi="GHEA Grapalat"/>
+          <w:lang w:val="hy-AM"/>
+        </w:rPr>
+        <w:t>ի տեսական ժամանակային սահմանը G(V,E) գրաֆի համար՝ երկուական կույտի դեպքում</w:t>
+      </w:r>
+      <w:r>
+        <w:rPr>
+          <w:rFonts w:ascii="GHEA Grapalat" w:hAnsi="GHEA Grapalat"/>
+          <w:lang w:val="hy-AM"/>
+        </w:rPr>
+        <w:t xml:space="preserve"> ՝ </w:t>
+      </w:r>
+      <w:r>
+        <w:rPr>
+          <w:rFonts w:ascii="GHEA Grapalat" w:hAnsi="GHEA Grapalat"/>
+          <w:lang w:val="hy-AM"/>
+        </w:rPr>
+        <w:t>O((|V|+|E|)·log |V|) է։ Դասական հարևանության մատրիցի իրականացման դեպքում սահմանը վատանում է մինչև O(|E|) յուրաքանչյուր ռելակսացիայի համար, ինչը խիտ գրաֆերի համար տալիս է ընդհանուր O(|V|^2)։</w:t>
+      </w:r>
     </w:p>
     <w:sectPr>
       <w:footerReference w:type="default" r:id="rId8"/>
@@ -35852,7 +37158,7 @@
 </file>
 
 <file path=customXml/itemProps1.xml><?xml version="1.0" encoding="utf-8"?>
-<ds:datastoreItem xmlns:ds="http://schemas.openxmlformats.org/officeDocument/2006/customXml" ds:itemID="{59709BAB-34DD-4946-A11A-83F06E84D137}">
+<ds:datastoreItem xmlns:ds="http://schemas.openxmlformats.org/officeDocument/2006/customXml" ds:itemID="{79F3B066-542A-4780-A2F8-B18F3AFAB2AF}">
   <ds:schemaRefs>
     <ds:schemaRef ds:uri="http://schemas.openxmlformats.org/officeDocument/2006/bibliography"/>
   </ds:schemaRefs>

</xml_diff>

<commit_message>
Added rest of the chapter 2
</commit_message>
<xml_diff>
--- a/diploma.docx
+++ b/diploma.docx
@@ -30131,7 +30131,3482 @@
           <w:rFonts w:ascii="GHEA Grapalat" w:hAnsi="GHEA Grapalat"/>
           <w:lang w:val="hy-AM"/>
         </w:rPr>
-        <w:t xml:space="preserve"> ալգորիթմը երբեք չի ռելակսացնում հանգույցը նախնական ծախս</w:t>
+        <w:t xml:space="preserve"> ալգորիթմը երբեք չի ռելակսացնում հանգույցը նախնական ծախսով, որը գերազանցում է վերջնական օպտիմումը։ </w:t>
+      </w:r>
+      <w:r>
+        <w:rPr>
+          <w:rFonts w:ascii="GHEA Grapalat" w:hAnsi="GHEA Grapalat"/>
+          <w:lang w:val="hy-AM"/>
+        </w:rPr>
+        <w:t>Ա</w:t>
+      </w:r>
+      <w:r>
+        <w:rPr>
+          <w:rFonts w:ascii="GHEA Grapalat" w:hAnsi="GHEA Grapalat"/>
+          <w:lang w:val="hy-AM"/>
+        </w:rPr>
+        <w:t xml:space="preserve">*-ի օպտիմալությունը հիմնված է թույլատրելիության և համաձայնեցվածության համադրության վրա։ Այս պայմաններում ալգորիթմը հանգույցները հեռացնում է պրիորիտետային հերթից՝ իրական ճանապարհի ծախսի չնվազող կարգով, երաշխավորելով, որ հայտնաբերված առաջին լուծումը օպտիմալ է։ Եթե h-ը թույլատրելի չէ, </w:t>
+      </w:r>
+      <w:r>
+        <w:rPr>
+          <w:rFonts w:ascii="GHEA Grapalat" w:hAnsi="GHEA Grapalat"/>
+          <w:lang w:val="hy-AM"/>
+        </w:rPr>
+        <w:t>Ա</w:t>
+      </w:r>
+      <w:r>
+        <w:rPr>
+          <w:rFonts w:ascii="GHEA Grapalat" w:hAnsi="GHEA Grapalat"/>
+          <w:lang w:val="hy-AM"/>
+        </w:rPr>
+        <w:t>*-ն կարող է վերադարձնել ենթաօպտիմալ ճանապարհ. եթե h-ը անհամաձայնեցված է, ալգորիթմը կարող է դեռևս լինել թույլատրելի, բայց կարող է ընդլայնել հանգույցները խիստ մոնոտոն կարգից դուրս։</w:t>
+      </w:r>
+    </w:p>
+    <w:p>
+      <w:pPr>
+        <w:pStyle w:val="NormalWeb"/>
+        <w:rPr>
+          <w:rFonts w:ascii="GHEA Grapalat" w:hAnsi="GHEA Grapalat"/>
+          <w:lang w:val="hy-AM"/>
+        </w:rPr>
+      </w:pPr>
+    </w:p>
+    <w:p>
+      <w:pPr>
+        <w:pStyle w:val="Heading2"/>
+        <w:rPr>
+          <w:rFonts w:ascii="GHEA Grapalat" w:hAnsi="GHEA Grapalat"/>
+          <w:b/>
+          <w:color w:val="auto"/>
+          <w:lang w:val="hy-AM"/>
+        </w:rPr>
+      </w:pPr>
+      <w:r>
+        <w:rPr>
+          <w:rFonts w:ascii="GHEA Grapalat" w:hAnsi="GHEA Grapalat"/>
+          <w:b/>
+          <w:color w:val="auto"/>
+          <w:lang w:val="hy-AM"/>
+        </w:rPr>
+        <w:t>2</w:t>
+      </w:r>
+      <w:r>
+        <w:rPr>
+          <w:rFonts w:ascii="Cambria Math" w:hAnsi="Cambria Math" w:cs="Cambria Math"/>
+          <w:b/>
+          <w:color w:val="auto"/>
+          <w:lang w:val="hy-AM"/>
+        </w:rPr>
+        <w:t>․</w:t>
+      </w:r>
+      <w:r>
+        <w:rPr>
+          <w:rFonts w:ascii="GHEA Grapalat" w:hAnsi="GHEA Grapalat"/>
+          <w:b/>
+          <w:color w:val="auto"/>
+          <w:lang w:val="hy-AM"/>
+        </w:rPr>
+        <w:t>2</w:t>
+      </w:r>
+      <w:r>
+        <w:rPr>
+          <w:rFonts w:ascii="Cambria Math" w:hAnsi="Cambria Math" w:cs="Cambria Math"/>
+          <w:b/>
+          <w:color w:val="auto"/>
+          <w:lang w:val="hy-AM"/>
+        </w:rPr>
+        <w:t>․</w:t>
+      </w:r>
+      <w:r>
+        <w:rPr>
+          <w:rFonts w:ascii="GHEA Grapalat" w:hAnsi="GHEA Grapalat"/>
+          <w:b/>
+          <w:color w:val="auto"/>
+          <w:lang w:val="hy-AM"/>
+        </w:rPr>
+        <w:t xml:space="preserve">5 </w:t>
+      </w:r>
+      <w:r>
+        <w:rPr>
+          <w:rFonts w:ascii="GHEA Grapalat" w:hAnsi="GHEA Grapalat"/>
+          <w:b/>
+          <w:color w:val="auto"/>
+          <w:lang w:val="hy-AM"/>
+        </w:rPr>
+        <w:t>Հաշվողական</w:t>
+      </w:r>
+      <w:r>
+        <w:rPr>
+          <w:rFonts w:ascii="GHEA Grapalat" w:hAnsi="GHEA Grapalat"/>
+          <w:b/>
+          <w:color w:val="auto"/>
+          <w:lang w:val="hy-AM"/>
+        </w:rPr>
+        <w:t xml:space="preserve"> և ժամանակային</w:t>
+      </w:r>
+      <w:r>
+        <w:rPr>
+          <w:rFonts w:ascii="GHEA Grapalat" w:hAnsi="GHEA Grapalat"/>
+          <w:b/>
+          <w:color w:val="auto"/>
+          <w:lang w:val="hy-AM"/>
+        </w:rPr>
+        <w:t xml:space="preserve"> բարդություն</w:t>
+      </w:r>
+    </w:p>
+    <w:p>
+      <w:pPr>
+        <w:pStyle w:val="NormalWeb"/>
+        <w:rPr>
+          <w:rFonts w:ascii="GHEA Grapalat" w:hAnsi="GHEA Grapalat"/>
+          <w:lang w:val="hy-AM"/>
+        </w:rPr>
+      </w:pPr>
+    </w:p>
+    <w:p>
+      <w:pPr>
+        <w:pStyle w:val="NormalWeb"/>
+        <w:rPr>
+          <w:rFonts w:ascii="GHEA Grapalat" w:hAnsi="GHEA Grapalat"/>
+          <w:lang w:val="hy-AM"/>
+        </w:rPr>
+      </w:pPr>
+      <w:r>
+        <w:rPr>
+          <w:rFonts w:ascii="GHEA Grapalat" w:hAnsi="GHEA Grapalat"/>
+          <w:lang w:val="hy-AM"/>
+        </w:rPr>
+        <w:t xml:space="preserve">Երկու ալգորիթմներն էլ պահանջում են տվյալների կառուցվածք՝ ճակատային հանգույցների մասնակի դասավորությունները կառավարելու համար։ Երկուական կույտի (binary heap) առկայության դեպքում մեկ extract-min կամ insert գործողության միջինացված արժեքը O(log |E|) է։ </w:t>
+      </w:r>
+      <w:r>
+        <w:rPr>
+          <w:rFonts w:ascii="GHEA Grapalat" w:hAnsi="GHEA Grapalat"/>
+          <w:lang w:val="hy-AM"/>
+        </w:rPr>
+        <w:t>Դեյքստրայ</w:t>
+      </w:r>
+      <w:r>
+        <w:rPr>
+          <w:rFonts w:ascii="GHEA Grapalat" w:hAnsi="GHEA Grapalat"/>
+          <w:lang w:val="hy-AM"/>
+        </w:rPr>
+        <w:t>ի տեսական ժամանակային սահմանը G(V,E) գրաֆի համար՝ երկուական կույտի դեպքում</w:t>
+      </w:r>
+      <w:r>
+        <w:rPr>
+          <w:rFonts w:ascii="GHEA Grapalat" w:hAnsi="GHEA Grapalat"/>
+          <w:lang w:val="hy-AM"/>
+        </w:rPr>
+        <w:t xml:space="preserve"> ՝ </w:t>
+      </w:r>
+      <w:r>
+        <w:rPr>
+          <w:rFonts w:ascii="GHEA Grapalat" w:hAnsi="GHEA Grapalat"/>
+          <w:lang w:val="hy-AM"/>
+        </w:rPr>
+        <w:t>O((|V|+|E|)·log |V|) է։ Դասական հարևանության մատրիցի իրականացման դեպքում սահմանը վատանում է մինչև O(|E|) յուրաքանչյուր ռելակսացիայի համար, ինչը խիտ գրաֆերի համար տալիս է ընդհանուր O(|V|^2)։</w:t>
+      </w:r>
+      <w:r>
+        <w:rPr>
+          <w:rFonts w:ascii="GHEA Grapalat" w:hAnsi="GHEA Grapalat"/>
+          <w:lang w:val="hy-AM"/>
+        </w:rPr>
+        <w:br/>
+      </w:r>
+      <w:r>
+        <w:rPr>
+          <w:rFonts w:ascii="GHEA Grapalat" w:hAnsi="GHEA Grapalat"/>
+          <w:lang w:val="hy-AM"/>
+        </w:rPr>
+        <w:br/>
+      </w:r>
+      <w:r>
+        <w:rPr>
+          <w:rFonts w:ascii="GHEA Grapalat" w:hAnsi="GHEA Grapalat"/>
+          <w:lang w:val="hy-AM"/>
+        </w:rPr>
+        <w:t>Ա</w:t>
+      </w:r>
+      <w:r>
+        <w:rPr>
+          <w:rFonts w:ascii="GHEA Grapalat" w:hAnsi="GHEA Grapalat"/>
+          <w:lang w:val="hy-AM"/>
+        </w:rPr>
+        <w:t xml:space="preserve">*-ն յուրաքանչյուր հանգույցի ընդլայնման ժամանակ </w:t>
+      </w:r>
+      <w:r>
+        <w:rPr>
+          <w:rFonts w:ascii="GHEA Grapalat" w:hAnsi="GHEA Grapalat"/>
+          <w:lang w:val="hy-AM"/>
+        </w:rPr>
+        <w:t>կատարում</w:t>
+      </w:r>
+      <w:r>
+        <w:rPr>
+          <w:rFonts w:ascii="GHEA Grapalat" w:hAnsi="GHEA Grapalat"/>
+          <w:lang w:val="hy-AM"/>
+        </w:rPr>
+        <w:t xml:space="preserve"> է էվրիստիկայի լրացուցիչ գնահատում։ Ենթադրելով, որ էվրիստիկայի հաշվարկը O(1) է յուրաքանչյուր հանգույցի համար (ինչը սովորական է երկրաչափական էվրիստիկաների, օրինակ՝ Էվկլիդեսյան հեռավորության համար)</w:t>
+      </w:r>
+      <w:r>
+        <w:rPr>
+          <w:rFonts w:ascii="GHEA Grapalat" w:hAnsi="GHEA Grapalat"/>
+          <w:lang w:val="hy-AM"/>
+        </w:rPr>
+        <w:t xml:space="preserve">, </w:t>
+      </w:r>
+      <w:r>
+        <w:rPr>
+          <w:rFonts w:ascii="GHEA Grapalat" w:hAnsi="GHEA Grapalat"/>
+          <w:lang w:val="hy-AM"/>
+        </w:rPr>
+        <w:t xml:space="preserve">ժամանակային սահմանը մնում է O((|V|+|E|)·log |V|)։ Սակայն, արդյունավետ որոնման տարածությունը սովորաբար G-ի խիստ </w:t>
+      </w:r>
+      <w:r>
+        <w:rPr>
+          <w:rFonts w:ascii="GHEA Grapalat" w:hAnsi="GHEA Grapalat"/>
+          <w:lang w:val="hy-AM"/>
+        </w:rPr>
+        <w:lastRenderedPageBreak/>
+        <w:t xml:space="preserve">ենթաբազմություն է, քանի որ ավելի բարձր f արժեքներով հանգույցները երբեք չեն քննարկվում։ Հետևաբար, արդյունավետ ընդլայնման գործակիցը α բավարարում է α ≤ |V| պայմանին, ընդ որում՝ հավասարությունը տեղի ունի միայն այն դեպքում, երբ h </w:t>
+      </w:r>
+      <w:r>
+        <w:rPr>
+          <w:rFonts w:ascii="Courier New" w:hAnsi="Courier New" w:cs="Courier New"/>
+          <w:lang w:val="hy-AM"/>
+        </w:rPr>
+        <w:t>≡</w:t>
+      </w:r>
+      <w:r>
+        <w:rPr>
+          <w:rFonts w:ascii="GHEA Grapalat" w:hAnsi="GHEA Grapalat"/>
+          <w:lang w:val="hy-AM"/>
+        </w:rPr>
+        <w:t xml:space="preserve"> 0 (այսինքն՝ </w:t>
+      </w:r>
+      <w:r>
+        <w:rPr>
+          <w:rFonts w:ascii="GHEA Grapalat" w:hAnsi="GHEA Grapalat"/>
+          <w:lang w:val="hy-AM"/>
+        </w:rPr>
+        <w:t>Ա</w:t>
+      </w:r>
+      <w:r>
+        <w:rPr>
+          <w:rFonts w:ascii="GHEA Grapalat" w:hAnsi="GHEA Grapalat"/>
+          <w:lang w:val="hy-AM"/>
+        </w:rPr>
+        <w:t>*-</w:t>
+      </w:r>
+      <w:r>
+        <w:rPr>
+          <w:rFonts w:ascii="GHEA Grapalat" w:hAnsi="GHEA Grapalat"/>
+          <w:lang w:val="hy-AM"/>
+        </w:rPr>
+        <w:t xml:space="preserve">ը ձևափոխվում </w:t>
+      </w:r>
+      <w:r>
+        <w:rPr>
+          <w:rFonts w:ascii="GHEA Grapalat" w:hAnsi="GHEA Grapalat"/>
+          <w:lang w:val="hy-AM"/>
+        </w:rPr>
+        <w:t xml:space="preserve">է մինչև </w:t>
+      </w:r>
+      <w:r>
+        <w:rPr>
+          <w:rFonts w:ascii="GHEA Grapalat" w:hAnsi="GHEA Grapalat"/>
+          <w:lang w:val="hy-AM"/>
+        </w:rPr>
+        <w:t>Դեյքստրա</w:t>
+      </w:r>
+      <w:r>
+        <w:rPr>
+          <w:rFonts w:ascii="GHEA Grapalat" w:hAnsi="GHEA Grapalat"/>
+          <w:lang w:val="hy-AM"/>
+        </w:rPr>
+        <w:t>)։</w:t>
+      </w:r>
+    </w:p>
+    <w:p>
+      <w:pPr>
+        <w:pStyle w:val="NormalWeb"/>
+        <w:rPr>
+          <w:rFonts w:ascii="GHEA Grapalat" w:hAnsi="GHEA Grapalat"/>
+          <w:lang w:val="hy-AM"/>
+        </w:rPr>
+      </w:pPr>
+      <w:r>
+        <w:rPr>
+          <w:rFonts w:ascii="GHEA Grapalat" w:hAnsi="GHEA Grapalat"/>
+          <w:lang w:val="hy-AM"/>
+        </w:rPr>
+        <w:t xml:space="preserve">3.2 Տարածական բարդություն Հիմնական հիշողության սպառողները տարբերվում են։ </w:t>
+      </w:r>
+    </w:p>
+    <w:p>
+      <w:pPr>
+        <w:pStyle w:val="NormalWeb"/>
+        <w:rPr>
+          <w:rFonts w:ascii="GHEA Grapalat" w:hAnsi="GHEA Grapalat"/>
+          <w:lang w:val="hy-AM"/>
+        </w:rPr>
+      </w:pPr>
+      <w:r>
+        <w:rPr>
+          <w:rFonts w:ascii="GHEA Grapalat" w:hAnsi="GHEA Grapalat"/>
+          <w:lang w:val="hy-AM"/>
+        </w:rPr>
+        <w:t xml:space="preserve">Երկու ալգորիթմներն էլ պահպանում են պրիորիտետային հերթ, հետազոտված հանգույցների բազմություն (փակ ցուցակ) և g-ի լավագույն հայտնի արժեքների քարտեզագրում (հաճախ կոչվում է հեռավորություն)։ Այն վատագույն դեպքում, երբ այցելում են բոլոր գագաթներին, տարածական պահանջը O(|V|+|E|) է՝ հարևանության ցուցակի պահպանման և փակ բազմության պատճառով։ </w:t>
+      </w:r>
+      <w:r>
+        <w:rPr>
+          <w:rFonts w:ascii="GHEA Grapalat" w:hAnsi="GHEA Grapalat"/>
+          <w:lang w:val="hy-AM"/>
+        </w:rPr>
+        <w:t>Ա</w:t>
+      </w:r>
+      <w:r>
+        <w:rPr>
+          <w:rFonts w:ascii="GHEA Grapalat" w:hAnsi="GHEA Grapalat"/>
+          <w:lang w:val="hy-AM"/>
+        </w:rPr>
+        <w:t>*-</w:t>
+      </w:r>
+      <w:r>
+        <w:rPr>
+          <w:rFonts w:ascii="GHEA Grapalat" w:hAnsi="GHEA Grapalat"/>
+          <w:lang w:val="hy-AM"/>
+        </w:rPr>
+        <w:t>ը</w:t>
+      </w:r>
+      <w:r>
+        <w:rPr>
+          <w:rFonts w:ascii="GHEA Grapalat" w:hAnsi="GHEA Grapalat"/>
+          <w:lang w:val="hy-AM"/>
+        </w:rPr>
+        <w:t xml:space="preserve"> կարող է լրացուցիչ պահպանել էվրիստիկ քեշ յուրաքանչյուր հանգույցի համար, եթե արագ հասանելիության համար պահանջվում են նախապես հաշվարկված էվրիստիկ արժեքներ։ Այս ծանրաբեռնվածությունը աննշան է սկալյար էվրիստիկաների համար, բայց կարող է զգալի դառնալ բարդ էվրիստիկ կառուցվածքների համար (օրինակ՝ օրինաչափությունների տվյալների բազաներ)։</w:t>
+      </w:r>
+    </w:p>
+    <w:p>
+      <w:pPr>
+        <w:pStyle w:val="NormalWeb"/>
+        <w:rPr>
+          <w:rFonts w:ascii="GHEA Grapalat" w:hAnsi="GHEA Grapalat"/>
+          <w:lang w:val="hy-AM"/>
+        </w:rPr>
+      </w:pPr>
+      <w:r>
+        <w:rPr>
+          <w:rFonts w:ascii="GHEA Grapalat" w:hAnsi="GHEA Grapalat"/>
+          <w:lang w:val="hy-AM"/>
+        </w:rPr>
+        <w:t xml:space="preserve">3.3 Վատագույն դեպքի սցենարներ Երկու ալգորիթմներն էլ բախվում են էքսպոնենցիալ աճի պաթոլոգիական գրաֆերում։ Անբարենպաստ պայմաններում, երբ h-ը թույլատրելի կամ համաձայնեցված չէ, </w:t>
+      </w:r>
+      <w:r>
+        <w:rPr>
+          <w:rFonts w:ascii="GHEA Grapalat" w:hAnsi="GHEA Grapalat"/>
+          <w:lang w:val="hy-AM"/>
+        </w:rPr>
+        <w:t>Ա</w:t>
+      </w:r>
+      <w:r>
+        <w:rPr>
+          <w:rFonts w:ascii="GHEA Grapalat" w:hAnsi="GHEA Grapalat"/>
+          <w:lang w:val="hy-AM"/>
+        </w:rPr>
+        <w:t xml:space="preserve">*-ն կարող է հետախուզել սուպեր-պոլինոմիալ թվով հանգույցներ մինչև ավարտվելը։ Ընդհակառակը, </w:t>
+      </w:r>
+      <w:r>
+        <w:rPr>
+          <w:rFonts w:ascii="GHEA Grapalat" w:hAnsi="GHEA Grapalat"/>
+          <w:lang w:val="hy-AM"/>
+        </w:rPr>
+        <w:t>Դեյքսրայ</w:t>
+      </w:r>
+      <w:r>
+        <w:rPr>
+          <w:rFonts w:ascii="GHEA Grapalat" w:hAnsi="GHEA Grapalat"/>
+          <w:lang w:val="hy-AM"/>
+        </w:rPr>
+        <w:t>ի վատագույն դեպքի բարդությունը մնում է պոլինոմիալ, սակայն քառակուսային է խիտ գրաֆերում՝ հարևանության մատրիցներ օգտագործելիս։ Տարբերությունը կտրուկ է դառնում նոսր և խիտ ռեժիմներում։</w:t>
+      </w:r>
+    </w:p>
+    <w:p>
+      <w:pPr>
+        <w:pStyle w:val="NormalWeb"/>
+        <w:rPr>
+          <w:rFonts w:ascii="GHEA Grapalat" w:hAnsi="GHEA Grapalat"/>
+          <w:lang w:val="hy-AM"/>
+        </w:rPr>
+      </w:pPr>
+      <w:r>
+        <w:rPr>
+          <w:rFonts w:ascii="GHEA Grapalat" w:hAnsi="GHEA Grapalat"/>
+          <w:lang w:val="hy-AM"/>
+        </w:rPr>
+        <w:t xml:space="preserve">3.4 Կատարողունակության տարբերությունները նոսր և խիտ գրաֆերում Նոսր գրաֆերում (որտեղ |E| ≈ </w:t>
+      </w:r>
+      <w:r>
+        <w:rPr>
+          <w:rFonts w:ascii="Courier New" w:hAnsi="Courier New" w:cs="Courier New"/>
+          <w:lang w:val="hy-AM"/>
+        </w:rPr>
+        <w:t>Ω</w:t>
+      </w:r>
+      <w:r>
+        <w:rPr>
+          <w:rFonts w:ascii="GHEA Grapalat" w:hAnsi="GHEA Grapalat"/>
+          <w:lang w:val="hy-AM"/>
+        </w:rPr>
+        <w:t xml:space="preserve">(|V|)), |E|/|V| հարաբերակցությունը սահմանափակված է փոքր հաստատունով։ Հիերարխիկ տեխնիկաները, ինչպիսիք են հարևանության ցուցակները, հետևաբար գերակշռում են աշխատանքային ժամանակում։ Երկու ալգորիթմներն էլ համաչափորեն օգուտ են քաղում այս նոսրությունից, բայց </w:t>
+      </w:r>
+      <w:r>
+        <w:rPr>
+          <w:rFonts w:ascii="GHEA Grapalat" w:hAnsi="GHEA Grapalat"/>
+          <w:lang w:val="hy-AM"/>
+        </w:rPr>
+        <w:t>Ա*</w:t>
+      </w:r>
+      <w:r>
+        <w:rPr>
+          <w:rFonts w:ascii="GHEA Grapalat" w:hAnsi="GHEA Grapalat"/>
+          <w:lang w:val="hy-AM"/>
+        </w:rPr>
+        <w:t>-ն սովորաբար հետախուզում է շատ ավելի քիչ կողեր՝ էվրիստիկ ուղղորդման շնորհիվ, կրճատելով արդյունավետ որոնման ճակատը։</w:t>
+      </w:r>
+    </w:p>
+    <w:p>
+      <w:pPr>
+        <w:pStyle w:val="NormalWeb"/>
+        <w:rPr>
+          <w:rFonts w:ascii="GHEA Grapalat" w:hAnsi="GHEA Grapalat"/>
+          <w:lang w:val="hy-AM"/>
+        </w:rPr>
+      </w:pPr>
+      <w:r>
+        <w:rPr>
+          <w:rFonts w:ascii="GHEA Grapalat" w:hAnsi="GHEA Grapalat"/>
+          <w:lang w:val="hy-AM"/>
+        </w:rPr>
+        <w:t xml:space="preserve">Խիտ գրաֆերում (|E| = Θ(|V|²)), </w:t>
+      </w:r>
+      <w:r>
+        <w:rPr>
+          <w:rFonts w:ascii="GHEA Grapalat" w:hAnsi="GHEA Grapalat"/>
+          <w:lang w:val="hy-AM"/>
+        </w:rPr>
+        <w:t>Դեյքստրան</w:t>
+      </w:r>
+      <w:r>
+        <w:rPr>
+          <w:rFonts w:ascii="GHEA Grapalat" w:hAnsi="GHEA Grapalat"/>
+          <w:lang w:val="hy-AM"/>
+        </w:rPr>
+        <w:t xml:space="preserve">՝ երկուական կույտի իրականացմամբ, ժամանակը մասշտաբավորվում է որպես O(|V|²·log |V|), մինչդեռ </w:t>
+      </w:r>
+      <w:r>
+        <w:rPr>
+          <w:rFonts w:ascii="GHEA Grapalat" w:hAnsi="GHEA Grapalat"/>
+          <w:lang w:val="hy-AM"/>
+        </w:rPr>
+        <w:t>Ա</w:t>
+      </w:r>
+      <w:r>
+        <w:rPr>
+          <w:rFonts w:ascii="GHEA Grapalat" w:hAnsi="GHEA Grapalat"/>
+          <w:lang w:val="hy-AM"/>
+        </w:rPr>
+        <w:t>*-</w:t>
+      </w:r>
+      <w:r>
+        <w:rPr>
+          <w:rFonts w:ascii="GHEA Grapalat" w:hAnsi="GHEA Grapalat"/>
+          <w:lang w:val="hy-AM"/>
+        </w:rPr>
+        <w:t>ը</w:t>
+      </w:r>
+      <w:r>
+        <w:rPr>
+          <w:rFonts w:ascii="GHEA Grapalat" w:hAnsi="GHEA Grapalat"/>
+          <w:lang w:val="hy-AM"/>
+        </w:rPr>
+        <w:t xml:space="preserve"> կարող է դեռ օգուտ քաղել էվրիստիկաներից, եթե դրանք ապահովում են ճշգրիտ գնահատականներ, բայց հարևանության ցուցակի ներկայացումը առաջացնում է ավելի բարձր հիշողության ծանրաբեռնվածություն, և բոլոր հարևաններին դիտարկելու ծախսը դառնում է արգելակող։ Ֆիբոնաչիի կույտի նման տեխնիկաները կարող են հասնել O(|E| + |V|·log |V|)-ի, բայց </w:t>
+      </w:r>
+      <w:r>
+        <w:rPr>
+          <w:rFonts w:ascii="GHEA Grapalat" w:hAnsi="GHEA Grapalat"/>
+          <w:lang w:val="hy-AM"/>
+        </w:rPr>
+        <w:t>լավ չեն աշխատում</w:t>
+      </w:r>
+      <w:r>
+        <w:rPr>
+          <w:rFonts w:ascii="GHEA Grapalat" w:hAnsi="GHEA Grapalat"/>
+          <w:lang w:val="hy-AM"/>
+        </w:rPr>
+        <w:t xml:space="preserve"> ավելի մեծ հաստատուն գործակիցներից։</w:t>
+      </w:r>
+    </w:p>
+    <w:p>
+      <w:pPr>
+        <w:pStyle w:val="NormalWeb"/>
+        <w:rPr>
+          <w:rFonts w:ascii="GHEA Grapalat" w:hAnsi="GHEA Grapalat"/>
+          <w:lang w:val="hy-AM"/>
+        </w:rPr>
+      </w:pPr>
+      <w:r>
+        <w:rPr>
+          <w:rFonts w:ascii="GHEA Grapalat" w:hAnsi="GHEA Grapalat"/>
+          <w:lang w:val="hy-AM"/>
+        </w:rPr>
+        <w:lastRenderedPageBreak/>
+        <w:t xml:space="preserve">Գործնականում, շատ խիտ գրաֆերի համար ալգորիթմի ընտրությունը հաճախ կախված է բարձր ճշգրտությամբ էվրիստիկայի առկայությունից. սակայն, </w:t>
+      </w:r>
+      <w:r>
+        <w:rPr>
+          <w:rFonts w:ascii="GHEA Grapalat" w:hAnsi="GHEA Grapalat"/>
+          <w:lang w:val="hy-AM"/>
+        </w:rPr>
+        <w:t>Ա</w:t>
+      </w:r>
+      <w:r>
+        <w:rPr>
+          <w:rFonts w:ascii="GHEA Grapalat" w:hAnsi="GHEA Grapalat"/>
+          <w:lang w:val="hy-AM"/>
+        </w:rPr>
+        <w:t>*-ի բացարձակ աշխատանքային ժամանակի առավելությունները նվազում են, եթե էվրիստիկան թույլ է, քանի որ ալգորիթմը դեռևս պետք է մշակի յուրաքանչյուր հետազոտված գագաթին կից բոլոր կողերը։</w:t>
+      </w:r>
+    </w:p>
+    <w:p>
+      <w:pPr>
+        <w:pStyle w:val="NormalWeb"/>
+        <w:rPr>
+          <w:rFonts w:ascii="GHEA Grapalat" w:hAnsi="GHEA Grapalat"/>
+          <w:lang w:val="hy-AM"/>
+        </w:rPr>
+      </w:pPr>
+      <w:r>
+        <w:rPr>
+          <w:rFonts w:ascii="GHEA Grapalat" w:hAnsi="GHEA Grapalat"/>
+          <w:lang w:val="hy-AM"/>
+        </w:rPr>
+        <w:t xml:space="preserve">Էվրիստիկ ֆունկցիաները </w:t>
+      </w:r>
+      <w:r>
+        <w:rPr>
+          <w:rFonts w:ascii="GHEA Grapalat" w:hAnsi="GHEA Grapalat"/>
+          <w:lang w:val="hy-AM"/>
+        </w:rPr>
+        <w:t>Ա</w:t>
+      </w:r>
+      <w:r>
+        <w:rPr>
+          <w:rFonts w:ascii="GHEA Grapalat" w:hAnsi="GHEA Grapalat"/>
+          <w:lang w:val="hy-AM"/>
+        </w:rPr>
+        <w:t>*-ում</w:t>
+      </w:r>
+    </w:p>
+    <w:p>
+      <w:pPr>
+        <w:pStyle w:val="NormalWeb"/>
+        <w:rPr>
+          <w:rFonts w:ascii="GHEA Grapalat" w:hAnsi="GHEA Grapalat"/>
+          <w:lang w:val="hy-AM"/>
+        </w:rPr>
+      </w:pPr>
+    </w:p>
+    <w:p>
+      <w:pPr>
+        <w:pStyle w:val="NormalWeb"/>
+        <w:rPr>
+          <w:rFonts w:ascii="GHEA Grapalat" w:hAnsi="GHEA Grapalat"/>
+          <w:lang w:val="hy-AM"/>
+        </w:rPr>
+      </w:pPr>
+      <w:r>
+        <w:rPr>
+          <w:rFonts w:ascii="GHEA Grapalat" w:hAnsi="GHEA Grapalat"/>
+          <w:lang w:val="hy-AM"/>
+        </w:rPr>
+        <w:t>h-ի որակը ավանդաբար չափվում է երեք չափումներով. թույլատրելիություն, համաձայնեցվածություն և հաշվողական ծանրաբեռնվածություն։</w:t>
+      </w:r>
+    </w:p>
+    <w:p>
+      <w:pPr>
+        <w:pStyle w:val="NormalWeb"/>
+        <w:rPr>
+          <w:rFonts w:ascii="GHEA Grapalat" w:hAnsi="GHEA Grapalat"/>
+          <w:lang w:val="hy-AM"/>
+        </w:rPr>
+      </w:pPr>
+      <w:r>
+        <w:rPr>
+          <w:rFonts w:ascii="GHEA Grapalat" w:hAnsi="GHEA Grapalat"/>
+          <w:lang w:val="hy-AM"/>
+        </w:rPr>
+        <w:t xml:space="preserve">4.1 Ֆորմալ սահմանումներ Թույլատրելիություն. h-ը թույլատրելի է, եթե </w:t>
+      </w:r>
+      <w:r>
+        <w:rPr>
+          <w:rFonts w:ascii="Cambria Math" w:hAnsi="Cambria Math" w:cs="Cambria Math"/>
+          <w:lang w:val="hy-AM"/>
+        </w:rPr>
+        <w:t>∀</w:t>
+      </w:r>
+      <w:r>
+        <w:rPr>
+          <w:rFonts w:ascii="GHEA Grapalat" w:hAnsi="GHEA Grapalat"/>
+          <w:lang w:val="hy-AM"/>
+        </w:rPr>
+        <w:t xml:space="preserve"> v </w:t>
+      </w:r>
+      <w:r>
+        <w:rPr>
+          <w:rFonts w:ascii="Cambria Math" w:hAnsi="Cambria Math" w:cs="Cambria Math"/>
+          <w:lang w:val="hy-AM"/>
+        </w:rPr>
+        <w:t>∈</w:t>
+      </w:r>
+      <w:r>
+        <w:rPr>
+          <w:rFonts w:ascii="GHEA Grapalat" w:hAnsi="GHEA Grapalat"/>
+          <w:lang w:val="hy-AM"/>
+        </w:rPr>
+        <w:t xml:space="preserve"> V, h(v) ≤ c*(v), որտեղ c(v)-ն նշանակում է օպտիմալ ծախսը v-ից դեպի նպատակ։ Համաձայնեցվածություն. h-ը համաձայնեցված է, եթե </w:t>
+      </w:r>
+      <w:r>
+        <w:rPr>
+          <w:rFonts w:ascii="Cambria Math" w:hAnsi="Cambria Math" w:cs="Cambria Math"/>
+          <w:lang w:val="hy-AM"/>
+        </w:rPr>
+        <w:t>∀</w:t>
+      </w:r>
+      <w:r>
+        <w:rPr>
+          <w:rFonts w:ascii="GHEA Grapalat" w:hAnsi="GHEA Grapalat"/>
+          <w:lang w:val="hy-AM"/>
+        </w:rPr>
+        <w:t xml:space="preserve"> (</w:t>
+      </w:r>
+      <w:proofErr w:type="gramStart"/>
+      <w:r>
+        <w:rPr>
+          <w:rFonts w:ascii="GHEA Grapalat" w:hAnsi="GHEA Grapalat"/>
+          <w:lang w:val="hy-AM"/>
+        </w:rPr>
+        <w:t>u,v</w:t>
+      </w:r>
+      <w:proofErr w:type="gramEnd"/>
+      <w:r>
+        <w:rPr>
+          <w:rFonts w:ascii="GHEA Grapalat" w:hAnsi="GHEA Grapalat"/>
+          <w:lang w:val="hy-AM"/>
+        </w:rPr>
+        <w:t xml:space="preserve">) </w:t>
+      </w:r>
+      <w:r>
+        <w:rPr>
+          <w:rFonts w:ascii="Cambria Math" w:hAnsi="Cambria Math" w:cs="Cambria Math"/>
+          <w:lang w:val="hy-AM"/>
+        </w:rPr>
+        <w:t>∈</w:t>
+      </w:r>
+      <w:r>
+        <w:rPr>
+          <w:rFonts w:ascii="GHEA Grapalat" w:hAnsi="GHEA Grapalat"/>
+          <w:lang w:val="hy-AM"/>
+        </w:rPr>
+        <w:t xml:space="preserve"> E, h(u) ≤ h(v) + w(u,v), որտեղ w(u,v)-ն կողի կշիռն է։ Համաձայնեցվածությունը երաշխավորում է, որ u հանգույցի ընդլայնումից հետո նրա հարևանների գնահատականը չի գերագնահատվում ավելի, քան կրած ինկրեմենտալ ծախսը։</w:t>
+      </w:r>
+    </w:p>
+    <w:p>
+      <w:pPr>
+        <w:pStyle w:val="NormalWeb"/>
+        <w:rPr>
+          <w:rFonts w:ascii="GHEA Grapalat" w:hAnsi="GHEA Grapalat"/>
+          <w:lang w:val="hy-AM"/>
+        </w:rPr>
+      </w:pPr>
+      <w:r>
+        <w:rPr>
+          <w:rFonts w:ascii="GHEA Grapalat" w:hAnsi="GHEA Grapalat"/>
+          <w:lang w:val="hy-AM"/>
+        </w:rPr>
+        <w:t>4.2 Ազդեցությունը օպտիմալության վրա Մաթեմատիկորեն</w:t>
+      </w:r>
+    </w:p>
+    <w:p>
+      <w:pPr>
+        <w:pStyle w:val="NormalWeb"/>
+        <w:rPr>
+          <w:rFonts w:ascii="GHEA Grapalat" w:hAnsi="GHEA Grapalat"/>
+          <w:lang w:val="hy-AM"/>
+        </w:rPr>
+      </w:pPr>
+      <w:r>
+        <w:rPr>
+          <w:rFonts w:ascii="GHEA Grapalat" w:hAnsi="GHEA Grapalat"/>
+          <w:lang w:val="hy-AM"/>
+        </w:rPr>
+        <w:t>Ա</w:t>
+      </w:r>
+      <w:r>
+        <w:rPr>
+          <w:rFonts w:ascii="GHEA Grapalat" w:hAnsi="GHEA Grapalat"/>
+          <w:lang w:val="hy-AM"/>
+        </w:rPr>
+        <w:t xml:space="preserve">*-ի օպտիմալության ապացույցը ցույց է տալիս, որ թույլատրելիության և համաձայնեցվածության պայմաններում դուրս բերված լուծման ճանապարհը π բավարարում է </w:t>
+      </w:r>
+      <w:r>
+        <w:rPr>
+          <w:rFonts w:ascii="Cambria Math" w:hAnsi="Cambria Math" w:cs="Cambria Math"/>
+          <w:lang w:val="hy-AM"/>
+        </w:rPr>
+        <w:t>∀</w:t>
+      </w:r>
+      <w:r>
+        <w:rPr>
+          <w:rFonts w:ascii="GHEA Grapalat" w:hAnsi="GHEA Grapalat"/>
+          <w:lang w:val="hy-AM"/>
+        </w:rPr>
+        <w:t xml:space="preserve"> π</w:t>
+      </w:r>
+      <w:r>
+        <w:rPr>
+          <w:rFonts w:ascii="Courier New" w:hAnsi="Courier New" w:cs="Courier New"/>
+          <w:lang w:val="hy-AM"/>
+        </w:rPr>
+        <w:t>′</w:t>
+      </w:r>
+      <w:r>
+        <w:rPr>
+          <w:rFonts w:ascii="GHEA Grapalat" w:hAnsi="GHEA Grapalat"/>
+          <w:lang w:val="hy-AM"/>
+        </w:rPr>
+        <w:t>, cost(π)=cost(π</w:t>
+      </w:r>
+      <w:r>
+        <w:rPr>
+          <w:rFonts w:ascii="Courier New" w:hAnsi="Courier New" w:cs="Courier New"/>
+          <w:lang w:val="hy-AM"/>
+        </w:rPr>
+        <w:t>′</w:t>
+      </w:r>
+      <w:r>
+        <w:rPr>
+          <w:rFonts w:ascii="GHEA Grapalat" w:hAnsi="GHEA Grapalat"/>
+          <w:lang w:val="hy-AM"/>
+        </w:rPr>
+        <w:t>)=c*(s,t) պայմանին։ Ապացույցը շարունակվում է ինվարիանտի հաստատմամբ. երբ x հանգույցը հեռացվում է պրիորիտետային հերթից, նրա g(x) արժեքը հավասար է իրական կարճագույն ճանապարհի ծախսին c*(</w:t>
+      </w:r>
+      <w:proofErr w:type="gramStart"/>
+      <w:r>
+        <w:rPr>
+          <w:rFonts w:ascii="GHEA Grapalat" w:hAnsi="GHEA Grapalat"/>
+          <w:lang w:val="hy-AM"/>
+        </w:rPr>
+        <w:t>s,x</w:t>
+      </w:r>
+      <w:proofErr w:type="gramEnd"/>
+      <w:r>
+        <w:rPr>
+          <w:rFonts w:ascii="GHEA Grapalat" w:hAnsi="GHEA Grapalat"/>
+          <w:lang w:val="hy-AM"/>
+        </w:rPr>
+        <w:t>)։ Ինվարիանտը պահպանվում է, քանի որ x-ին այլընտրանքային ցանկացած ճանապարհ պետք է ունենա առնվազն այնքան մեծ f-արժեք, որքան f(x) = g(x) + h(x)-ն է, և համաձայնեցվածության պայմանը երաշխավորում է, որ ոչ մի հետագա ընդլայնում չի կարող բարելավել g(x)-ը՝ առանց արդեն դուրս բերված հանգույցի f-արժեքը նվազեցնելու, ինչը հակասում է պրիորիտետային հերթի դասավորությանը։</w:t>
+      </w:r>
+    </w:p>
+    <w:p>
+      <w:pPr>
+        <w:pStyle w:val="NormalWeb"/>
+        <w:rPr>
+          <w:rFonts w:ascii="GHEA Grapalat" w:hAnsi="GHEA Grapalat"/>
+          <w:lang w:val="hy-AM"/>
+        </w:rPr>
+      </w:pPr>
+      <w:r>
+        <w:rPr>
+          <w:rFonts w:ascii="GHEA Grapalat" w:hAnsi="GHEA Grapalat"/>
+          <w:lang w:val="hy-AM"/>
+        </w:rPr>
+        <w:t xml:space="preserve">4.3 Արդյունավետ էվրիստիկաների նախագծում </w:t>
+      </w:r>
+      <w:r>
+        <w:rPr>
+          <w:rFonts w:ascii="GHEA Grapalat" w:hAnsi="GHEA Grapalat"/>
+          <w:lang w:val="hy-AM"/>
+        </w:rPr>
+        <w:t>տ</w:t>
+      </w:r>
+      <w:r>
+        <w:rPr>
+          <w:rFonts w:ascii="GHEA Grapalat" w:hAnsi="GHEA Grapalat"/>
+          <w:lang w:val="hy-AM"/>
+        </w:rPr>
+        <w:t xml:space="preserve">արածականորեն ներկառուցված տիրույթներում դասական էվրիստիկաները ներառում են Էվկլիդեսյան հեռավորությունը (թերագնահատված է ճանապարհային ցանցերի համար) և Մանհեթենյան հեռավորությունը (օպտիմալ է ուղղանկյուն ցանցերի համար)։ Ավելի բարդ էվրիստիկաներ, ինչպիսիք են </w:t>
+      </w:r>
+      <w:r>
+        <w:rPr>
+          <w:rFonts w:ascii="GHEA Grapalat" w:hAnsi="GHEA Grapalat"/>
+          <w:lang w:val="hy-AM"/>
+        </w:rPr>
+        <w:t>Ա</w:t>
+      </w:r>
+      <w:r>
+        <w:rPr>
+          <w:rFonts w:ascii="GHEA Grapalat" w:hAnsi="GHEA Grapalat"/>
+          <w:lang w:val="hy-AM"/>
+        </w:rPr>
+        <w:t xml:space="preserve">*-Landmark-ը (նախապես հաշվարկված հեռավորություններ դեպի ընտրված ողորմակետային հանգույցներ) կամ օրինաչափությունների տվյալների բազաների էվրիստիկաները (ենթակառուցվածքների ճշգրիտ լուծումներ), կարող են հասնել h/c հարաբերակցության, որը գերազանցում է 0.9-ը՝ մնալով թույլատրելի։ Էվրիստիկաների նախագծումը ներառում է փոխզիջում </w:t>
+      </w:r>
+      <w:r>
+        <w:rPr>
+          <w:rFonts w:ascii="GHEA Grapalat" w:hAnsi="GHEA Grapalat"/>
+          <w:lang w:val="hy-AM"/>
+        </w:rPr>
+        <w:lastRenderedPageBreak/>
+        <w:t>նախնական մշակման ջանքերի և աշխատանքային ժամանակի ծախսերի միջև. k չափի ողորմակետերի բազմությունը ներմուծում է k · (|V|+|E|) նախնական մշակման աշխատանք, բայց կարող է նվազեցնել ընդլայնումները գործակցով, որը համեմատական է ողորմակետերի միջին մոտիկությանը նպատակին։</w:t>
+      </w:r>
+    </w:p>
+    <w:p>
+      <w:pPr>
+        <w:pStyle w:val="NormalWeb"/>
+        <w:rPr>
+          <w:rFonts w:ascii="GHEA Grapalat" w:hAnsi="GHEA Grapalat"/>
+          <w:lang w:val="hy-AM"/>
+        </w:rPr>
+      </w:pPr>
+      <w:r>
+        <w:rPr>
+          <w:rFonts w:ascii="GHEA Grapalat" w:hAnsi="GHEA Grapalat"/>
+          <w:lang w:val="hy-AM"/>
+        </w:rPr>
+        <w:t xml:space="preserve">Էվրիստիկ գնահատման հաշվողական բարդությունը ներառված է </w:t>
+      </w:r>
+      <w:r>
+        <w:rPr>
+          <w:rFonts w:ascii="GHEA Grapalat" w:hAnsi="GHEA Grapalat"/>
+          <w:lang w:val="hy-AM"/>
+        </w:rPr>
+        <w:t>Ա</w:t>
+      </w:r>
+      <w:r>
+        <w:rPr>
+          <w:rFonts w:ascii="GHEA Grapalat" w:hAnsi="GHEA Grapalat"/>
+          <w:lang w:val="hy-AM"/>
+        </w:rPr>
+        <w:t xml:space="preserve">*-ի մեկ հանգույցի ընդլայնման ծախսի մեջ։ Եթե h-ը թանկ է (օրինակ՝ ժամանակից կախված երթևեկության մոդելի գնահատում), ալգորիթմի արդյունավետ աշխատանքային ժամանակը կարող է մոտենալ </w:t>
+      </w:r>
+      <w:r>
+        <w:rPr>
+          <w:rFonts w:ascii="GHEA Grapalat" w:hAnsi="GHEA Grapalat"/>
+          <w:lang w:val="hy-AM"/>
+        </w:rPr>
+        <w:t>Դեյքստրային</w:t>
+      </w:r>
+      <w:r>
+        <w:rPr>
+          <w:rFonts w:ascii="GHEA Grapalat" w:hAnsi="GHEA Grapalat"/>
+          <w:lang w:val="hy-AM"/>
+        </w:rPr>
+        <w:t xml:space="preserve">՝ չնայած վերլուծականորեն բարենպաստ </w:t>
+      </w:r>
+      <w:r>
+        <w:rPr>
+          <w:rFonts w:ascii="GHEA Grapalat" w:hAnsi="GHEA Grapalat"/>
+          <w:lang w:val="hy-AM"/>
+        </w:rPr>
+        <w:t>ս</w:t>
+      </w:r>
+      <w:r>
+        <w:rPr>
+          <w:rFonts w:ascii="GHEA Grapalat" w:hAnsi="GHEA Grapalat"/>
+          <w:lang w:val="hy-AM"/>
+        </w:rPr>
+        <w:t>ահմանին։</w:t>
+      </w:r>
+    </w:p>
+    <w:p>
+      <w:pPr>
+        <w:pStyle w:val="NormalWeb"/>
+        <w:rPr>
+          <w:rFonts w:ascii="GHEA Grapalat" w:hAnsi="GHEA Grapalat"/>
+          <w:lang w:val="hy-AM"/>
+        </w:rPr>
+      </w:pPr>
+      <w:r>
+        <w:rPr>
+          <w:rFonts w:ascii="GHEA Grapalat" w:hAnsi="GHEA Grapalat"/>
+          <w:lang w:val="hy-AM"/>
+        </w:rPr>
+        <w:t>Կատարողունակության վերլուծություն</w:t>
+      </w:r>
+    </w:p>
+    <w:p>
+      <w:pPr>
+        <w:pStyle w:val="NormalWeb"/>
+        <w:rPr>
+          <w:rFonts w:ascii="GHEA Grapalat" w:hAnsi="GHEA Grapalat"/>
+          <w:lang w:val="hy-AM"/>
+        </w:rPr>
+      </w:pPr>
+    </w:p>
+    <w:p>
+      <w:pPr>
+        <w:pStyle w:val="NormalWeb"/>
+        <w:rPr>
+          <w:rFonts w:ascii="GHEA Grapalat" w:hAnsi="GHEA Grapalat"/>
+          <w:lang w:val="hy-AM"/>
+        </w:rPr>
+      </w:pPr>
+      <w:r>
+        <w:rPr>
+          <w:rFonts w:ascii="GHEA Grapalat" w:hAnsi="GHEA Grapalat"/>
+          <w:lang w:val="hy-AM"/>
+        </w:rPr>
+        <w:t xml:space="preserve">5.1 Ցանցային քարտեզներ Դիսկրետացված հարթ միջավայրերում ցանցային քարտեզները (օրինակ՝ 8-կապակցված կամ 4-կապակցված լատիցներ) ի սկզբանե նոսր են։ Մանհեթենյան էվրիստիկայով ավանդական </w:t>
+      </w:r>
+      <w:r>
+        <w:rPr>
+          <w:rFonts w:ascii="GHEA Grapalat" w:hAnsi="GHEA Grapalat"/>
+          <w:lang w:val="hy-AM"/>
+        </w:rPr>
+        <w:t>Ա</w:t>
+      </w:r>
+      <w:r>
+        <w:rPr>
+          <w:rFonts w:ascii="GHEA Grapalat" w:hAnsi="GHEA Grapalat"/>
+          <w:lang w:val="hy-AM"/>
+        </w:rPr>
+        <w:t xml:space="preserve">*-ն արագ զուգամիտում է օպտիմալ ճանապարհին, քանի որ էվրիստիկան ստորին սահման է հանդիսանում դեպի նպատակ Մանհեթենյան հեռավորության համար։ Պատահական խոչընդոտների էմպիրիկ ուսումնասիրությունները ցույց են տալիս, որ </w:t>
+      </w:r>
+      <w:r>
+        <w:rPr>
+          <w:rFonts w:ascii="GHEA Grapalat" w:hAnsi="GHEA Grapalat"/>
+          <w:lang w:val="hy-AM"/>
+        </w:rPr>
+        <w:t>Ա</w:t>
+      </w:r>
+      <w:r>
+        <w:rPr>
+          <w:rFonts w:ascii="GHEA Grapalat" w:hAnsi="GHEA Grapalat"/>
+          <w:lang w:val="hy-AM"/>
+        </w:rPr>
+        <w:t>*-</w:t>
+      </w:r>
+      <w:r>
+        <w:rPr>
+          <w:rFonts w:ascii="GHEA Grapalat" w:hAnsi="GHEA Grapalat"/>
+          <w:lang w:val="hy-AM"/>
+        </w:rPr>
+        <w:t>ը</w:t>
+      </w:r>
+      <w:r>
+        <w:rPr>
+          <w:rFonts w:ascii="GHEA Grapalat" w:hAnsi="GHEA Grapalat"/>
+          <w:lang w:val="hy-AM"/>
+        </w:rPr>
+        <w:t xml:space="preserve"> նվազեցնում է հանգույցների ընդլայնումները մինչև 70%՝ համեմատած </w:t>
+      </w:r>
+      <w:r>
+        <w:rPr>
+          <w:rFonts w:ascii="GHEA Grapalat" w:hAnsi="GHEA Grapalat"/>
+          <w:lang w:val="hy-AM"/>
+        </w:rPr>
+        <w:t>Դեյքստրայի</w:t>
+      </w:r>
+      <w:r>
+        <w:rPr>
+          <w:rFonts w:ascii="GHEA Grapalat" w:hAnsi="GHEA Grapalat"/>
+          <w:lang w:val="hy-AM"/>
+        </w:rPr>
+        <w:t>, երբ օգտագործվում են համաձայնեցված էվրիստիկաներ։ Ցանցային քարտեզների սահմանափակ ճյուղավորման գործակիցը ապահովում է կառավարելի հիշողության հետքեր, ինչը փակ բազմության չափը դարձնում է գծայինորեն համեմատական հետազոտված տարածաշրջանին։</w:t>
+      </w:r>
+    </w:p>
+    <w:p>
+      <w:pPr>
+        <w:pStyle w:val="NormalWeb"/>
+        <w:rPr>
+          <w:rFonts w:ascii="GHEA Grapalat" w:hAnsi="GHEA Grapalat"/>
+          <w:lang w:val="hy-AM"/>
+        </w:rPr>
+      </w:pPr>
+    </w:p>
+    <w:p>
+      <w:pPr>
+        <w:pStyle w:val="NormalWeb"/>
+        <w:rPr>
+          <w:rFonts w:ascii="GHEA Grapalat" w:hAnsi="GHEA Grapalat"/>
+          <w:lang w:val="hy-AM"/>
+        </w:rPr>
+      </w:pPr>
+    </w:p>
+    <w:p>
+      <w:pPr>
+        <w:pStyle w:val="NormalWeb"/>
+        <w:rPr>
+          <w:rFonts w:ascii="GHEA Grapalat" w:hAnsi="GHEA Grapalat"/>
+          <w:lang w:val="hy-AM"/>
+        </w:rPr>
+      </w:pPr>
+    </w:p>
+    <w:p>
+      <w:pPr>
+        <w:pStyle w:val="NormalWeb"/>
+        <w:rPr>
+          <w:rFonts w:ascii="GHEA Grapalat" w:hAnsi="GHEA Grapalat"/>
+          <w:lang w:val="hy-AM"/>
+        </w:rPr>
+      </w:pPr>
+    </w:p>
+    <w:p>
+      <w:pPr>
+        <w:pStyle w:val="NormalWeb"/>
+        <w:rPr>
+          <w:rFonts w:ascii="GHEA Grapalat" w:hAnsi="GHEA Grapalat"/>
+          <w:lang w:val="hy-AM"/>
+        </w:rPr>
+      </w:pPr>
+    </w:p>
+    <w:p>
+      <w:pPr>
+        <w:pStyle w:val="NormalWeb"/>
+        <w:rPr>
+          <w:rFonts w:ascii="GHEA Grapalat" w:hAnsi="GHEA Grapalat"/>
+          <w:lang w:val="hy-AM"/>
+        </w:rPr>
+      </w:pPr>
+    </w:p>
+    <w:p>
+      <w:pPr>
+        <w:pStyle w:val="NormalWeb"/>
+        <w:rPr>
+          <w:rFonts w:ascii="GHEA Grapalat" w:hAnsi="GHEA Grapalat"/>
+          <w:lang w:val="hy-AM"/>
+        </w:rPr>
+      </w:pPr>
+    </w:p>
+    <w:p>
+      <w:pPr>
+        <w:pStyle w:val="NormalWeb"/>
+        <w:rPr>
+          <w:rFonts w:ascii="GHEA Grapalat" w:hAnsi="GHEA Grapalat"/>
+          <w:lang w:val="hy-AM"/>
+        </w:rPr>
+      </w:pPr>
+    </w:p>
+    <w:p>
+      <w:pPr>
+        <w:pStyle w:val="NormalWeb"/>
+        <w:rPr>
+          <w:rFonts w:ascii="GHEA Grapalat" w:hAnsi="GHEA Grapalat"/>
+          <w:lang w:val="hy-AM"/>
+        </w:rPr>
+      </w:pPr>
+    </w:p>
+    <w:p>
+      <w:pPr>
+        <w:pStyle w:val="NormalWeb"/>
+        <w:rPr>
+          <w:rFonts w:ascii="GHEA Grapalat" w:hAnsi="GHEA Grapalat"/>
+          <w:lang w:val="hy-AM"/>
+        </w:rPr>
+      </w:pPr>
+      <w:r>
+        <w:rPr>
+          <w:rFonts w:ascii="GHEA Grapalat" w:hAnsi="GHEA Grapalat"/>
+          <w:lang w:val="hy-AM"/>
+        </w:rPr>
+        <w:lastRenderedPageBreak/>
+        <w:t>Առավելություններ և թերություններ</w:t>
+      </w:r>
+    </w:p>
+    <w:tbl>
+      <w:tblPr>
+        <w:tblW w:w="0" w:type="auto"/>
+        <w:tblCellSpacing w:w="15" w:type="dxa"/>
+        <w:tblBorders>
+          <w:top w:val="single" w:sz="2" w:space="0" w:color="E3E3E3"/>
+          <w:left w:val="single" w:sz="2" w:space="0" w:color="E3E3E3"/>
+          <w:bottom w:val="single" w:sz="2" w:space="0" w:color="E3E3E3"/>
+          <w:right w:val="single" w:sz="2" w:space="0" w:color="E3E3E3"/>
+        </w:tblBorders>
+        <w:tblCellMar>
+          <w:left w:w="0" w:type="dxa"/>
+          <w:right w:w="0" w:type="dxa"/>
+        </w:tblCellMar>
+        <w:tblLook w:val="04A0" w:firstRow="1" w:lastRow="0" w:firstColumn="1" w:lastColumn="0" w:noHBand="0" w:noVBand="1"/>
+      </w:tblPr>
+      <w:tblGrid>
+        <w:gridCol w:w="2642"/>
+        <w:gridCol w:w="3821"/>
+        <w:gridCol w:w="3513"/>
+      </w:tblGrid>
+      <w:tr>
+        <w:trPr>
+          <w:tblHeader/>
+          <w:tblCellSpacing w:w="15" w:type="dxa"/>
+        </w:trPr>
+        <w:tc>
+          <w:tcPr>
+            <w:tcW w:w="0" w:type="auto"/>
+            <w:tcBorders>
+              <w:top w:val="single" w:sz="2" w:space="0" w:color="E3E3E3"/>
+              <w:left w:val="single" w:sz="2" w:space="0" w:color="E3E3E3"/>
+              <w:bottom w:val="single" w:sz="4" w:space="0" w:color="2E2E33"/>
+              <w:right w:val="single" w:sz="4" w:space="0" w:color="2E2E33"/>
+            </w:tcBorders>
+            <w:shd w:val="clear" w:color="auto" w:fill="2E2E33"/>
+            <w:vAlign w:val="center"/>
+            <w:hideMark/>
+          </w:tcPr>
+          <w:p>
+            <w:pPr>
+              <w:pStyle w:val="NormalWeb"/>
+              <w:rPr>
+                <w:rFonts w:ascii="GHEA Grapalat" w:hAnsi="GHEA Grapalat"/>
+                <w:lang w:val="hy-AM"/>
+              </w:rPr>
+            </w:pPr>
+            <w:r>
+              <w:rPr>
+                <w:rFonts w:ascii="GHEA Grapalat" w:hAnsi="GHEA Grapalat"/>
+                <w:lang w:val="hy-AM"/>
+              </w:rPr>
+              <w:t>Ասպեկտ</w:t>
+            </w:r>
+          </w:p>
+        </w:tc>
+        <w:tc>
+          <w:tcPr>
+            <w:tcW w:w="0" w:type="auto"/>
+            <w:tcBorders>
+              <w:top w:val="single" w:sz="2" w:space="0" w:color="E3E3E3"/>
+              <w:left w:val="single" w:sz="2" w:space="0" w:color="E3E3E3"/>
+              <w:bottom w:val="single" w:sz="4" w:space="0" w:color="2E2E33"/>
+              <w:right w:val="single" w:sz="4" w:space="0" w:color="2E2E33"/>
+            </w:tcBorders>
+            <w:shd w:val="clear" w:color="auto" w:fill="2E2E33"/>
+            <w:vAlign w:val="center"/>
+            <w:hideMark/>
+          </w:tcPr>
+          <w:p>
+            <w:pPr>
+              <w:pStyle w:val="NormalWeb"/>
+              <w:rPr>
+                <w:rFonts w:ascii="GHEA Grapalat" w:hAnsi="GHEA Grapalat"/>
+                <w:lang w:val="hy-AM"/>
+              </w:rPr>
+            </w:pPr>
+            <w:r>
+              <w:rPr>
+                <w:rFonts w:ascii="GHEA Grapalat" w:hAnsi="GHEA Grapalat"/>
+                <w:lang w:val="hy-AM"/>
+              </w:rPr>
+              <w:t>Դեյքստրայ</w:t>
+            </w:r>
+            <w:r>
+              <w:rPr>
+                <w:rFonts w:ascii="GHEA Grapalat" w:hAnsi="GHEA Grapalat"/>
+                <w:lang w:val="hy-AM"/>
+              </w:rPr>
+              <w:t>ի ալգորիթմ</w:t>
+            </w:r>
+          </w:p>
+        </w:tc>
+        <w:tc>
+          <w:tcPr>
+            <w:tcW w:w="0" w:type="auto"/>
+            <w:tcBorders>
+              <w:top w:val="single" w:sz="2" w:space="0" w:color="E3E3E3"/>
+              <w:left w:val="single" w:sz="2" w:space="0" w:color="E3E3E3"/>
+              <w:bottom w:val="single" w:sz="4" w:space="0" w:color="2E2E33"/>
+              <w:right w:val="nil"/>
+            </w:tcBorders>
+            <w:shd w:val="clear" w:color="auto" w:fill="2E2E33"/>
+            <w:vAlign w:val="center"/>
+            <w:hideMark/>
+          </w:tcPr>
+          <w:p>
+            <w:pPr>
+              <w:pStyle w:val="NormalWeb"/>
+              <w:rPr>
+                <w:rFonts w:ascii="GHEA Grapalat" w:hAnsi="GHEA Grapalat"/>
+                <w:lang w:val="hy-AM"/>
+              </w:rPr>
+            </w:pPr>
+            <w:r>
+              <w:rPr>
+                <w:rFonts w:ascii="GHEA Grapalat" w:hAnsi="GHEA Grapalat"/>
+                <w:lang w:val="hy-AM"/>
+              </w:rPr>
+              <w:t>Ա</w:t>
+            </w:r>
+            <w:r>
+              <w:rPr>
+                <w:rFonts w:ascii="GHEA Grapalat" w:hAnsi="GHEA Grapalat"/>
+                <w:lang w:val="hy-AM"/>
+              </w:rPr>
+              <w:t>*</w:t>
+            </w:r>
+          </w:p>
+        </w:tc>
+      </w:tr>
+      <w:tr>
+        <w:trPr>
+          <w:tblCellSpacing w:w="15" w:type="dxa"/>
+        </w:trPr>
+        <w:tc>
+          <w:tcPr>
+            <w:tcW w:w="0" w:type="auto"/>
+            <w:tcBorders>
+              <w:top w:val="single" w:sz="2" w:space="0" w:color="E3E3E3"/>
+              <w:left w:val="single" w:sz="2" w:space="0" w:color="E3E3E3"/>
+              <w:bottom w:val="single" w:sz="4" w:space="0" w:color="2E2E33"/>
+              <w:right w:val="single" w:sz="4" w:space="0" w:color="2E2E33"/>
+            </w:tcBorders>
+            <w:vAlign w:val="center"/>
+            <w:hideMark/>
+          </w:tcPr>
+          <w:p>
+            <w:pPr>
+              <w:pStyle w:val="NormalWeb"/>
+              <w:rPr>
+                <w:rFonts w:ascii="GHEA Grapalat" w:hAnsi="GHEA Grapalat"/>
+                <w:lang w:val="hy-AM"/>
+              </w:rPr>
+            </w:pPr>
+            <w:r>
+              <w:rPr>
+                <w:rFonts w:ascii="GHEA Grapalat" w:hAnsi="GHEA Grapalat"/>
+                <w:lang w:val="hy-AM"/>
+              </w:rPr>
+              <w:t>Օպտիմալության երաշխիք</w:t>
+            </w:r>
+          </w:p>
+        </w:tc>
+        <w:tc>
+          <w:tcPr>
+            <w:tcW w:w="0" w:type="auto"/>
+            <w:tcBorders>
+              <w:top w:val="single" w:sz="2" w:space="0" w:color="E3E3E3"/>
+              <w:left w:val="single" w:sz="2" w:space="0" w:color="E3E3E3"/>
+              <w:bottom w:val="single" w:sz="4" w:space="0" w:color="2E2E33"/>
+              <w:right w:val="single" w:sz="4" w:space="0" w:color="2E2E33"/>
+            </w:tcBorders>
+            <w:vAlign w:val="center"/>
+            <w:hideMark/>
+          </w:tcPr>
+          <w:p>
+            <w:pPr>
+              <w:pStyle w:val="NormalWeb"/>
+              <w:rPr>
+                <w:rFonts w:ascii="GHEA Grapalat" w:hAnsi="GHEA Grapalat"/>
+                <w:lang w:val="hy-AM"/>
+              </w:rPr>
+            </w:pPr>
+            <w:r>
+              <w:rPr>
+                <w:rFonts w:ascii="GHEA Grapalat" w:hAnsi="GHEA Grapalat"/>
+                <w:lang w:val="hy-AM"/>
+              </w:rPr>
+              <w:t>Ապացուցելիորեն օպտիմալ ցանկացած ոչ բացասական ծախսերով գրաֆի համար. էվրիստիկ սահմանափակում չի պահանջվում։</w:t>
+            </w:r>
+          </w:p>
+        </w:tc>
+        <w:tc>
+          <w:tcPr>
+            <w:tcW w:w="0" w:type="auto"/>
+            <w:tcBorders>
+              <w:top w:val="single" w:sz="2" w:space="0" w:color="E3E3E3"/>
+              <w:left w:val="single" w:sz="2" w:space="0" w:color="E3E3E3"/>
+              <w:bottom w:val="single" w:sz="4" w:space="0" w:color="2E2E33"/>
+              <w:right w:val="nil"/>
+            </w:tcBorders>
+            <w:vAlign w:val="center"/>
+            <w:hideMark/>
+          </w:tcPr>
+          <w:p>
+            <w:pPr>
+              <w:pStyle w:val="NormalWeb"/>
+              <w:rPr>
+                <w:rFonts w:ascii="GHEA Grapalat" w:hAnsi="GHEA Grapalat"/>
+                <w:lang w:val="hy-AM"/>
+              </w:rPr>
+            </w:pPr>
+            <w:r>
+              <w:rPr>
+                <w:rFonts w:ascii="GHEA Grapalat" w:hAnsi="GHEA Grapalat"/>
+                <w:lang w:val="hy-AM"/>
+              </w:rPr>
+              <w:t>Օպտիմալ է միայն թույլատրելի և համաձայնեցված էվրիստիկաների դեպքում։</w:t>
+            </w:r>
+          </w:p>
+        </w:tc>
+      </w:tr>
+      <w:tr>
+        <w:trPr>
+          <w:tblCellSpacing w:w="15" w:type="dxa"/>
+        </w:trPr>
+        <w:tc>
+          <w:tcPr>
+            <w:tcW w:w="0" w:type="auto"/>
+            <w:tcBorders>
+              <w:top w:val="single" w:sz="2" w:space="0" w:color="E3E3E3"/>
+              <w:left w:val="single" w:sz="2" w:space="0" w:color="E3E3E3"/>
+              <w:bottom w:val="single" w:sz="4" w:space="0" w:color="2E2E33"/>
+              <w:right w:val="single" w:sz="4" w:space="0" w:color="2E2E33"/>
+            </w:tcBorders>
+            <w:vAlign w:val="center"/>
+            <w:hideMark/>
+          </w:tcPr>
+          <w:p>
+            <w:pPr>
+              <w:pStyle w:val="NormalWeb"/>
+              <w:rPr>
+                <w:rFonts w:ascii="GHEA Grapalat" w:hAnsi="GHEA Grapalat"/>
+                <w:lang w:val="hy-AM"/>
+              </w:rPr>
+            </w:pPr>
+            <w:r>
+              <w:rPr>
+                <w:rFonts w:ascii="GHEA Grapalat" w:hAnsi="GHEA Grapalat"/>
+                <w:lang w:val="hy-AM"/>
+              </w:rPr>
+              <w:t>Որոնման տարածության կրճատում</w:t>
+            </w:r>
+          </w:p>
+        </w:tc>
+        <w:tc>
+          <w:tcPr>
+            <w:tcW w:w="0" w:type="auto"/>
+            <w:tcBorders>
+              <w:top w:val="single" w:sz="2" w:space="0" w:color="E3E3E3"/>
+              <w:left w:val="single" w:sz="2" w:space="0" w:color="E3E3E3"/>
+              <w:bottom w:val="single" w:sz="4" w:space="0" w:color="2E2E33"/>
+              <w:right w:val="single" w:sz="4" w:space="0" w:color="2E2E33"/>
+            </w:tcBorders>
+            <w:vAlign w:val="center"/>
+            <w:hideMark/>
+          </w:tcPr>
+          <w:p>
+            <w:pPr>
+              <w:pStyle w:val="NormalWeb"/>
+              <w:rPr>
+                <w:rFonts w:ascii="GHEA Grapalat" w:hAnsi="GHEA Grapalat"/>
+                <w:lang w:val="hy-AM"/>
+              </w:rPr>
+            </w:pPr>
+            <w:r>
+              <w:rPr>
+                <w:rFonts w:ascii="GHEA Grapalat" w:hAnsi="GHEA Grapalat"/>
+                <w:lang w:val="hy-AM"/>
+              </w:rPr>
+              <w:t>Կախված է միայն կողերի ռելակսացիայից. ընդլայնում է աղբյուրից հասանելի բոլոր գագաթները՝ ճշգրիտ հեռավորության աճման կարգով։</w:t>
+            </w:r>
+          </w:p>
+        </w:tc>
+        <w:tc>
+          <w:tcPr>
+            <w:tcW w:w="0" w:type="auto"/>
+            <w:tcBorders>
+              <w:top w:val="single" w:sz="2" w:space="0" w:color="E3E3E3"/>
+              <w:left w:val="single" w:sz="2" w:space="0" w:color="E3E3E3"/>
+              <w:bottom w:val="single" w:sz="4" w:space="0" w:color="2E2E33"/>
+              <w:right w:val="nil"/>
+            </w:tcBorders>
+            <w:vAlign w:val="center"/>
+            <w:hideMark/>
+          </w:tcPr>
+          <w:p>
+            <w:pPr>
+              <w:pStyle w:val="NormalWeb"/>
+              <w:rPr>
+                <w:rFonts w:ascii="GHEA Grapalat" w:hAnsi="GHEA Grapalat"/>
+                <w:lang w:val="hy-AM"/>
+              </w:rPr>
+            </w:pPr>
+            <w:r>
+              <w:rPr>
+                <w:rFonts w:ascii="GHEA Grapalat" w:hAnsi="GHEA Grapalat"/>
+                <w:lang w:val="hy-AM"/>
+              </w:rPr>
+              <w:t>Էվրիստիկան ուղղորդում է ընդլայնումը. հնարավոր է ~70% կրճատում ցանցային քարտեզներում։</w:t>
+            </w:r>
+          </w:p>
+        </w:tc>
+      </w:tr>
+      <w:tr>
+        <w:trPr>
+          <w:tblCellSpacing w:w="15" w:type="dxa"/>
+        </w:trPr>
+        <w:tc>
+          <w:tcPr>
+            <w:tcW w:w="0" w:type="auto"/>
+            <w:tcBorders>
+              <w:top w:val="single" w:sz="2" w:space="0" w:color="E3E3E3"/>
+              <w:left w:val="single" w:sz="2" w:space="0" w:color="E3E3E3"/>
+              <w:bottom w:val="single" w:sz="4" w:space="0" w:color="2E2E33"/>
+              <w:right w:val="single" w:sz="4" w:space="0" w:color="2E2E33"/>
+            </w:tcBorders>
+            <w:vAlign w:val="center"/>
+            <w:hideMark/>
+          </w:tcPr>
+          <w:p>
+            <w:pPr>
+              <w:pStyle w:val="NormalWeb"/>
+              <w:rPr>
+                <w:rFonts w:ascii="GHEA Grapalat" w:hAnsi="GHEA Grapalat"/>
+                <w:lang w:val="hy-AM"/>
+              </w:rPr>
+            </w:pPr>
+            <w:r>
+              <w:rPr>
+                <w:rFonts w:ascii="GHEA Grapalat" w:hAnsi="GHEA Grapalat"/>
+                <w:lang w:val="hy-AM"/>
+              </w:rPr>
+              <w:t>Էվրիստիկ կախվածություն</w:t>
+            </w:r>
+          </w:p>
+        </w:tc>
+        <w:tc>
+          <w:tcPr>
+            <w:tcW w:w="0" w:type="auto"/>
+            <w:tcBorders>
+              <w:top w:val="single" w:sz="2" w:space="0" w:color="E3E3E3"/>
+              <w:left w:val="single" w:sz="2" w:space="0" w:color="E3E3E3"/>
+              <w:bottom w:val="single" w:sz="4" w:space="0" w:color="2E2E33"/>
+              <w:right w:val="single" w:sz="4" w:space="0" w:color="2E2E33"/>
+            </w:tcBorders>
+            <w:vAlign w:val="center"/>
+            <w:hideMark/>
+          </w:tcPr>
+          <w:p>
+            <w:pPr>
+              <w:pStyle w:val="NormalWeb"/>
+              <w:rPr>
+                <w:rFonts w:ascii="GHEA Grapalat" w:hAnsi="GHEA Grapalat"/>
+                <w:lang w:val="hy-AM"/>
+              </w:rPr>
+            </w:pPr>
+            <w:r>
+              <w:rPr>
+                <w:rFonts w:ascii="GHEA Grapalat" w:hAnsi="GHEA Grapalat"/>
+                <w:lang w:val="hy-AM"/>
+              </w:rPr>
+              <w:t>Անկախ. էվրիստիկան քիչ է կարևոր։</w:t>
+            </w:r>
+          </w:p>
+        </w:tc>
+        <w:tc>
+          <w:tcPr>
+            <w:tcW w:w="0" w:type="auto"/>
+            <w:tcBorders>
+              <w:top w:val="single" w:sz="2" w:space="0" w:color="E3E3E3"/>
+              <w:left w:val="single" w:sz="2" w:space="0" w:color="E3E3E3"/>
+              <w:bottom w:val="single" w:sz="4" w:space="0" w:color="2E2E33"/>
+              <w:right w:val="nil"/>
+            </w:tcBorders>
+            <w:vAlign w:val="center"/>
+            <w:hideMark/>
+          </w:tcPr>
+          <w:p>
+            <w:pPr>
+              <w:pStyle w:val="NormalWeb"/>
+              <w:rPr>
+                <w:rFonts w:ascii="GHEA Grapalat" w:hAnsi="GHEA Grapalat"/>
+                <w:lang w:val="hy-AM"/>
+              </w:rPr>
+            </w:pPr>
+            <w:r>
+              <w:rPr>
+                <w:rFonts w:ascii="GHEA Grapalat" w:hAnsi="GHEA Grapalat"/>
+                <w:lang w:val="hy-AM"/>
+              </w:rPr>
+              <w:t>Էվրիստիկայի որակը ուղղակիորեն ազդում է աշխատանքային ժամանակի և հիշողության օգտագործման վրա։</w:t>
+            </w:r>
+          </w:p>
+        </w:tc>
+      </w:tr>
+      <w:tr>
+        <w:trPr>
+          <w:tblCellSpacing w:w="15" w:type="dxa"/>
+        </w:trPr>
+        <w:tc>
+          <w:tcPr>
+            <w:tcW w:w="0" w:type="auto"/>
+            <w:tcBorders>
+              <w:top w:val="single" w:sz="2" w:space="0" w:color="E3E3E3"/>
+              <w:left w:val="single" w:sz="2" w:space="0" w:color="E3E3E3"/>
+              <w:bottom w:val="single" w:sz="4" w:space="0" w:color="2E2E33"/>
+              <w:right w:val="single" w:sz="4" w:space="0" w:color="2E2E33"/>
+            </w:tcBorders>
+            <w:vAlign w:val="center"/>
+            <w:hideMark/>
+          </w:tcPr>
+          <w:p>
+            <w:pPr>
+              <w:pStyle w:val="NormalWeb"/>
+              <w:rPr>
+                <w:rFonts w:ascii="GHEA Grapalat" w:hAnsi="GHEA Grapalat"/>
+                <w:lang w:val="hy-AM"/>
+              </w:rPr>
+            </w:pPr>
+            <w:r>
+              <w:rPr>
+                <w:rFonts w:ascii="GHEA Grapalat" w:hAnsi="GHEA Grapalat"/>
+                <w:lang w:val="hy-AM"/>
+              </w:rPr>
+              <w:t>Իրականացման պարզություն</w:t>
+            </w:r>
+          </w:p>
+        </w:tc>
+        <w:tc>
+          <w:tcPr>
+            <w:tcW w:w="0" w:type="auto"/>
+            <w:tcBorders>
+              <w:top w:val="single" w:sz="2" w:space="0" w:color="E3E3E3"/>
+              <w:left w:val="single" w:sz="2" w:space="0" w:color="E3E3E3"/>
+              <w:bottom w:val="single" w:sz="4" w:space="0" w:color="2E2E33"/>
+              <w:right w:val="single" w:sz="4" w:space="0" w:color="2E2E33"/>
+            </w:tcBorders>
+            <w:vAlign w:val="center"/>
+            <w:hideMark/>
+          </w:tcPr>
+          <w:p>
+            <w:pPr>
+              <w:pStyle w:val="NormalWeb"/>
+              <w:rPr>
+                <w:rFonts w:ascii="GHEA Grapalat" w:hAnsi="GHEA Grapalat"/>
+                <w:lang w:val="hy-AM"/>
+              </w:rPr>
+            </w:pPr>
+            <w:r>
+              <w:rPr>
+                <w:rFonts w:ascii="GHEA Grapalat" w:hAnsi="GHEA Grapalat"/>
+                <w:lang w:val="hy-AM"/>
+              </w:rPr>
+              <w:t>Նվազագույն կոդավորում. էվրիստիկայի ստացում չի պահանջվում։</w:t>
+            </w:r>
+          </w:p>
+        </w:tc>
+        <w:tc>
+          <w:tcPr>
+            <w:tcW w:w="0" w:type="auto"/>
+            <w:tcBorders>
+              <w:top w:val="single" w:sz="2" w:space="0" w:color="E3E3E3"/>
+              <w:left w:val="single" w:sz="2" w:space="0" w:color="E3E3E3"/>
+              <w:bottom w:val="single" w:sz="4" w:space="0" w:color="2E2E33"/>
+              <w:right w:val="nil"/>
+            </w:tcBorders>
+            <w:vAlign w:val="center"/>
+            <w:hideMark/>
+          </w:tcPr>
+          <w:p>
+            <w:pPr>
+              <w:pStyle w:val="NormalWeb"/>
+              <w:rPr>
+                <w:rFonts w:ascii="GHEA Grapalat" w:hAnsi="GHEA Grapalat"/>
+                <w:lang w:val="hy-AM"/>
+              </w:rPr>
+            </w:pPr>
+            <w:r>
+              <w:rPr>
+                <w:rFonts w:ascii="GHEA Grapalat" w:hAnsi="GHEA Grapalat"/>
+                <w:lang w:val="hy-AM"/>
+              </w:rPr>
+              <w:t>Պահանջում է զգույշ էվրիստիկ նախագծում՝ թույլատրելիություն և համաձայնեցվածություն պահպանելու համար։</w:t>
+            </w:r>
+          </w:p>
+        </w:tc>
+      </w:tr>
+      <w:tr>
+        <w:trPr>
+          <w:tblCellSpacing w:w="15" w:type="dxa"/>
+        </w:trPr>
+        <w:tc>
+          <w:tcPr>
+            <w:tcW w:w="0" w:type="auto"/>
+            <w:tcBorders>
+              <w:top w:val="single" w:sz="2" w:space="0" w:color="E3E3E3"/>
+              <w:left w:val="single" w:sz="2" w:space="0" w:color="E3E3E3"/>
+              <w:bottom w:val="single" w:sz="4" w:space="0" w:color="2E2E33"/>
+              <w:right w:val="single" w:sz="4" w:space="0" w:color="2E2E33"/>
+            </w:tcBorders>
+            <w:vAlign w:val="center"/>
+            <w:hideMark/>
+          </w:tcPr>
+          <w:p>
+            <w:pPr>
+              <w:pStyle w:val="NormalWeb"/>
+              <w:rPr>
+                <w:rFonts w:ascii="GHEA Grapalat" w:hAnsi="GHEA Grapalat"/>
+                <w:lang w:val="hy-AM"/>
+              </w:rPr>
+            </w:pPr>
+            <w:r>
+              <w:rPr>
+                <w:rFonts w:ascii="GHEA Grapalat" w:hAnsi="GHEA Grapalat"/>
+                <w:lang w:val="hy-AM"/>
+              </w:rPr>
+              <w:t>Կայունություն դինամիկ թարմացումների նկատմամբ</w:t>
+            </w:r>
+          </w:p>
+        </w:tc>
+        <w:tc>
+          <w:tcPr>
+            <w:tcW w:w="0" w:type="auto"/>
+            <w:tcBorders>
+              <w:top w:val="single" w:sz="2" w:space="0" w:color="E3E3E3"/>
+              <w:left w:val="single" w:sz="2" w:space="0" w:color="E3E3E3"/>
+              <w:bottom w:val="single" w:sz="4" w:space="0" w:color="2E2E33"/>
+              <w:right w:val="single" w:sz="4" w:space="0" w:color="2E2E33"/>
+            </w:tcBorders>
+            <w:vAlign w:val="center"/>
+            <w:hideMark/>
+          </w:tcPr>
+          <w:p>
+            <w:pPr>
+              <w:pStyle w:val="NormalWeb"/>
+              <w:rPr>
+                <w:rFonts w:ascii="GHEA Grapalat" w:hAnsi="GHEA Grapalat"/>
+                <w:lang w:val="hy-AM"/>
+              </w:rPr>
+            </w:pPr>
+            <w:r>
+              <w:rPr>
+                <w:rFonts w:ascii="GHEA Grapalat" w:hAnsi="GHEA Grapalat"/>
+                <w:lang w:val="hy-AM"/>
+              </w:rPr>
+              <w:t>Ինկրեմենտալ թարմացումները կարող են տեղավորվել պրիորիտետային հերթի մասնակի վերահաշվարկով. կախվածություն չկա գլոբալ էվրիստիկ վավերականությունից։</w:t>
+            </w:r>
+          </w:p>
+        </w:tc>
+        <w:tc>
+          <w:tcPr>
+            <w:tcW w:w="0" w:type="auto"/>
+            <w:tcBorders>
+              <w:top w:val="single" w:sz="2" w:space="0" w:color="E3E3E3"/>
+              <w:left w:val="single" w:sz="2" w:space="0" w:color="E3E3E3"/>
+              <w:bottom w:val="single" w:sz="4" w:space="0" w:color="2E2E33"/>
+              <w:right w:val="nil"/>
+            </w:tcBorders>
+            <w:vAlign w:val="center"/>
+            <w:hideMark/>
+          </w:tcPr>
+          <w:p>
+            <w:pPr>
+              <w:pStyle w:val="NormalWeb"/>
+              <w:rPr>
+                <w:rFonts w:ascii="GHEA Grapalat" w:hAnsi="GHEA Grapalat"/>
+                <w:lang w:val="hy-AM"/>
+              </w:rPr>
+            </w:pPr>
+            <w:r>
+              <w:rPr>
+                <w:rFonts w:ascii="GHEA Grapalat" w:hAnsi="GHEA Grapalat"/>
+                <w:lang w:val="hy-AM"/>
+              </w:rPr>
+              <w:t>Էվրիստիկայի վերահաշվարկը կարող է թանկ լինել արագ փոփոխվող ծախսերի մոդելների դեպքում։</w:t>
+            </w:r>
+          </w:p>
+        </w:tc>
+      </w:tr>
+      <w:tr>
+        <w:trPr>
+          <w:tblCellSpacing w:w="15" w:type="dxa"/>
+        </w:trPr>
+        <w:tc>
+          <w:tcPr>
+            <w:tcW w:w="0" w:type="auto"/>
+            <w:tcBorders>
+              <w:top w:val="single" w:sz="2" w:space="0" w:color="E3E3E3"/>
+              <w:left w:val="single" w:sz="2" w:space="0" w:color="E3E3E3"/>
+              <w:bottom w:val="nil"/>
+              <w:right w:val="single" w:sz="4" w:space="0" w:color="2E2E33"/>
+            </w:tcBorders>
+            <w:vAlign w:val="center"/>
+            <w:hideMark/>
+          </w:tcPr>
+          <w:p>
+            <w:pPr>
+              <w:pStyle w:val="NormalWeb"/>
+              <w:rPr>
+                <w:rFonts w:ascii="GHEA Grapalat" w:hAnsi="GHEA Grapalat"/>
+                <w:lang w:val="hy-AM"/>
+              </w:rPr>
+            </w:pPr>
+            <w:r>
+              <w:rPr>
+                <w:rFonts w:ascii="GHEA Grapalat" w:hAnsi="GHEA Grapalat"/>
+                <w:lang w:val="hy-AM"/>
+              </w:rPr>
+              <w:t>Մասշտաբայնություն խիտ միջավայրերում</w:t>
+            </w:r>
+          </w:p>
+        </w:tc>
+        <w:tc>
+          <w:tcPr>
+            <w:tcW w:w="0" w:type="auto"/>
+            <w:tcBorders>
+              <w:top w:val="single" w:sz="2" w:space="0" w:color="E3E3E3"/>
+              <w:left w:val="single" w:sz="2" w:space="0" w:color="E3E3E3"/>
+              <w:bottom w:val="nil"/>
+              <w:right w:val="single" w:sz="4" w:space="0" w:color="2E2E33"/>
+            </w:tcBorders>
+            <w:vAlign w:val="center"/>
+            <w:hideMark/>
+          </w:tcPr>
+          <w:p>
+            <w:pPr>
+              <w:pStyle w:val="NormalWeb"/>
+              <w:rPr>
+                <w:rFonts w:ascii="GHEA Grapalat" w:hAnsi="GHEA Grapalat"/>
+                <w:lang w:val="hy-AM"/>
+              </w:rPr>
+            </w:pPr>
+            <w:r>
+              <w:rPr>
+                <w:rFonts w:ascii="GHEA Grapalat" w:hAnsi="GHEA Grapalat"/>
+                <w:lang w:val="hy-AM"/>
+              </w:rPr>
+              <w:t>Հարևանության ցուցակի օգուտը գերակշռում է. սակայն քառակուսային վարքագիծ է առաջանում մատրիցային իրականացումներում։</w:t>
+            </w:r>
+          </w:p>
+        </w:tc>
+        <w:tc>
+          <w:tcPr>
+            <w:tcW w:w="0" w:type="auto"/>
+            <w:tcBorders>
+              <w:top w:val="single" w:sz="2" w:space="0" w:color="E3E3E3"/>
+              <w:left w:val="single" w:sz="2" w:space="0" w:color="E3E3E3"/>
+              <w:bottom w:val="nil"/>
+              <w:right w:val="nil"/>
+            </w:tcBorders>
+            <w:vAlign w:val="center"/>
+            <w:hideMark/>
+          </w:tcPr>
+          <w:p>
+            <w:pPr>
+              <w:pStyle w:val="NormalWeb"/>
+              <w:rPr>
+                <w:rFonts w:ascii="GHEA Grapalat" w:hAnsi="GHEA Grapalat"/>
+                <w:lang w:val="hy-AM"/>
+              </w:rPr>
+            </w:pPr>
+            <w:r>
+              <w:rPr>
+                <w:rFonts w:ascii="GHEA Grapalat" w:hAnsi="GHEA Grapalat"/>
+                <w:lang w:val="hy-AM"/>
+              </w:rPr>
+              <w:t>Սահմանափակված է խիտ հարևանության հետախուզմամբ. հիշողության սպառումը աճում է փակ բազմության հետ։</w:t>
+            </w:r>
+          </w:p>
+        </w:tc>
+      </w:tr>
+    </w:tbl>
+    <w:p>
+      <w:pPr>
+        <w:pStyle w:val="NormalWeb"/>
+        <w:rPr>
+          <w:rFonts w:ascii="GHEA Grapalat" w:hAnsi="GHEA Grapalat"/>
+          <w:lang w:val="hy-AM"/>
+        </w:rPr>
+      </w:pPr>
+    </w:p>
+    <w:p>
+      <w:pPr>
+        <w:pStyle w:val="NormalWeb"/>
+        <w:rPr>
+          <w:rFonts w:ascii="GHEA Grapalat" w:hAnsi="GHEA Grapalat"/>
+          <w:lang w:val="hy-AM"/>
+        </w:rPr>
+      </w:pPr>
+    </w:p>
+    <w:p>
+      <w:pPr>
+        <w:pStyle w:val="NormalWeb"/>
+        <w:rPr>
+          <w:rFonts w:ascii="GHEA Grapalat" w:hAnsi="GHEA Grapalat"/>
+          <w:lang w:val="hy-AM"/>
+        </w:rPr>
+      </w:pPr>
+    </w:p>
+    <w:p>
+      <w:pPr>
+        <w:pStyle w:val="NormalWeb"/>
+        <w:rPr>
+          <w:rFonts w:ascii="GHEA Grapalat" w:hAnsi="GHEA Grapalat"/>
+          <w:lang w:val="hy-AM"/>
+        </w:rPr>
+      </w:pPr>
+      <w:r>
+        <w:rPr>
+          <w:rFonts w:ascii="GHEA Grapalat" w:hAnsi="GHEA Grapalat"/>
+          <w:lang w:val="hy-AM"/>
+        </w:rPr>
+        <w:lastRenderedPageBreak/>
+        <w:t>Քննարկում</w:t>
+      </w:r>
+    </w:p>
+    <w:p>
+      <w:pPr>
+        <w:pStyle w:val="NormalWeb"/>
+        <w:rPr>
+          <w:rFonts w:ascii="GHEA Grapalat" w:hAnsi="GHEA Grapalat"/>
+          <w:lang w:val="hy-AM"/>
+        </w:rPr>
+      </w:pPr>
+      <w:r>
+        <w:rPr>
+          <w:rFonts w:ascii="GHEA Grapalat" w:hAnsi="GHEA Grapalat"/>
+          <w:lang w:val="hy-AM"/>
+        </w:rPr>
+        <w:t>Դեյքստրայի</w:t>
+      </w:r>
+      <w:r>
+        <w:rPr>
+          <w:rFonts w:ascii="GHEA Grapalat" w:hAnsi="GHEA Grapalat"/>
+          <w:lang w:val="hy-AM"/>
+        </w:rPr>
+        <w:t xml:space="preserve"> ալգորիթմը հարմար է այն տիրույթների համար, որտեղ կողերի ծախսերը կամ խիստ ոչ բացասական են, ստատիկ և հեշտությամբ քանակականացվող, ինչպիսիք են ցանցային երթուղևորման արձանագրությունները, որոնք կիրառում են ճանապարհային վեկտորի սեմանտիկա։ Դրա դետերմինիստական բնույթը հեշտացնում է ֆորմալ վերիֆիկացիան և նպաստում է ինկրեմենտալ թարմացման մեխանիզմների ներառմանը (օրինակ՝ կապի վիճակի թարմացումներ)։ </w:t>
+      </w:r>
+      <w:r>
+        <w:rPr>
+          <w:rFonts w:ascii="GHEA Grapalat" w:hAnsi="GHEA Grapalat"/>
+          <w:lang w:val="hy-AM"/>
+        </w:rPr>
+        <w:t>Սրան հակառակ</w:t>
+      </w:r>
+      <w:r>
+        <w:rPr>
+          <w:rFonts w:ascii="GHEA Grapalat" w:hAnsi="GHEA Grapalat"/>
+          <w:lang w:val="hy-AM"/>
+        </w:rPr>
+        <w:t xml:space="preserve">, </w:t>
+      </w:r>
+      <w:r>
+        <w:rPr>
+          <w:rFonts w:ascii="GHEA Grapalat" w:hAnsi="GHEA Grapalat"/>
+          <w:lang w:val="hy-AM"/>
+        </w:rPr>
+        <w:t>Ա</w:t>
+      </w:r>
+      <w:r>
+        <w:rPr>
+          <w:rFonts w:ascii="GHEA Grapalat" w:hAnsi="GHEA Grapalat"/>
+          <w:lang w:val="hy-AM"/>
+        </w:rPr>
+        <w:t>*-ն գերազանցում է տարածականորեն ներկառուցված պլանավորման խնդիրներում, որտեղ էվրիստիկ ինֆորմացիան կարող է նախապես հաշվարկվել աննշան ծախսերով։ Ալգորիթմի կախվածությունը էվրիստիկաներից, սակայն, ներմուծում է զգայունություն ծախսերի մոդելի ճշգրտության նկատմամբ. հետևաբար, կիրառական ինժեներները պետք է հավասարակշռեն էվրիստիկ բարդությունը թույլատրելիությունը խախտելու ռիսկի նկատմամբ։</w:t>
+      </w:r>
+    </w:p>
+    <w:p>
+      <w:pPr>
+        <w:pStyle w:val="NormalWeb"/>
+        <w:rPr>
+          <w:rFonts w:ascii="GHEA Grapalat" w:hAnsi="GHEA Grapalat"/>
+          <w:lang w:val="hy-AM"/>
+        </w:rPr>
+      </w:pPr>
+      <w:r>
+        <w:rPr>
+          <w:rFonts w:ascii="GHEA Grapalat" w:hAnsi="GHEA Grapalat"/>
+          <w:lang w:val="hy-AM"/>
+        </w:rPr>
+        <w:t>Գործնական կիրառություններ</w:t>
+      </w:r>
+    </w:p>
+    <w:p>
+      <w:pPr>
+        <w:pStyle w:val="NormalWeb"/>
+        <w:rPr>
+          <w:rFonts w:ascii="GHEA Grapalat" w:hAnsi="GHEA Grapalat"/>
+          <w:lang w:val="hy-AM"/>
+        </w:rPr>
+      </w:pPr>
+    </w:p>
+    <w:p>
+      <w:pPr>
+        <w:pStyle w:val="NormalWeb"/>
+        <w:rPr>
+          <w:rFonts w:ascii="GHEA Grapalat" w:hAnsi="GHEA Grapalat"/>
+          <w:lang w:val="hy-AM"/>
+        </w:rPr>
+      </w:pPr>
+      <w:r>
+        <w:rPr>
+          <w:rFonts w:ascii="GHEA Grapalat" w:hAnsi="GHEA Grapalat"/>
+          <w:lang w:val="hy-AM"/>
+        </w:rPr>
+        <w:t xml:space="preserve">7.1 Գլոբալ դիրքորոշման համակարգեր (GPS) GPS սարքերը կիրառում են </w:t>
+      </w:r>
+      <w:r>
+        <w:rPr>
+          <w:rFonts w:ascii="GHEA Grapalat" w:hAnsi="GHEA Grapalat"/>
+          <w:lang w:val="hy-AM"/>
+        </w:rPr>
+        <w:t>Ա</w:t>
+      </w:r>
+      <w:r>
+        <w:rPr>
+          <w:rFonts w:ascii="GHEA Grapalat" w:hAnsi="GHEA Grapalat"/>
+          <w:lang w:val="hy-AM"/>
+        </w:rPr>
+        <w:t xml:space="preserve">*՝ նախապես հաշվարկված h արժեքներով, որոնք հիմնված են լայնության/երկայնության հեռավորությունների վրա դեպի նշանակետ։ Էվրիստիկայի թույլատրելիությունը բխում է եռանկյունու անհավասարությունից. սակայն, ճանապարհային ցանցի աղավաղումը հանգեցնում է օպտիմիստական թերագնահատման։ Օպտիմալությունը պահպանելու համար էվրիստիկաները սահմանափակվում են կամ հատվում են նվազագույն ծախսի գնահատականով՝ ստացված թվային քարտեզների տվյալների բազաներից։ Գործնականում </w:t>
+      </w:r>
+      <w:r>
+        <w:rPr>
+          <w:rFonts w:ascii="GHEA Grapalat" w:hAnsi="GHEA Grapalat"/>
+          <w:lang w:val="hy-AM"/>
+        </w:rPr>
+        <w:t>Ա</w:t>
+      </w:r>
+      <w:r>
+        <w:rPr>
+          <w:rFonts w:ascii="GHEA Grapalat" w:hAnsi="GHEA Grapalat"/>
+          <w:lang w:val="hy-AM"/>
+        </w:rPr>
+        <w:t>*-ն ապահովում է իրական ժամանակի արձագանքում, քանի որ էվրիստիկան նեղացնում է որոնումը դեպի ամենախոստումնալից երթուղին շրջապատող միջանցք, նվազեցնելով քննարկվող թեկնածու հանգույցների թիվը տասնյակ հազարավորներից մինչև մի քանի հարյուր՝ մեկ նավարկային հարցման համար։</w:t>
+      </w:r>
+    </w:p>
+    <w:p>
+      <w:pPr>
+        <w:pStyle w:val="NormalWeb"/>
+        <w:rPr>
+          <w:rFonts w:ascii="GHEA Grapalat" w:hAnsi="GHEA Grapalat"/>
+          <w:lang w:val="hy-AM"/>
+        </w:rPr>
+      </w:pPr>
+      <w:r>
+        <w:rPr>
+          <w:rFonts w:ascii="GHEA Grapalat" w:hAnsi="GHEA Grapalat"/>
+          <w:lang w:val="hy-AM"/>
+        </w:rPr>
+        <w:t xml:space="preserve">7.2 Ռոբոտաշինության ճանապարհի պլանավորում Շարժական մանիպուլյատորները և ինքնավար գետնային տրանսպորտային միջոցները հաճախ գործում են դիսկրետացված ցանցային քարտեզների վրա, որտեղ հանգույցները ներկայացնում են զբաղվածության ցանցեր։ Համաձայնեցված Մանհեթենյան էվրիստիկաներով </w:t>
+      </w:r>
+      <w:r>
+        <w:rPr>
+          <w:rFonts w:ascii="GHEA Grapalat" w:hAnsi="GHEA Grapalat"/>
+          <w:lang w:val="hy-AM"/>
+        </w:rPr>
+        <w:t>Ա</w:t>
+      </w:r>
+      <w:r>
+        <w:rPr>
+          <w:rFonts w:ascii="GHEA Grapalat" w:hAnsi="GHEA Grapalat"/>
+          <w:lang w:val="hy-AM"/>
+        </w:rPr>
+        <w:t xml:space="preserve">*-ն լայնորեն կիրառվում է ստատիկ ճանապարհի պլանավորման համար։ Դինամիկ միջավայրերում </w:t>
+      </w:r>
+      <w:r>
+        <w:rPr>
+          <w:rFonts w:ascii="GHEA Grapalat" w:hAnsi="GHEA Grapalat"/>
+          <w:lang w:val="hy-AM"/>
+        </w:rPr>
+        <w:t>Դ</w:t>
+      </w:r>
+      <w:r>
+        <w:rPr>
+          <w:rFonts w:ascii="GHEA Grapalat" w:hAnsi="GHEA Grapalat"/>
+          <w:lang w:val="hy-AM"/>
+        </w:rPr>
+        <w:t xml:space="preserve">* կամ RTM (Realtime-Monte-Carlo) ընդլայնումները լրացնում են </w:t>
+      </w:r>
+      <w:r>
+        <w:rPr>
+          <w:rFonts w:ascii="GHEA Grapalat" w:hAnsi="GHEA Grapalat"/>
+          <w:lang w:val="hy-AM"/>
+        </w:rPr>
+        <w:t>Ա</w:t>
+      </w:r>
+      <w:r>
+        <w:rPr>
+          <w:rFonts w:ascii="GHEA Grapalat" w:hAnsi="GHEA Grapalat"/>
+          <w:lang w:val="hy-AM"/>
+        </w:rPr>
+        <w:t>*-ը՝ պահպանելով ինկրեմենտալ ծախսերի գնահատականներ, որոնք հաշվի են առնում անկանխատեսելիությունը, սակայն պահպանում են հիմնական էվրիստիկ առավելությունը։ Ցածր չափողականության միջավայրերի համար</w:t>
+      </w:r>
+      <w:r>
+        <w:rPr>
+          <w:rFonts w:ascii="GHEA Grapalat" w:hAnsi="GHEA Grapalat"/>
+          <w:lang w:val="hy-AM"/>
+        </w:rPr>
+        <w:t xml:space="preserve"> Ա</w:t>
+      </w:r>
+      <w:r>
+        <w:rPr>
+          <w:rFonts w:ascii="GHEA Grapalat" w:hAnsi="GHEA Grapalat"/>
+          <w:lang w:val="hy-AM"/>
+        </w:rPr>
+        <w:t>*-ն մնում է ընտրություն՝ իր ճշգրիտ օպտիմալության և տրիվիալ իրականացման շնորհիվ։</w:t>
+      </w:r>
+    </w:p>
+    <w:p>
+      <w:pPr>
+        <w:pStyle w:val="NormalWeb"/>
+        <w:rPr>
+          <w:rFonts w:ascii="GHEA Grapalat" w:hAnsi="GHEA Grapalat"/>
+          <w:lang w:val="hy-AM"/>
+        </w:rPr>
+      </w:pPr>
+      <w:r>
+        <w:rPr>
+          <w:rFonts w:ascii="GHEA Grapalat" w:hAnsi="GHEA Grapalat"/>
+          <w:lang w:val="hy-AM"/>
+        </w:rPr>
+        <w:lastRenderedPageBreak/>
+        <w:t xml:space="preserve">7.3 ԱԻ խաղերի մշակում Իրական ժամանակի ռազմավարական (RTS) խաղերը և բաց աշխարհի վիդեո խաղերը կիրառում են </w:t>
+      </w:r>
+      <w:r>
+        <w:rPr>
+          <w:rFonts w:ascii="GHEA Grapalat" w:hAnsi="GHEA Grapalat"/>
+          <w:lang w:val="hy-AM"/>
+        </w:rPr>
+        <w:t>Ա</w:t>
+      </w:r>
+      <w:r>
+        <w:rPr>
+          <w:rFonts w:ascii="GHEA Grapalat" w:hAnsi="GHEA Grapalat"/>
+          <w:lang w:val="hy-AM"/>
+        </w:rPr>
+        <w:t>* NPC</w:t>
+      </w:r>
+      <w:r>
+        <w:rPr>
+          <w:rFonts w:ascii="GHEA Grapalat" w:hAnsi="GHEA Grapalat"/>
+          <w:lang w:val="hy-AM"/>
+        </w:rPr>
+        <w:t xml:space="preserve">-ների </w:t>
+      </w:r>
+      <w:r>
+        <w:rPr>
+          <w:rFonts w:ascii="GHEA Grapalat" w:hAnsi="GHEA Grapalat"/>
+          <w:lang w:val="hy-AM"/>
+        </w:rPr>
+        <w:t xml:space="preserve">համար, հատկապես ճանապարհային ցանցերով քարտեզներում, որտեղ էվրիստիկ ճշգրտությունը մոտենում է խաղացողի սպասելիքներին։ Էվրիստիկ նախագծումը հաճախ ներառում է բազմաչափ մետրիկաներ (օրինակ՝ սպառնալիքի մակարդակ, ծածկույթի հեռավորություն)՝ ավելի բարձր կարգի ծախսային գործոնները մոդելավորելու համար։ Համաձայնեցվածությունը սովորաբար պարտադրվում է պոտենցիալ դաշտի մոտեցման միջոցով, որը էքստրապոլյացնում է նպատակային ուղղված պոտենցիալ արժեքները քարտեզի վրա։ </w:t>
+      </w:r>
+      <w:r>
+        <w:rPr>
+          <w:rFonts w:ascii="GHEA Grapalat" w:hAnsi="GHEA Grapalat"/>
+          <w:lang w:val="hy-AM"/>
+        </w:rPr>
+        <w:t>Դեյքստրան</w:t>
+      </w:r>
+      <w:r>
+        <w:rPr>
+          <w:rFonts w:ascii="GHEA Grapalat" w:hAnsi="GHEA Grapalat"/>
+          <w:lang w:val="hy-AM"/>
+        </w:rPr>
+        <w:t xml:space="preserve"> երբեմն կիրառվում է ստատիկ մակարդակներում ճանապարհների օֆլայն նախնական հաշվարկի համար, որտեղ իրական ժամանակի դինամիկայի բացակայությունը դարձնում է էվրիստիկ առավելությունը եզրային։</w:t>
+      </w:r>
+    </w:p>
+    <w:p>
+      <w:pPr>
+        <w:pStyle w:val="NormalWeb"/>
+        <w:rPr>
+          <w:rFonts w:ascii="GHEA Grapalat" w:hAnsi="GHEA Grapalat"/>
+          <w:lang w:val="hy-AM"/>
+        </w:rPr>
+      </w:pPr>
+    </w:p>
+    <w:p>
+      <w:pPr>
+        <w:pStyle w:val="NormalWeb"/>
+        <w:rPr>
+          <w:rFonts w:ascii="GHEA Grapalat" w:hAnsi="GHEA Grapalat"/>
+          <w:lang w:val="hy-AM"/>
+        </w:rPr>
+      </w:pPr>
+      <w:r>
+        <w:rPr>
+          <w:rFonts w:ascii="GHEA Grapalat" w:hAnsi="GHEA Grapalat"/>
+          <w:lang w:val="hy-AM"/>
+        </w:rPr>
+        <w:t>Իրականացման նկատառումներ</w:t>
+      </w:r>
+    </w:p>
+    <w:p>
+      <w:pPr>
+        <w:pStyle w:val="NormalWeb"/>
+        <w:rPr>
+          <w:rFonts w:ascii="GHEA Grapalat" w:hAnsi="GHEA Grapalat"/>
+          <w:lang w:val="hy-AM"/>
+        </w:rPr>
+      </w:pPr>
+    </w:p>
+    <w:p>
+      <w:pPr>
+        <w:pStyle w:val="NormalWeb"/>
+        <w:rPr>
+          <w:rFonts w:ascii="GHEA Grapalat" w:hAnsi="GHEA Grapalat"/>
+          <w:lang w:val="hy-AM"/>
+        </w:rPr>
+      </w:pPr>
+      <w:r>
+        <w:rPr>
+          <w:rFonts w:ascii="GHEA Grapalat" w:hAnsi="GHEA Grapalat"/>
+          <w:lang w:val="hy-AM"/>
+        </w:rPr>
+        <w:t xml:space="preserve">8.1 Հիշողության օգտագործում Հիշողության սպառման ամենանշանակալից գործոնը երկու ալգորիթմներում էլ փակ ցուցակն է։ </w:t>
+      </w:r>
+      <w:r>
+        <w:rPr>
+          <w:rFonts w:ascii="GHEA Grapalat" w:hAnsi="GHEA Grapalat"/>
+          <w:lang w:val="hy-AM"/>
+        </w:rPr>
+        <w:t>Ա</w:t>
+      </w:r>
+      <w:r>
+        <w:rPr>
+          <w:rFonts w:ascii="GHEA Grapalat" w:hAnsi="GHEA Grapalat"/>
+          <w:lang w:val="hy-AM"/>
+        </w:rPr>
+        <w:t xml:space="preserve">*-ում փակ ցուցակի չափը կորելացվում է հետազոտված ճակատի F-ի և էվրիստիկայի ուղղորդող ազդեցության հետ։ Կենտրոնացված </w:t>
+      </w:r>
+      <w:r>
+        <w:rPr>
+          <w:rFonts w:ascii="GHEA Grapalat" w:hAnsi="GHEA Grapalat"/>
+          <w:lang w:val="hy-AM"/>
+        </w:rPr>
+        <w:t>Ա</w:t>
+      </w:r>
+      <w:r>
+        <w:rPr>
+          <w:rFonts w:ascii="GHEA Grapalat" w:hAnsi="GHEA Grapalat"/>
+          <w:lang w:val="hy-AM"/>
+        </w:rPr>
+        <w:t>*-ի նման տեխնիկաները սահմանափակում են փակ բազմությունը M կարդինալության սահմանով, մերժելով այն հանգույցները, որոնց g արժեքները գերազանցում են դինամիկորեն պահպանվող τ շեմը։ Այս ռազմավարությունը փոխզիջում է օպտիմալության և մասշտաբայնության միջև խոշոր մասշտաբի ճանապարհի որոնման խնդիրներում, որտեղ գլոբալ օպտիմալ լուծումը խիստ պարտադիր չէ (օրինակ՝ ինքնավար դրոնների համար</w:t>
+      </w:r>
+      <w:r>
+        <w:rPr>
+          <w:rFonts w:ascii="GHEA Grapalat" w:hAnsi="GHEA Grapalat"/>
+          <w:lang w:val="hy-AM"/>
+        </w:rPr>
+        <w:t>՝</w:t>
+      </w:r>
+      <w:r>
+        <w:rPr>
+          <w:rFonts w:ascii="GHEA Grapalat" w:hAnsi="GHEA Grapalat"/>
+          <w:lang w:val="hy-AM"/>
+        </w:rPr>
+        <w:t xml:space="preserve"> ժամանակային կրիտիկական)։</w:t>
+      </w:r>
+    </w:p>
+    <w:p>
+      <w:pPr>
+        <w:pStyle w:val="NormalWeb"/>
+        <w:rPr>
+          <w:rFonts w:ascii="GHEA Grapalat" w:hAnsi="GHEA Grapalat"/>
+          <w:lang w:val="hy-AM"/>
+        </w:rPr>
+      </w:pPr>
+      <w:r>
+        <w:rPr>
+          <w:rFonts w:ascii="GHEA Grapalat" w:hAnsi="GHEA Grapalat"/>
+          <w:lang w:val="hy-AM"/>
+        </w:rPr>
+        <w:t xml:space="preserve">8.3 Էվրիստիկ նախագծում Երբ էվրիստիկաները երկրաչափական են, հանգույցի հաշվարկի ծախսը էապես հաստատուն է, ինչը հնարավորություն է տալիս իրական ժամանակի կատարողունակություն շարժական պլատֆորմներում։ Տիրույթային հատուկ էվրիստիկաների համար գնահատման ֆունկցիան կարող է մարժինալացվել ֆոնային թրեդի կամ միաձուլվել կողերի ռելակսացիայի քայլերին՝ մշակման ծախսերը միջինացնելու համար բազմաթիվ ընդլայնումների վրա։ Խիստ դինամիկ կարգավիճակներում (օրինակ՝ ինտերակտիվ խաղային ԱԻ) հիերարխիկ էվրիստիկ ճարտարապետությունները (ողորմակետեր </w:t>
+      </w:r>
+      <w:r>
+        <w:rPr>
+          <w:rFonts w:ascii="Courier New" w:hAnsi="Courier New" w:cs="Courier New"/>
+          <w:lang w:val="hy-AM"/>
+        </w:rPr>
+        <w:t>→</w:t>
+      </w:r>
+      <w:r>
+        <w:rPr>
+          <w:rFonts w:ascii="GHEA Grapalat" w:hAnsi="GHEA Grapalat"/>
+          <w:lang w:val="hy-AM"/>
+        </w:rPr>
+        <w:t xml:space="preserve"> մակրո-էվրիստիկաներ) հեշտացնում են ինկրեմենտալ թարմացումները՝ առանց սկզբից ամբողջական լուծումների վերահաշվարկման։</w:t>
+      </w:r>
+    </w:p>
+    <w:p>
+      <w:pPr>
+        <w:pStyle w:val="NormalWeb"/>
+        <w:rPr>
+          <w:rFonts w:ascii="GHEA Grapalat" w:hAnsi="GHEA Grapalat"/>
+          <w:lang w:val="hy-AM"/>
+        </w:rPr>
+      </w:pPr>
+      <w:r>
+        <w:rPr>
+          <w:rFonts w:ascii="GHEA Grapalat" w:hAnsi="GHEA Grapalat"/>
+          <w:lang w:val="hy-AM"/>
+        </w:rPr>
+        <w:t xml:space="preserve">8.4 Մասշտաբայնության խնդիրներ Մասշտաբայնության մարտահրավերները առաջանում են խիտ գրաֆերի ներկայացումների քառակուսային հիշողության պահանջներից և էվրիստիկայի սխալ օգտագործման էքսպոնենցիալ ընդլայնման </w:t>
+      </w:r>
+    </w:p>
+    <w:p>
+      <w:pPr>
+        <w:pStyle w:val="NormalWeb"/>
+        <w:rPr>
+          <w:rFonts w:ascii="GHEA Grapalat" w:hAnsi="GHEA Grapalat"/>
+          <w:lang w:val="hy-AM"/>
+        </w:rPr>
+      </w:pPr>
+      <w:r>
+        <w:rPr>
+          <w:rFonts w:ascii="GHEA Grapalat" w:hAnsi="GHEA Grapalat"/>
+          <w:lang w:val="hy-AM"/>
+        </w:rPr>
+        <w:lastRenderedPageBreak/>
+        <w:t>Էքսպերիմենտալ կամ տեսական կատարողունակության դիտարկումներ</w:t>
+      </w:r>
+    </w:p>
+    <w:p>
+      <w:pPr>
+        <w:pStyle w:val="NormalWeb"/>
+        <w:rPr>
+          <w:rFonts w:ascii="GHEA Grapalat" w:hAnsi="GHEA Grapalat"/>
+          <w:lang w:val="hy-AM"/>
+        </w:rPr>
+      </w:pPr>
+      <w:r>
+        <w:rPr>
+          <w:rFonts w:ascii="GHEA Grapalat" w:hAnsi="GHEA Grapalat"/>
+          <w:lang w:val="hy-AM"/>
+        </w:rPr>
+        <w:t xml:space="preserve">9.3 Զգայունությունը էվրիստիկայի որակի նկատմամբ Մոնտե-Կառլոյի սիմուլյացիաները ցույց են տալիս գրեթե գծային կապ էվրիստիկայի որակի և ընդլայնումների N թվի միջև։ Էմպիրիկորեն, N ≈ C·(1−h/c), որտեղ C-ն տիրույթային հատուկ հաստատուն է (~10⁴ տիպիկ ճանապարհային ցանցերի կարգավիճակներում)։ Այս կախվածությունը բխում է </w:t>
+      </w:r>
+      <w:r>
+        <w:rPr>
+          <w:rFonts w:ascii="GHEA Grapalat" w:hAnsi="GHEA Grapalat"/>
+          <w:lang w:val="hy-AM"/>
+        </w:rPr>
+        <w:t>Ա</w:t>
+      </w:r>
+      <w:r>
+        <w:rPr>
+          <w:rFonts w:ascii="GHEA Grapalat" w:hAnsi="GHEA Grapalat"/>
+          <w:lang w:val="hy-AM"/>
+        </w:rPr>
+        <w:t>*-ի օպտիմալության պայմանից, ըստ որի՝ դուրսբերման կարգը հարգում է իրական ճանապարհի ծախսի մոնոտոն աճը. ավելի ցածր f արժեքով յուրաքանչյուր հանգույց համապատասխանում է ճանապարհի ծախսի ավելի խիստ ստորին սահմանին. թերի ինֆորմացված էվրիստիկան ուռճացնում է այս սահմանը, ստիպելով ալգորիթմին հետախուզել ընդլայնումներ, որոնք հակառակ դեպքում կկրճատվեին։</w:t>
+      </w:r>
+    </w:p>
+    <w:p>
+      <w:pPr>
+        <w:pStyle w:val="NormalWeb"/>
+        <w:rPr>
+          <w:rFonts w:ascii="GHEA Grapalat" w:hAnsi="GHEA Grapalat"/>
+          <w:lang w:val="hy-AM"/>
+        </w:rPr>
+      </w:pPr>
+      <w:r>
+        <w:rPr>
+          <w:rFonts w:ascii="GHEA Grapalat" w:hAnsi="GHEA Grapalat"/>
+          <w:lang w:val="hy-AM"/>
+        </w:rPr>
+        <w:t xml:space="preserve">9.4 Իրական աշխարհի տեղակայման տվյալներ Արդյունաբերական GPS տելեմետրիան բացահայտում է, որ 5–10 վայրկյան ինկրեմենտալ թարմացման ինտերվալները (տիպիկ սպառողական սարքի հաճախականություն) կարող են բավարարվել </w:t>
+      </w:r>
+      <w:r>
+        <w:rPr>
+          <w:rFonts w:ascii="GHEA Grapalat" w:hAnsi="GHEA Grapalat"/>
+          <w:lang w:val="hy-AM"/>
+        </w:rPr>
+        <w:t>Ա</w:t>
+      </w:r>
+      <w:r>
+        <w:rPr>
+          <w:rFonts w:ascii="GHEA Grapalat" w:hAnsi="GHEA Grapalat"/>
+          <w:lang w:val="hy-AM"/>
+        </w:rPr>
+        <w:t xml:space="preserve">* իրականացումներով՝ Մանհեթենյան էվրիստիկայի ներքո՝ առանց ուշացումը խախտելու, մինչդեռ </w:t>
+      </w:r>
+      <w:r>
+        <w:rPr>
+          <w:rFonts w:ascii="GHEA Grapalat" w:hAnsi="GHEA Grapalat"/>
+          <w:lang w:val="hy-AM"/>
+        </w:rPr>
+        <w:t>Դեյքստրան</w:t>
+      </w:r>
+      <w:r>
+        <w:rPr>
+          <w:rFonts w:ascii="GHEA Grapalat" w:hAnsi="GHEA Grapalat"/>
+          <w:lang w:val="hy-AM"/>
+        </w:rPr>
+        <w:t xml:space="preserve"> ցուցադրում է հաշվարկային ժամանակի 2-ակի աճ 15 միլիոն գագաթները գերազանցող քարտեզի չափերի համար։ Այս դիտարկումները ընդգծում են էվրիստիկ ներառման պրագմատիկ համապատասխանությունը, նույնիսկ երբ թույլատրելիության սահմանափակումները թույլ են կիրառվում (օրինակ՝ օպտիմիստիկ առաստաղի ֆունկցիաների միջոցով)։</w:t>
+      </w:r>
+    </w:p>
+    <w:p>
+      <w:pPr>
+        <w:pStyle w:val="NormalWeb"/>
+        <w:rPr>
+          <w:rFonts w:ascii="GHEA Grapalat" w:hAnsi="GHEA Grapalat"/>
+          <w:lang w:val="hy-AM"/>
+        </w:rPr>
+      </w:pPr>
+      <w:r>
+        <w:rPr>
+          <w:rFonts w:ascii="GHEA Grapalat" w:hAnsi="GHEA Grapalat"/>
+          <w:lang w:val="hy-AM"/>
+        </w:rPr>
+        <w:t>Համեմատական գտածոների ամփոփում</w:t>
+      </w:r>
+    </w:p>
+    <w:tbl>
+      <w:tblPr>
+        <w:tblW w:w="0" w:type="auto"/>
+        <w:tblCellSpacing w:w="15" w:type="dxa"/>
+        <w:tblBorders>
+          <w:top w:val="single" w:sz="2" w:space="0" w:color="E3E3E3"/>
+          <w:left w:val="single" w:sz="2" w:space="0" w:color="E3E3E3"/>
+          <w:bottom w:val="single" w:sz="2" w:space="0" w:color="E3E3E3"/>
+          <w:right w:val="single" w:sz="2" w:space="0" w:color="E3E3E3"/>
+        </w:tblBorders>
+        <w:tblCellMar>
+          <w:left w:w="0" w:type="dxa"/>
+          <w:right w:w="0" w:type="dxa"/>
+        </w:tblCellMar>
+        <w:tblLook w:val="04A0" w:firstRow="1" w:lastRow="0" w:firstColumn="1" w:lastColumn="0" w:noHBand="0" w:noVBand="1"/>
+      </w:tblPr>
+      <w:tblGrid>
+        <w:gridCol w:w="2544"/>
+        <w:gridCol w:w="3550"/>
+        <w:gridCol w:w="3882"/>
+      </w:tblGrid>
+      <w:tr>
+        <w:trPr>
+          <w:tblHeader/>
+          <w:tblCellSpacing w:w="15" w:type="dxa"/>
+        </w:trPr>
+        <w:tc>
+          <w:tcPr>
+            <w:tcW w:w="0" w:type="auto"/>
+            <w:tcBorders>
+              <w:top w:val="single" w:sz="2" w:space="0" w:color="E3E3E3"/>
+              <w:left w:val="single" w:sz="2" w:space="0" w:color="E3E3E3"/>
+              <w:bottom w:val="single" w:sz="4" w:space="0" w:color="2E2E33"/>
+              <w:right w:val="single" w:sz="4" w:space="0" w:color="2E2E33"/>
+            </w:tcBorders>
+            <w:shd w:val="clear" w:color="auto" w:fill="2E2E33"/>
+            <w:vAlign w:val="center"/>
+            <w:hideMark/>
+          </w:tcPr>
+          <w:p>
+            <w:pPr>
+              <w:pStyle w:val="NormalWeb"/>
+              <w:rPr>
+                <w:rFonts w:ascii="GHEA Grapalat" w:hAnsi="GHEA Grapalat"/>
+                <w:lang w:val="hy-AM"/>
+              </w:rPr>
+            </w:pPr>
+            <w:r>
+              <w:rPr>
+                <w:rFonts w:ascii="GHEA Grapalat" w:hAnsi="GHEA Grapalat"/>
+                <w:lang w:val="hy-AM"/>
+              </w:rPr>
+              <w:t>Չափում</w:t>
+            </w:r>
+          </w:p>
+        </w:tc>
+        <w:tc>
+          <w:tcPr>
+            <w:tcW w:w="0" w:type="auto"/>
+            <w:tcBorders>
+              <w:top w:val="single" w:sz="2" w:space="0" w:color="E3E3E3"/>
+              <w:left w:val="single" w:sz="2" w:space="0" w:color="E3E3E3"/>
+              <w:bottom w:val="single" w:sz="4" w:space="0" w:color="2E2E33"/>
+              <w:right w:val="single" w:sz="4" w:space="0" w:color="2E2E33"/>
+            </w:tcBorders>
+            <w:shd w:val="clear" w:color="auto" w:fill="2E2E33"/>
+            <w:vAlign w:val="center"/>
+            <w:hideMark/>
+          </w:tcPr>
+          <w:p>
+            <w:pPr>
+              <w:pStyle w:val="NormalWeb"/>
+              <w:rPr>
+                <w:rFonts w:ascii="GHEA Grapalat" w:hAnsi="GHEA Grapalat"/>
+                <w:lang w:val="hy-AM"/>
+              </w:rPr>
+            </w:pPr>
+            <w:r>
+              <w:rPr>
+                <w:rFonts w:ascii="GHEA Grapalat" w:hAnsi="GHEA Grapalat"/>
+                <w:lang w:val="hy-AM"/>
+              </w:rPr>
+              <w:t xml:space="preserve">Նախընտրել </w:t>
+            </w:r>
+            <w:r>
+              <w:rPr>
+                <w:rFonts w:ascii="GHEA Grapalat" w:hAnsi="GHEA Grapalat"/>
+                <w:lang w:val="hy-AM"/>
+              </w:rPr>
+              <w:t>Դեյքստրայի</w:t>
+            </w:r>
+          </w:p>
+        </w:tc>
+        <w:tc>
+          <w:tcPr>
+            <w:tcW w:w="0" w:type="auto"/>
+            <w:tcBorders>
+              <w:top w:val="single" w:sz="2" w:space="0" w:color="E3E3E3"/>
+              <w:left w:val="single" w:sz="2" w:space="0" w:color="E3E3E3"/>
+              <w:bottom w:val="single" w:sz="4" w:space="0" w:color="2E2E33"/>
+              <w:right w:val="nil"/>
+            </w:tcBorders>
+            <w:shd w:val="clear" w:color="auto" w:fill="2E2E33"/>
+            <w:vAlign w:val="center"/>
+            <w:hideMark/>
+          </w:tcPr>
+          <w:p>
+            <w:pPr>
+              <w:pStyle w:val="NormalWeb"/>
+              <w:rPr>
+                <w:rFonts w:ascii="GHEA Grapalat" w:hAnsi="GHEA Grapalat"/>
+                <w:lang w:val="hy-AM"/>
+              </w:rPr>
+            </w:pPr>
+            <w:r>
+              <w:rPr>
+                <w:rFonts w:ascii="GHEA Grapalat" w:hAnsi="GHEA Grapalat"/>
+                <w:lang w:val="hy-AM"/>
+              </w:rPr>
+              <w:t xml:space="preserve">Նախընտրել </w:t>
+            </w:r>
+            <w:r>
+              <w:rPr>
+                <w:rFonts w:ascii="GHEA Grapalat" w:hAnsi="GHEA Grapalat"/>
+                <w:lang w:val="hy-AM"/>
+              </w:rPr>
+              <w:t>Ա*</w:t>
+            </w:r>
+          </w:p>
+        </w:tc>
+      </w:tr>
+      <w:tr>
+        <w:trPr>
+          <w:tblCellSpacing w:w="15" w:type="dxa"/>
+        </w:trPr>
+        <w:tc>
+          <w:tcPr>
+            <w:tcW w:w="0" w:type="auto"/>
+            <w:tcBorders>
+              <w:top w:val="single" w:sz="2" w:space="0" w:color="E3E3E3"/>
+              <w:left w:val="single" w:sz="2" w:space="0" w:color="E3E3E3"/>
+              <w:bottom w:val="single" w:sz="4" w:space="0" w:color="2E2E33"/>
+              <w:right w:val="single" w:sz="4" w:space="0" w:color="2E2E33"/>
+            </w:tcBorders>
+            <w:vAlign w:val="center"/>
+            <w:hideMark/>
+          </w:tcPr>
+          <w:p>
+            <w:pPr>
+              <w:pStyle w:val="NormalWeb"/>
+              <w:rPr>
+                <w:rFonts w:ascii="GHEA Grapalat" w:hAnsi="GHEA Grapalat"/>
+                <w:lang w:val="hy-AM"/>
+              </w:rPr>
+            </w:pPr>
+            <w:r>
+              <w:rPr>
+                <w:rFonts w:ascii="GHEA Grapalat" w:hAnsi="GHEA Grapalat"/>
+                <w:lang w:val="hy-AM"/>
+              </w:rPr>
+              <w:t>Թույլատրելիության պահանջ</w:t>
+            </w:r>
+          </w:p>
+        </w:tc>
+        <w:tc>
+          <w:tcPr>
+            <w:tcW w:w="0" w:type="auto"/>
+            <w:tcBorders>
+              <w:top w:val="single" w:sz="2" w:space="0" w:color="E3E3E3"/>
+              <w:left w:val="single" w:sz="2" w:space="0" w:color="E3E3E3"/>
+              <w:bottom w:val="single" w:sz="4" w:space="0" w:color="2E2E33"/>
+              <w:right w:val="single" w:sz="4" w:space="0" w:color="2E2E33"/>
+            </w:tcBorders>
+            <w:vAlign w:val="center"/>
+            <w:hideMark/>
+          </w:tcPr>
+          <w:p>
+            <w:pPr>
+              <w:pStyle w:val="NormalWeb"/>
+              <w:rPr>
+                <w:rFonts w:ascii="GHEA Grapalat" w:hAnsi="GHEA Grapalat"/>
+                <w:lang w:val="hy-AM"/>
+              </w:rPr>
+            </w:pPr>
+            <w:r>
+              <w:rPr>
+                <w:rFonts w:ascii="GHEA Grapalat" w:hAnsi="GHEA Grapalat"/>
+                <w:lang w:val="hy-AM"/>
+              </w:rPr>
+              <w:t>Ոչ մեկ (երաշխավորված է ոչ բացասական կողերի կշիռներով)</w:t>
+            </w:r>
+          </w:p>
+        </w:tc>
+        <w:tc>
+          <w:tcPr>
+            <w:tcW w:w="0" w:type="auto"/>
+            <w:tcBorders>
+              <w:top w:val="single" w:sz="2" w:space="0" w:color="E3E3E3"/>
+              <w:left w:val="single" w:sz="2" w:space="0" w:color="E3E3E3"/>
+              <w:bottom w:val="single" w:sz="4" w:space="0" w:color="2E2E33"/>
+              <w:right w:val="nil"/>
+            </w:tcBorders>
+            <w:vAlign w:val="center"/>
+            <w:hideMark/>
+          </w:tcPr>
+          <w:p>
+            <w:pPr>
+              <w:pStyle w:val="NormalWeb"/>
+              <w:rPr>
+                <w:rFonts w:ascii="GHEA Grapalat" w:hAnsi="GHEA Grapalat"/>
+                <w:lang w:val="hy-AM"/>
+              </w:rPr>
+            </w:pPr>
+            <w:r>
+              <w:rPr>
+                <w:rFonts w:ascii="GHEA Grapalat" w:hAnsi="GHEA Grapalat"/>
+                <w:lang w:val="hy-AM"/>
+              </w:rPr>
+              <w:t>Պարտադիր. էվրիստիկան երբեք չպետք է գերագնահատի իրական ծախսը</w:t>
+            </w:r>
+          </w:p>
+        </w:tc>
+      </w:tr>
+      <w:tr>
+        <w:trPr>
+          <w:tblCellSpacing w:w="15" w:type="dxa"/>
+        </w:trPr>
+        <w:tc>
+          <w:tcPr>
+            <w:tcW w:w="0" w:type="auto"/>
+            <w:tcBorders>
+              <w:top w:val="single" w:sz="2" w:space="0" w:color="E3E3E3"/>
+              <w:left w:val="single" w:sz="2" w:space="0" w:color="E3E3E3"/>
+              <w:bottom w:val="single" w:sz="4" w:space="0" w:color="2E2E33"/>
+              <w:right w:val="single" w:sz="4" w:space="0" w:color="2E2E33"/>
+            </w:tcBorders>
+            <w:vAlign w:val="center"/>
+            <w:hideMark/>
+          </w:tcPr>
+          <w:p>
+            <w:pPr>
+              <w:pStyle w:val="NormalWeb"/>
+              <w:rPr>
+                <w:rFonts w:ascii="GHEA Grapalat" w:hAnsi="GHEA Grapalat"/>
+                <w:lang w:val="hy-AM"/>
+              </w:rPr>
+            </w:pPr>
+            <w:r>
+              <w:rPr>
+                <w:rFonts w:ascii="GHEA Grapalat" w:hAnsi="GHEA Grapalat"/>
+                <w:lang w:val="hy-AM"/>
+              </w:rPr>
+              <w:t>Էվրիստիկ զգայունություն</w:t>
+            </w:r>
+          </w:p>
+        </w:tc>
+        <w:tc>
+          <w:tcPr>
+            <w:tcW w:w="0" w:type="auto"/>
+            <w:tcBorders>
+              <w:top w:val="single" w:sz="2" w:space="0" w:color="E3E3E3"/>
+              <w:left w:val="single" w:sz="2" w:space="0" w:color="E3E3E3"/>
+              <w:bottom w:val="single" w:sz="4" w:space="0" w:color="2E2E33"/>
+              <w:right w:val="single" w:sz="4" w:space="0" w:color="2E2E33"/>
+            </w:tcBorders>
+            <w:vAlign w:val="center"/>
+            <w:hideMark/>
+          </w:tcPr>
+          <w:p>
+            <w:pPr>
+              <w:pStyle w:val="NormalWeb"/>
+              <w:rPr>
+                <w:rFonts w:ascii="GHEA Grapalat" w:hAnsi="GHEA Grapalat"/>
+                <w:lang w:val="hy-AM"/>
+              </w:rPr>
+            </w:pPr>
+            <w:r>
+              <w:rPr>
+                <w:rFonts w:ascii="GHEA Grapalat" w:hAnsi="GHEA Grapalat"/>
+                <w:lang w:val="hy-AM"/>
+              </w:rPr>
+              <w:t>Անհամապատասխան</w:t>
+            </w:r>
+          </w:p>
+        </w:tc>
+        <w:tc>
+          <w:tcPr>
+            <w:tcW w:w="0" w:type="auto"/>
+            <w:tcBorders>
+              <w:top w:val="single" w:sz="2" w:space="0" w:color="E3E3E3"/>
+              <w:left w:val="single" w:sz="2" w:space="0" w:color="E3E3E3"/>
+              <w:bottom w:val="single" w:sz="4" w:space="0" w:color="2E2E33"/>
+              <w:right w:val="nil"/>
+            </w:tcBorders>
+            <w:vAlign w:val="center"/>
+            <w:hideMark/>
+          </w:tcPr>
+          <w:p>
+            <w:pPr>
+              <w:pStyle w:val="NormalWeb"/>
+              <w:rPr>
+                <w:rFonts w:ascii="GHEA Grapalat" w:hAnsi="GHEA Grapalat"/>
+                <w:lang w:val="hy-AM"/>
+              </w:rPr>
+            </w:pPr>
+            <w:r>
+              <w:rPr>
+                <w:rFonts w:ascii="GHEA Grapalat" w:hAnsi="GHEA Grapalat"/>
+                <w:lang w:val="hy-AM"/>
+              </w:rPr>
+              <w:t>Ուղղակի ազդեցություն ընդլայնման գործակցի և իրական ժամանակի կատարողունակության վրա</w:t>
+            </w:r>
+          </w:p>
+        </w:tc>
+      </w:tr>
+      <w:tr>
+        <w:trPr>
+          <w:tblCellSpacing w:w="15" w:type="dxa"/>
+        </w:trPr>
+        <w:tc>
+          <w:tcPr>
+            <w:tcW w:w="0" w:type="auto"/>
+            <w:tcBorders>
+              <w:top w:val="single" w:sz="2" w:space="0" w:color="E3E3E3"/>
+              <w:left w:val="single" w:sz="2" w:space="0" w:color="E3E3E3"/>
+              <w:bottom w:val="single" w:sz="4" w:space="0" w:color="2E2E33"/>
+              <w:right w:val="single" w:sz="4" w:space="0" w:color="2E2E33"/>
+            </w:tcBorders>
+            <w:vAlign w:val="center"/>
+            <w:hideMark/>
+          </w:tcPr>
+          <w:p>
+            <w:pPr>
+              <w:pStyle w:val="NormalWeb"/>
+              <w:rPr>
+                <w:rFonts w:ascii="GHEA Grapalat" w:hAnsi="GHEA Grapalat"/>
+                <w:lang w:val="hy-AM"/>
+              </w:rPr>
+            </w:pPr>
+            <w:r>
+              <w:rPr>
+                <w:rFonts w:ascii="GHEA Grapalat" w:hAnsi="GHEA Grapalat"/>
+                <w:lang w:val="hy-AM"/>
+              </w:rPr>
+              <w:t>Օպտիմալության երաշխիքներ</w:t>
+            </w:r>
+          </w:p>
+        </w:tc>
+        <w:tc>
+          <w:tcPr>
+            <w:tcW w:w="0" w:type="auto"/>
+            <w:tcBorders>
+              <w:top w:val="single" w:sz="2" w:space="0" w:color="E3E3E3"/>
+              <w:left w:val="single" w:sz="2" w:space="0" w:color="E3E3E3"/>
+              <w:bottom w:val="single" w:sz="4" w:space="0" w:color="2E2E33"/>
+              <w:right w:val="single" w:sz="4" w:space="0" w:color="2E2E33"/>
+            </w:tcBorders>
+            <w:vAlign w:val="center"/>
+            <w:hideMark/>
+          </w:tcPr>
+          <w:p>
+            <w:pPr>
+              <w:pStyle w:val="NormalWeb"/>
+              <w:rPr>
+                <w:rFonts w:ascii="GHEA Grapalat" w:hAnsi="GHEA Grapalat"/>
+                <w:lang w:val="hy-AM"/>
+              </w:rPr>
+            </w:pPr>
+            <w:r>
+              <w:rPr>
+                <w:rFonts w:ascii="GHEA Grapalat" w:hAnsi="GHEA Grapalat"/>
+                <w:lang w:val="hy-AM"/>
+              </w:rPr>
+              <w:t>Ունիվերսալ ցանկացած վերջավոր, կապակցված գրաֆի համար</w:t>
+            </w:r>
+          </w:p>
+        </w:tc>
+        <w:tc>
+          <w:tcPr>
+            <w:tcW w:w="0" w:type="auto"/>
+            <w:tcBorders>
+              <w:top w:val="single" w:sz="2" w:space="0" w:color="E3E3E3"/>
+              <w:left w:val="single" w:sz="2" w:space="0" w:color="E3E3E3"/>
+              <w:bottom w:val="single" w:sz="4" w:space="0" w:color="2E2E33"/>
+              <w:right w:val="nil"/>
+            </w:tcBorders>
+            <w:vAlign w:val="center"/>
+            <w:hideMark/>
+          </w:tcPr>
+          <w:p>
+            <w:pPr>
+              <w:pStyle w:val="NormalWeb"/>
+              <w:rPr>
+                <w:rFonts w:ascii="GHEA Grapalat" w:hAnsi="GHEA Grapalat"/>
+                <w:lang w:val="hy-AM"/>
+              </w:rPr>
+            </w:pPr>
+            <w:r>
+              <w:rPr>
+                <w:rFonts w:ascii="GHEA Grapalat" w:hAnsi="GHEA Grapalat"/>
+                <w:lang w:val="hy-AM"/>
+              </w:rPr>
+              <w:t>Կախված է թույլատրելի և համաձայնեցված էվրիստիկաներից</w:t>
+            </w:r>
+          </w:p>
+        </w:tc>
+      </w:tr>
+      <w:tr>
+        <w:trPr>
+          <w:tblCellSpacing w:w="15" w:type="dxa"/>
+        </w:trPr>
+        <w:tc>
+          <w:tcPr>
+            <w:tcW w:w="0" w:type="auto"/>
+            <w:tcBorders>
+              <w:top w:val="single" w:sz="2" w:space="0" w:color="E3E3E3"/>
+              <w:left w:val="single" w:sz="2" w:space="0" w:color="E3E3E3"/>
+              <w:bottom w:val="single" w:sz="4" w:space="0" w:color="2E2E33"/>
+              <w:right w:val="single" w:sz="4" w:space="0" w:color="2E2E33"/>
+            </w:tcBorders>
+            <w:vAlign w:val="center"/>
+            <w:hideMark/>
+          </w:tcPr>
+          <w:p>
+            <w:pPr>
+              <w:pStyle w:val="NormalWeb"/>
+              <w:rPr>
+                <w:rFonts w:ascii="GHEA Grapalat" w:hAnsi="GHEA Grapalat"/>
+                <w:lang w:val="hy-AM"/>
+              </w:rPr>
+            </w:pPr>
+            <w:r>
+              <w:rPr>
+                <w:rFonts w:ascii="GHEA Grapalat" w:hAnsi="GHEA Grapalat"/>
+                <w:lang w:val="hy-AM"/>
+              </w:rPr>
+              <w:t>Հիշողության հետք</w:t>
+            </w:r>
+          </w:p>
+        </w:tc>
+        <w:tc>
+          <w:tcPr>
+            <w:tcW w:w="0" w:type="auto"/>
+            <w:tcBorders>
+              <w:top w:val="single" w:sz="2" w:space="0" w:color="E3E3E3"/>
+              <w:left w:val="single" w:sz="2" w:space="0" w:color="E3E3E3"/>
+              <w:bottom w:val="single" w:sz="4" w:space="0" w:color="2E2E33"/>
+              <w:right w:val="single" w:sz="4" w:space="0" w:color="2E2E33"/>
+            </w:tcBorders>
+            <w:vAlign w:val="center"/>
+            <w:hideMark/>
+          </w:tcPr>
+          <w:p>
+            <w:pPr>
+              <w:pStyle w:val="NormalWeb"/>
+              <w:rPr>
+                <w:rFonts w:ascii="GHEA Grapalat" w:hAnsi="GHEA Grapalat"/>
+                <w:lang w:val="hy-AM"/>
+              </w:rPr>
+            </w:pPr>
+            <w:r>
+              <w:rPr>
+                <w:rFonts w:ascii="GHEA Grapalat" w:hAnsi="GHEA Grapalat"/>
+                <w:lang w:val="hy-AM"/>
+              </w:rPr>
+              <w:t>Կանխատեսելի գծային մասշտաբավորում (փակ ցուցակ ≈ այցելված գագաթներ)</w:t>
+            </w:r>
+          </w:p>
+        </w:tc>
+        <w:tc>
+          <w:tcPr>
+            <w:tcW w:w="0" w:type="auto"/>
+            <w:tcBorders>
+              <w:top w:val="single" w:sz="2" w:space="0" w:color="E3E3E3"/>
+              <w:left w:val="single" w:sz="2" w:space="0" w:color="E3E3E3"/>
+              <w:bottom w:val="single" w:sz="4" w:space="0" w:color="2E2E33"/>
+              <w:right w:val="nil"/>
+            </w:tcBorders>
+            <w:vAlign w:val="center"/>
+            <w:hideMark/>
+          </w:tcPr>
+          <w:p>
+            <w:pPr>
+              <w:pStyle w:val="NormalWeb"/>
+              <w:rPr>
+                <w:rFonts w:ascii="GHEA Grapalat" w:hAnsi="GHEA Grapalat"/>
+                <w:lang w:val="hy-AM"/>
+              </w:rPr>
+            </w:pPr>
+            <w:r>
+              <w:rPr>
+                <w:rFonts w:ascii="GHEA Grapalat" w:hAnsi="GHEA Grapalat"/>
+                <w:lang w:val="hy-AM"/>
+              </w:rPr>
+              <w:t>Պոտենցիալ ավելի մեծ փակ բազմություն. կարող է մեղմվել կենտրոնացման կամ սահմանափակ հիշողության ռազմավարություններով</w:t>
+            </w:r>
+          </w:p>
+        </w:tc>
+      </w:tr>
+      <w:tr>
+        <w:trPr>
+          <w:tblCellSpacing w:w="15" w:type="dxa"/>
+        </w:trPr>
+        <w:tc>
+          <w:tcPr>
+            <w:tcW w:w="0" w:type="auto"/>
+            <w:tcBorders>
+              <w:top w:val="single" w:sz="2" w:space="0" w:color="E3E3E3"/>
+              <w:left w:val="single" w:sz="2" w:space="0" w:color="E3E3E3"/>
+              <w:bottom w:val="single" w:sz="4" w:space="0" w:color="2E2E33"/>
+              <w:right w:val="single" w:sz="4" w:space="0" w:color="2E2E33"/>
+            </w:tcBorders>
+            <w:vAlign w:val="center"/>
+            <w:hideMark/>
+          </w:tcPr>
+          <w:p>
+            <w:pPr>
+              <w:pStyle w:val="NormalWeb"/>
+              <w:rPr>
+                <w:rFonts w:ascii="GHEA Grapalat" w:hAnsi="GHEA Grapalat"/>
+                <w:lang w:val="hy-AM"/>
+              </w:rPr>
+            </w:pPr>
+            <w:r>
+              <w:rPr>
+                <w:rFonts w:ascii="GHEA Grapalat" w:hAnsi="GHEA Grapalat"/>
+                <w:lang w:val="hy-AM"/>
+              </w:rPr>
+              <w:lastRenderedPageBreak/>
+              <w:t>Մասշտաբայնություն նոսր միջավայրերում</w:t>
+            </w:r>
+          </w:p>
+        </w:tc>
+        <w:tc>
+          <w:tcPr>
+            <w:tcW w:w="0" w:type="auto"/>
+            <w:tcBorders>
+              <w:top w:val="single" w:sz="2" w:space="0" w:color="E3E3E3"/>
+              <w:left w:val="single" w:sz="2" w:space="0" w:color="E3E3E3"/>
+              <w:bottom w:val="single" w:sz="4" w:space="0" w:color="2E2E33"/>
+              <w:right w:val="single" w:sz="4" w:space="0" w:color="2E2E33"/>
+            </w:tcBorders>
+            <w:vAlign w:val="center"/>
+            <w:hideMark/>
+          </w:tcPr>
+          <w:p>
+            <w:pPr>
+              <w:pStyle w:val="NormalWeb"/>
+              <w:rPr>
+                <w:rFonts w:ascii="GHEA Grapalat" w:hAnsi="GHEA Grapalat"/>
+                <w:lang w:val="hy-AM"/>
+              </w:rPr>
+            </w:pPr>
+            <w:r>
+              <w:rPr>
+                <w:rFonts w:ascii="GHEA Grapalat" w:hAnsi="GHEA Grapalat"/>
+                <w:lang w:val="hy-AM"/>
+              </w:rPr>
+              <w:t>Գերազանց. կողերի ռելակսացիան գերակշռում է աշխատանքային ժամանակում</w:t>
+            </w:r>
+          </w:p>
+        </w:tc>
+        <w:tc>
+          <w:tcPr>
+            <w:tcW w:w="0" w:type="auto"/>
+            <w:tcBorders>
+              <w:top w:val="single" w:sz="2" w:space="0" w:color="E3E3E3"/>
+              <w:left w:val="single" w:sz="2" w:space="0" w:color="E3E3E3"/>
+              <w:bottom w:val="single" w:sz="4" w:space="0" w:color="2E2E33"/>
+              <w:right w:val="nil"/>
+            </w:tcBorders>
+            <w:vAlign w:val="center"/>
+            <w:hideMark/>
+          </w:tcPr>
+          <w:p>
+            <w:pPr>
+              <w:pStyle w:val="NormalWeb"/>
+              <w:rPr>
+                <w:rFonts w:ascii="GHEA Grapalat" w:hAnsi="GHEA Grapalat"/>
+                <w:lang w:val="hy-AM"/>
+              </w:rPr>
+            </w:pPr>
+            <w:r>
+              <w:rPr>
+                <w:rFonts w:ascii="GHEA Grapalat" w:hAnsi="GHEA Grapalat"/>
+                <w:lang w:val="hy-AM"/>
+              </w:rPr>
+              <w:t>Գերազանց, քանի որ էվրիստիկան կրճատում է հետազոտված ճակատը</w:t>
+            </w:r>
+          </w:p>
+        </w:tc>
+      </w:tr>
+      <w:tr>
+        <w:trPr>
+          <w:tblCellSpacing w:w="15" w:type="dxa"/>
+        </w:trPr>
+        <w:tc>
+          <w:tcPr>
+            <w:tcW w:w="0" w:type="auto"/>
+            <w:tcBorders>
+              <w:top w:val="single" w:sz="2" w:space="0" w:color="E3E3E3"/>
+              <w:left w:val="single" w:sz="2" w:space="0" w:color="E3E3E3"/>
+              <w:bottom w:val="single" w:sz="4" w:space="0" w:color="2E2E33"/>
+              <w:right w:val="single" w:sz="4" w:space="0" w:color="2E2E33"/>
+            </w:tcBorders>
+            <w:vAlign w:val="center"/>
+            <w:hideMark/>
+          </w:tcPr>
+          <w:p>
+            <w:pPr>
+              <w:pStyle w:val="NormalWeb"/>
+              <w:rPr>
+                <w:rFonts w:ascii="GHEA Grapalat" w:hAnsi="GHEA Grapalat"/>
+                <w:lang w:val="hy-AM"/>
+              </w:rPr>
+            </w:pPr>
+            <w:r>
+              <w:rPr>
+                <w:rFonts w:ascii="GHEA Grapalat" w:hAnsi="GHEA Grapalat"/>
+                <w:lang w:val="hy-AM"/>
+              </w:rPr>
+              <w:t>Մասշտաբայնություն խիտ միջավայրերում</w:t>
+            </w:r>
+          </w:p>
+        </w:tc>
+        <w:tc>
+          <w:tcPr>
+            <w:tcW w:w="0" w:type="auto"/>
+            <w:tcBorders>
+              <w:top w:val="single" w:sz="2" w:space="0" w:color="E3E3E3"/>
+              <w:left w:val="single" w:sz="2" w:space="0" w:color="E3E3E3"/>
+              <w:bottom w:val="single" w:sz="4" w:space="0" w:color="2E2E33"/>
+              <w:right w:val="single" w:sz="4" w:space="0" w:color="2E2E33"/>
+            </w:tcBorders>
+            <w:vAlign w:val="center"/>
+            <w:hideMark/>
+          </w:tcPr>
+          <w:p>
+            <w:pPr>
+              <w:pStyle w:val="NormalWeb"/>
+              <w:rPr>
+                <w:rFonts w:ascii="GHEA Grapalat" w:hAnsi="GHEA Grapalat"/>
+                <w:lang w:val="hy-AM"/>
+              </w:rPr>
+            </w:pPr>
+            <w:r>
+              <w:rPr>
+                <w:rFonts w:ascii="GHEA Grapalat" w:hAnsi="GHEA Grapalat"/>
+                <w:lang w:val="hy-AM"/>
+              </w:rPr>
+              <w:t>Ընդունելի, երբ հարևանության ցուցակը գերակշռում է. քառակուսային վարքագիծ է առաջանում միայն մատրիցային ներկայացումների համար</w:t>
+            </w:r>
+          </w:p>
+        </w:tc>
+        <w:tc>
+          <w:tcPr>
+            <w:tcW w:w="0" w:type="auto"/>
+            <w:tcBorders>
+              <w:top w:val="single" w:sz="2" w:space="0" w:color="E3E3E3"/>
+              <w:left w:val="single" w:sz="2" w:space="0" w:color="E3E3E3"/>
+              <w:bottom w:val="single" w:sz="4" w:space="0" w:color="2E2E33"/>
+              <w:right w:val="nil"/>
+            </w:tcBorders>
+            <w:vAlign w:val="center"/>
+            <w:hideMark/>
+          </w:tcPr>
+          <w:p>
+            <w:pPr>
+              <w:pStyle w:val="NormalWeb"/>
+              <w:rPr>
+                <w:rFonts w:ascii="GHEA Grapalat" w:hAnsi="GHEA Grapalat"/>
+                <w:lang w:val="hy-AM"/>
+              </w:rPr>
+            </w:pPr>
+            <w:r>
+              <w:rPr>
+                <w:rFonts w:ascii="GHEA Grapalat" w:hAnsi="GHEA Grapalat"/>
+                <w:lang w:val="hy-AM"/>
+              </w:rPr>
+              <w:t>Սահմանափակված է խիտ հարևանության հետախուզմամբ. կատարողունակության առավելությունը թուլանում է, եթե էվրիստիկաները խիստ ճշգրիտ չեն</w:t>
+            </w:r>
+          </w:p>
+        </w:tc>
+      </w:tr>
+      <w:tr>
+        <w:trPr>
+          <w:tblCellSpacing w:w="15" w:type="dxa"/>
+        </w:trPr>
+        <w:tc>
+          <w:tcPr>
+            <w:tcW w:w="0" w:type="auto"/>
+            <w:tcBorders>
+              <w:top w:val="single" w:sz="2" w:space="0" w:color="E3E3E3"/>
+              <w:left w:val="single" w:sz="2" w:space="0" w:color="E3E3E3"/>
+              <w:bottom w:val="single" w:sz="4" w:space="0" w:color="2E2E33"/>
+              <w:right w:val="single" w:sz="4" w:space="0" w:color="2E2E33"/>
+            </w:tcBorders>
+            <w:vAlign w:val="center"/>
+            <w:hideMark/>
+          </w:tcPr>
+          <w:p>
+            <w:pPr>
+              <w:pStyle w:val="NormalWeb"/>
+              <w:rPr>
+                <w:rFonts w:ascii="GHEA Grapalat" w:hAnsi="GHEA Grapalat"/>
+                <w:lang w:val="hy-AM"/>
+              </w:rPr>
+            </w:pPr>
+            <w:r>
+              <w:rPr>
+                <w:rFonts w:ascii="GHEA Grapalat" w:hAnsi="GHEA Grapalat"/>
+                <w:lang w:val="hy-AM"/>
+              </w:rPr>
+              <w:t>Իրականացման պարզություն</w:t>
+            </w:r>
+          </w:p>
+        </w:tc>
+        <w:tc>
+          <w:tcPr>
+            <w:tcW w:w="0" w:type="auto"/>
+            <w:tcBorders>
+              <w:top w:val="single" w:sz="2" w:space="0" w:color="E3E3E3"/>
+              <w:left w:val="single" w:sz="2" w:space="0" w:color="E3E3E3"/>
+              <w:bottom w:val="single" w:sz="4" w:space="0" w:color="2E2E33"/>
+              <w:right w:val="single" w:sz="4" w:space="0" w:color="2E2E33"/>
+            </w:tcBorders>
+            <w:vAlign w:val="center"/>
+            <w:hideMark/>
+          </w:tcPr>
+          <w:p>
+            <w:pPr>
+              <w:pStyle w:val="NormalWeb"/>
+              <w:rPr>
+                <w:rFonts w:ascii="GHEA Grapalat" w:hAnsi="GHEA Grapalat"/>
+                <w:lang w:val="hy-AM"/>
+              </w:rPr>
+            </w:pPr>
+            <w:r>
+              <w:rPr>
+                <w:rFonts w:ascii="GHEA Grapalat" w:hAnsi="GHEA Grapalat"/>
+                <w:lang w:val="hy-AM"/>
+              </w:rPr>
+              <w:t>Նվազագույն. էվրիստիկայի ստացում չի պահանջվում</w:t>
+            </w:r>
+          </w:p>
+        </w:tc>
+        <w:tc>
+          <w:tcPr>
+            <w:tcW w:w="0" w:type="auto"/>
+            <w:tcBorders>
+              <w:top w:val="single" w:sz="2" w:space="0" w:color="E3E3E3"/>
+              <w:left w:val="single" w:sz="2" w:space="0" w:color="E3E3E3"/>
+              <w:bottom w:val="single" w:sz="4" w:space="0" w:color="2E2E33"/>
+              <w:right w:val="nil"/>
+            </w:tcBorders>
+            <w:vAlign w:val="center"/>
+            <w:hideMark/>
+          </w:tcPr>
+          <w:p>
+            <w:pPr>
+              <w:pStyle w:val="NormalWeb"/>
+              <w:rPr>
+                <w:rFonts w:ascii="GHEA Grapalat" w:hAnsi="GHEA Grapalat"/>
+                <w:lang w:val="hy-AM"/>
+              </w:rPr>
+            </w:pPr>
+            <w:r>
+              <w:rPr>
+                <w:rFonts w:ascii="GHEA Grapalat" w:hAnsi="GHEA Grapalat"/>
+                <w:lang w:val="hy-AM"/>
+              </w:rPr>
+              <w:t>Պահանջում է զգույշ էվրիստիկ ինժեներինգ՝ օպտիմալությունը պահպանելու համար</w:t>
+            </w:r>
+          </w:p>
+        </w:tc>
+      </w:tr>
+      <w:tr>
+        <w:trPr>
+          <w:tblCellSpacing w:w="15" w:type="dxa"/>
+        </w:trPr>
+        <w:tc>
+          <w:tcPr>
+            <w:tcW w:w="0" w:type="auto"/>
+            <w:tcBorders>
+              <w:top w:val="single" w:sz="2" w:space="0" w:color="E3E3E3"/>
+              <w:left w:val="single" w:sz="2" w:space="0" w:color="E3E3E3"/>
+              <w:bottom w:val="single" w:sz="4" w:space="0" w:color="2E2E33"/>
+              <w:right w:val="single" w:sz="4" w:space="0" w:color="2E2E33"/>
+            </w:tcBorders>
+            <w:vAlign w:val="center"/>
+            <w:hideMark/>
+          </w:tcPr>
+          <w:p>
+            <w:pPr>
+              <w:pStyle w:val="NormalWeb"/>
+              <w:rPr>
+                <w:rFonts w:ascii="GHEA Grapalat" w:hAnsi="GHEA Grapalat"/>
+                <w:lang w:val="hy-AM"/>
+              </w:rPr>
+            </w:pPr>
+            <w:r>
+              <w:rPr>
+                <w:rFonts w:ascii="GHEA Grapalat" w:hAnsi="GHEA Grapalat"/>
+                <w:lang w:val="hy-AM"/>
+              </w:rPr>
+              <w:t>Դինամիկ միջավայրեր</w:t>
+            </w:r>
+          </w:p>
+        </w:tc>
+        <w:tc>
+          <w:tcPr>
+            <w:tcW w:w="0" w:type="auto"/>
+            <w:tcBorders>
+              <w:top w:val="single" w:sz="2" w:space="0" w:color="E3E3E3"/>
+              <w:left w:val="single" w:sz="2" w:space="0" w:color="E3E3E3"/>
+              <w:bottom w:val="single" w:sz="4" w:space="0" w:color="2E2E33"/>
+              <w:right w:val="single" w:sz="4" w:space="0" w:color="2E2E33"/>
+            </w:tcBorders>
+            <w:vAlign w:val="center"/>
+            <w:hideMark/>
+          </w:tcPr>
+          <w:p>
+            <w:pPr>
+              <w:pStyle w:val="NormalWeb"/>
+              <w:rPr>
+                <w:rFonts w:ascii="GHEA Grapalat" w:hAnsi="GHEA Grapalat"/>
+                <w:lang w:val="hy-AM"/>
+              </w:rPr>
+            </w:pPr>
+            <w:r>
+              <w:rPr>
+                <w:rFonts w:ascii="GHEA Grapalat" w:hAnsi="GHEA Grapalat"/>
+                <w:lang w:val="hy-AM"/>
+              </w:rPr>
+              <w:t>Ավելի հարմար, երբ ծախսերի գնահատականները անկանխատեսելիորեն զարգանում են (կախվածություն չկա ստատիկ էվրիստիկաներից)</w:t>
+            </w:r>
+          </w:p>
+        </w:tc>
+        <w:tc>
+          <w:tcPr>
+            <w:tcW w:w="0" w:type="auto"/>
+            <w:tcBorders>
+              <w:top w:val="single" w:sz="2" w:space="0" w:color="E3E3E3"/>
+              <w:left w:val="single" w:sz="2" w:space="0" w:color="E3E3E3"/>
+              <w:bottom w:val="single" w:sz="4" w:space="0" w:color="2E2E33"/>
+              <w:right w:val="nil"/>
+            </w:tcBorders>
+            <w:vAlign w:val="center"/>
+            <w:hideMark/>
+          </w:tcPr>
+          <w:p>
+            <w:pPr>
+              <w:pStyle w:val="NormalWeb"/>
+              <w:rPr>
+                <w:rFonts w:ascii="GHEA Grapalat" w:hAnsi="GHEA Grapalat"/>
+                <w:lang w:val="hy-AM"/>
+              </w:rPr>
+            </w:pPr>
+            <w:r>
+              <w:rPr>
+                <w:rFonts w:ascii="GHEA Grapalat" w:hAnsi="GHEA Grapalat"/>
+                <w:lang w:val="hy-AM"/>
+              </w:rPr>
+              <w:t>Ադապտիվ էվրիստիկաները (ողորմակետեր, պոտենցիալ դաշտեր) կարող են պահպանել օպտիմալությունը, եթե ծախսերի թարմացումները սահմանափակված են</w:t>
+            </w:r>
+          </w:p>
+        </w:tc>
+      </w:tr>
+      <w:tr>
+        <w:trPr>
+          <w:tblCellSpacing w:w="15" w:type="dxa"/>
+        </w:trPr>
+        <w:tc>
+          <w:tcPr>
+            <w:tcW w:w="0" w:type="auto"/>
+            <w:tcBorders>
+              <w:top w:val="single" w:sz="2" w:space="0" w:color="E3E3E3"/>
+              <w:left w:val="single" w:sz="2" w:space="0" w:color="E3E3E3"/>
+              <w:bottom w:val="nil"/>
+              <w:right w:val="single" w:sz="4" w:space="0" w:color="2E2E33"/>
+            </w:tcBorders>
+            <w:vAlign w:val="center"/>
+            <w:hideMark/>
+          </w:tcPr>
+          <w:p>
+            <w:pPr>
+              <w:pStyle w:val="NormalWeb"/>
+              <w:rPr>
+                <w:rFonts w:ascii="GHEA Grapalat" w:hAnsi="GHEA Grapalat"/>
+                <w:lang w:val="hy-AM"/>
+              </w:rPr>
+            </w:pPr>
+            <w:r>
+              <w:rPr>
+                <w:rFonts w:ascii="GHEA Grapalat" w:hAnsi="GHEA Grapalat"/>
+                <w:lang w:val="hy-AM"/>
+              </w:rPr>
+              <w:t>Կիրառական տիրույթներ</w:t>
+            </w:r>
+          </w:p>
+        </w:tc>
+        <w:tc>
+          <w:tcPr>
+            <w:tcW w:w="0" w:type="auto"/>
+            <w:tcBorders>
+              <w:top w:val="single" w:sz="2" w:space="0" w:color="E3E3E3"/>
+              <w:left w:val="single" w:sz="2" w:space="0" w:color="E3E3E3"/>
+              <w:bottom w:val="nil"/>
+              <w:right w:val="single" w:sz="4" w:space="0" w:color="2E2E33"/>
+            </w:tcBorders>
+            <w:vAlign w:val="center"/>
+            <w:hideMark/>
+          </w:tcPr>
+          <w:p>
+            <w:pPr>
+              <w:pStyle w:val="NormalWeb"/>
+              <w:rPr>
+                <w:rFonts w:ascii="GHEA Grapalat" w:hAnsi="GHEA Grapalat"/>
+                <w:lang w:val="hy-AM"/>
+              </w:rPr>
+            </w:pPr>
+            <w:r>
+              <w:rPr>
+                <w:rFonts w:ascii="GHEA Grapalat" w:hAnsi="GHEA Grapalat"/>
+                <w:lang w:val="hy-AM"/>
+              </w:rPr>
+              <w:t>Ցանցային երթուղևորում, փաթեթների փոխանցում, կապի վիճակի արձանագրություններ</w:t>
+            </w:r>
+          </w:p>
+        </w:tc>
+        <w:tc>
+          <w:tcPr>
+            <w:tcW w:w="0" w:type="auto"/>
+            <w:tcBorders>
+              <w:top w:val="single" w:sz="2" w:space="0" w:color="E3E3E3"/>
+              <w:left w:val="single" w:sz="2" w:space="0" w:color="E3E3E3"/>
+              <w:bottom w:val="nil"/>
+              <w:right w:val="nil"/>
+            </w:tcBorders>
+            <w:vAlign w:val="center"/>
+            <w:hideMark/>
+          </w:tcPr>
+          <w:p>
+            <w:pPr>
+              <w:pStyle w:val="NormalWeb"/>
+              <w:rPr>
+                <w:rFonts w:ascii="GHEA Grapalat" w:hAnsi="GHEA Grapalat"/>
+                <w:lang w:val="hy-AM"/>
+              </w:rPr>
+            </w:pPr>
+            <w:r>
+              <w:rPr>
+                <w:rFonts w:ascii="GHEA Grapalat" w:hAnsi="GHEA Grapalat"/>
+                <w:lang w:val="hy-AM"/>
+              </w:rPr>
+              <w:t>Տարածական պլանավորում, ռոբոտաշինության նավարկություն, ԱԻ խաղային ԱԻ, խոշոր մասշտաբի լոգիստիկա</w:t>
+            </w:r>
+          </w:p>
+        </w:tc>
+      </w:tr>
+    </w:tbl>
+    <w:p>
+      <w:pPr>
+        <w:pStyle w:val="NormalWeb"/>
+        <w:rPr>
+          <w:rFonts w:ascii="GHEA Grapalat" w:hAnsi="GHEA Grapalat"/>
+          <w:lang w:val="hy-AM"/>
+        </w:rPr>
+      </w:pPr>
+      <w:r>
+        <w:rPr>
+          <w:rFonts w:ascii="GHEA Grapalat" w:hAnsi="GHEA Grapalat"/>
+          <w:lang w:val="hy-AM"/>
+        </w:rPr>
+        <w:t>Դեյքստրայի</w:t>
+      </w:r>
+      <w:r>
+        <w:rPr>
+          <w:rFonts w:ascii="GHEA Grapalat" w:hAnsi="GHEA Grapalat"/>
+          <w:lang w:val="hy-AM"/>
+        </w:rPr>
+        <w:t xml:space="preserve"> օպտիմալության պայմաններ</w:t>
+      </w:r>
+    </w:p>
+    <w:p>
+      <w:pPr>
+        <w:pStyle w:val="NormalWeb"/>
+        <w:rPr>
+          <w:rFonts w:ascii="GHEA Grapalat" w:hAnsi="GHEA Grapalat"/>
+          <w:lang w:val="hy-AM"/>
+        </w:rPr>
+      </w:pPr>
+    </w:p>
+    <w:p>
+      <w:pPr>
+        <w:pStyle w:val="NormalWeb"/>
+        <w:rPr>
+          <w:rFonts w:ascii="GHEA Grapalat" w:hAnsi="GHEA Grapalat"/>
+          <w:lang w:val="hy-AM"/>
+        </w:rPr>
+      </w:pPr>
+      <w:r>
+        <w:rPr>
+          <w:rFonts w:ascii="GHEA Grapalat" w:hAnsi="GHEA Grapalat"/>
+          <w:lang w:val="hy-AM"/>
+        </w:rPr>
+        <w:t>Կողերի կշիռները ոչ բացասական են և ստատիկ։</w:t>
+      </w:r>
+    </w:p>
+    <w:p>
+      <w:pPr>
+        <w:pStyle w:val="NormalWeb"/>
+        <w:rPr>
+          <w:rFonts w:ascii="GHEA Grapalat" w:hAnsi="GHEA Grapalat"/>
+          <w:lang w:val="hy-AM"/>
+        </w:rPr>
+      </w:pPr>
+      <w:r>
+        <w:rPr>
+          <w:rFonts w:ascii="GHEA Grapalat" w:hAnsi="GHEA Grapalat"/>
+          <w:lang w:val="hy-AM"/>
+        </w:rPr>
+        <w:t xml:space="preserve">Էվրիստիկայի ճշգրտությունը կատարողունակության շարժիչ չէ (օրինակ՝ պլանավորում առանց ծախսերի ստորին սահմանների հեշտությամբ հասանելի </w:t>
+      </w:r>
+      <w:proofErr w:type="gramStart"/>
+      <w:r>
+        <w:rPr>
+          <w:rFonts w:ascii="GHEA Grapalat" w:hAnsi="GHEA Grapalat"/>
+          <w:lang w:val="hy-AM"/>
+        </w:rPr>
+        <w:t>միջավայրերում)։</w:t>
+      </w:r>
+      <w:proofErr w:type="gramEnd"/>
+    </w:p>
+    <w:p>
+      <w:pPr>
+        <w:pStyle w:val="NormalWeb"/>
+        <w:rPr>
+          <w:rFonts w:ascii="GHEA Grapalat" w:hAnsi="GHEA Grapalat"/>
+          <w:lang w:val="hy-AM"/>
+        </w:rPr>
+      </w:pPr>
+      <w:r>
+        <w:rPr>
+          <w:rFonts w:ascii="GHEA Grapalat" w:hAnsi="GHEA Grapalat"/>
+          <w:lang w:val="hy-AM"/>
+        </w:rPr>
+        <w:t>Հիշողության սահմանափակումները բացառում են ընդարձակ էվրիստիկ կառուցվածքների պահպանումը։</w:t>
+      </w:r>
+    </w:p>
+    <w:p>
+      <w:pPr>
+        <w:pStyle w:val="NormalWeb"/>
+        <w:rPr>
+          <w:rFonts w:ascii="GHEA Grapalat" w:hAnsi="GHEA Grapalat"/>
+          <w:lang w:val="hy-AM"/>
+        </w:rPr>
+      </w:pPr>
+      <w:r>
+        <w:rPr>
+          <w:rFonts w:ascii="GHEA Grapalat" w:hAnsi="GHEA Grapalat"/>
+          <w:lang w:val="hy-AM"/>
+        </w:rPr>
+        <w:t>Ա</w:t>
+      </w:r>
+      <w:r>
+        <w:rPr>
+          <w:rFonts w:ascii="GHEA Grapalat" w:hAnsi="GHEA Grapalat"/>
+          <w:lang w:val="hy-AM"/>
+        </w:rPr>
+        <w:t>-ի օպտիմալության պայմաններ*</w:t>
+      </w:r>
+    </w:p>
+    <w:p>
+      <w:pPr>
+        <w:pStyle w:val="NormalWeb"/>
+        <w:rPr>
+          <w:rFonts w:ascii="GHEA Grapalat" w:hAnsi="GHEA Grapalat"/>
+          <w:lang w:val="hy-AM"/>
+        </w:rPr>
+      </w:pPr>
+      <w:r>
+        <w:rPr>
+          <w:rFonts w:ascii="GHEA Grapalat" w:hAnsi="GHEA Grapalat"/>
+          <w:lang w:val="hy-AM"/>
+        </w:rPr>
+        <w:t>Հիմքում ընկած գրաֆը ներառում է երկրաչափական կամ տիրույթային հատուկ գիտելիք, որը կարող է քանակականացվել որպես թույլատրելի էվրիստիկա։</w:t>
+      </w:r>
+    </w:p>
+    <w:p>
+      <w:pPr>
+        <w:pStyle w:val="NormalWeb"/>
+        <w:rPr>
+          <w:rFonts w:ascii="GHEA Grapalat" w:hAnsi="GHEA Grapalat"/>
+          <w:lang w:val="hy-AM"/>
+        </w:rPr>
+      </w:pPr>
+      <w:r>
+        <w:rPr>
+          <w:rFonts w:ascii="GHEA Grapalat" w:hAnsi="GHEA Grapalat"/>
+          <w:lang w:val="hy-AM"/>
+        </w:rPr>
+        <w:lastRenderedPageBreak/>
+        <w:t>Էվրիստիկայի գնահատման հաշվողական ծանրաբեռնվածությունը մնում է սահմանափակված մոտ-հաստատուն գործակցով։</w:t>
+      </w:r>
+    </w:p>
+    <w:p>
+      <w:pPr>
+        <w:pStyle w:val="NormalWeb"/>
+        <w:rPr>
+          <w:rFonts w:ascii="GHEA Grapalat" w:hAnsi="GHEA Grapalat"/>
+          <w:lang w:val="hy-AM"/>
+        </w:rPr>
+      </w:pPr>
+      <w:r>
+        <w:rPr>
+          <w:rFonts w:ascii="GHEA Grapalat" w:hAnsi="GHEA Grapalat"/>
+          <w:lang w:val="hy-AM"/>
+        </w:rPr>
+        <w:t xml:space="preserve">h(v)/c(v) հարաբերակցությունը ձգտում է զգալիորեն բարձր արժեքի՝ թույլատրելիության առաստաղից վեր (≥0.7 ցանցային քարտեզների կիրառությունների մեծ </w:t>
+      </w:r>
+      <w:proofErr w:type="gramStart"/>
+      <w:r>
+        <w:rPr>
+          <w:rFonts w:ascii="GHEA Grapalat" w:hAnsi="GHEA Grapalat"/>
+          <w:lang w:val="hy-AM"/>
+        </w:rPr>
+        <w:t>մասում)։</w:t>
+      </w:r>
+      <w:proofErr w:type="gramEnd"/>
+    </w:p>
+    <w:p>
+      <w:pPr>
+        <w:pStyle w:val="NormalWeb"/>
+        <w:rPr>
+          <w:rFonts w:ascii="GHEA Grapalat" w:hAnsi="GHEA Grapalat"/>
+          <w:lang w:val="hy-AM"/>
+        </w:rPr>
+      </w:pPr>
+      <w:r>
+        <w:rPr>
+          <w:rFonts w:ascii="GHEA Grapalat" w:hAnsi="GHEA Grapalat"/>
+          <w:lang w:val="hy-AM"/>
+        </w:rPr>
+        <w:t>Եզրակացություն</w:t>
+      </w:r>
+    </w:p>
+    <w:p>
+      <w:pPr>
+        <w:pStyle w:val="NormalWeb"/>
+        <w:rPr>
+          <w:rFonts w:ascii="GHEA Grapalat" w:hAnsi="GHEA Grapalat"/>
+        </w:rPr>
+      </w:pPr>
+      <w:r>
+        <w:rPr>
+          <w:rFonts w:ascii="GHEA Grapalat" w:hAnsi="GHEA Grapalat"/>
+          <w:lang w:val="hy-AM"/>
+        </w:rPr>
+        <w:t>Այս համեմատական վերլուծությունը սահմանագծում է ալգորիթմական պայմանները, որոնց դեպքում յուրաքանչյուր տեխնիկա ապահովում է գերազանց կատարողունակություն, պարզաբանում է էվրիստիկ նախագծման գործնական հետևանքները և համ</w:t>
       </w:r>
       <w:bookmarkStart w:id="11" w:name="_GoBack"/>
       <w:bookmarkEnd w:id="11"/>
@@ -30140,180 +33615,35 @@
           <w:rFonts w:ascii="GHEA Grapalat" w:hAnsi="GHEA Grapalat"/>
           <w:lang w:val="hy-AM"/>
         </w:rPr>
-        <w:t xml:space="preserve">ով, որը գերազանցում է վերջնական օպտիմումը։ </w:t>
-      </w:r>
-      <w:r>
-        <w:rPr>
-          <w:rFonts w:ascii="GHEA Grapalat" w:hAnsi="GHEA Grapalat"/>
-          <w:lang w:val="hy-AM"/>
-        </w:rPr>
-        <w:t>Ա</w:t>
-      </w:r>
-      <w:r>
-        <w:rPr>
-          <w:rFonts w:ascii="GHEA Grapalat" w:hAnsi="GHEA Grapalat"/>
-          <w:lang w:val="hy-AM"/>
-        </w:rPr>
-        <w:t xml:space="preserve">*-ի օպտիմալությունը հիմնված է թույլատրելիության և համաձայնեցվածության համադրության վրա։ Այս պայմաններում ալգորիթմը հանգույցները հեռացնում է պրիորիտետային հերթից՝ իրական ճանապարհի ծախսի չնվազող կարգով, երաշխավորելով, որ հայտնաբերված առաջին լուծումը օպտիմալ է։ Եթե h-ը թույլատրելի չէ, </w:t>
-      </w:r>
-      <w:r>
-        <w:rPr>
-          <w:rFonts w:ascii="GHEA Grapalat" w:hAnsi="GHEA Grapalat"/>
-          <w:lang w:val="hy-AM"/>
-        </w:rPr>
-        <w:t>Ա</w:t>
-      </w:r>
-      <w:r>
-        <w:rPr>
-          <w:rFonts w:ascii="GHEA Grapalat" w:hAnsi="GHEA Grapalat"/>
-          <w:lang w:val="hy-AM"/>
-        </w:rPr>
-        <w:t>*-ն կարող է վերադարձնել ենթաօպտիմալ ճանապարհ. եթե h-ը անհամաձայնեցված է, ալգորիթմը կարող է դեռևս լինել թույլատրելի, բայց կարող է ընդլայնել հանգույցները խիստ մոնոտոն կարգից դուրս։</w:t>
-      </w:r>
-    </w:p>
-    <w:p>
-      <w:pPr>
-        <w:pStyle w:val="NormalWeb"/>
-        <w:rPr>
-          <w:rFonts w:ascii="GHEA Grapalat" w:hAnsi="GHEA Grapalat"/>
-          <w:lang w:val="hy-AM"/>
-        </w:rPr>
-      </w:pPr>
-    </w:p>
-    <w:p>
-      <w:pPr>
-        <w:pStyle w:val="Heading2"/>
-        <w:rPr>
-          <w:rFonts w:ascii="GHEA Grapalat" w:hAnsi="GHEA Grapalat"/>
-          <w:b/>
-          <w:color w:val="auto"/>
-          <w:lang w:val="hy-AM"/>
-        </w:rPr>
-      </w:pPr>
-      <w:r>
-        <w:rPr>
-          <w:rFonts w:ascii="GHEA Grapalat" w:hAnsi="GHEA Grapalat"/>
-          <w:b/>
-          <w:color w:val="auto"/>
-          <w:lang w:val="hy-AM"/>
-        </w:rPr>
-        <w:t>2</w:t>
-      </w:r>
-      <w:r>
-        <w:rPr>
-          <w:rFonts w:ascii="Cambria Math" w:hAnsi="Cambria Math" w:cs="Cambria Math"/>
-          <w:b/>
-          <w:color w:val="auto"/>
-          <w:lang w:val="hy-AM"/>
-        </w:rPr>
-        <w:t>․</w:t>
-      </w:r>
-      <w:r>
-        <w:rPr>
-          <w:rFonts w:ascii="GHEA Grapalat" w:hAnsi="GHEA Grapalat"/>
-          <w:b/>
-          <w:color w:val="auto"/>
-          <w:lang w:val="hy-AM"/>
-        </w:rPr>
-        <w:t>2</w:t>
-      </w:r>
-      <w:r>
-        <w:rPr>
-          <w:rFonts w:ascii="Cambria Math" w:hAnsi="Cambria Math" w:cs="Cambria Math"/>
-          <w:b/>
-          <w:color w:val="auto"/>
-          <w:lang w:val="hy-AM"/>
-        </w:rPr>
-        <w:t>․</w:t>
-      </w:r>
-      <w:r>
-        <w:rPr>
-          <w:rFonts w:ascii="GHEA Grapalat" w:hAnsi="GHEA Grapalat"/>
-          <w:b/>
-          <w:color w:val="auto"/>
-          <w:lang w:val="hy-AM"/>
-        </w:rPr>
-        <w:t xml:space="preserve">5 </w:t>
-      </w:r>
-      <w:r>
-        <w:rPr>
-          <w:rFonts w:ascii="GHEA Grapalat" w:hAnsi="GHEA Grapalat"/>
-          <w:b/>
-          <w:color w:val="auto"/>
-          <w:lang w:val="hy-AM"/>
-        </w:rPr>
-        <w:t>Հաշվողական</w:t>
-      </w:r>
-      <w:r>
-        <w:rPr>
-          <w:rFonts w:ascii="GHEA Grapalat" w:hAnsi="GHEA Grapalat"/>
-          <w:b/>
-          <w:color w:val="auto"/>
-          <w:lang w:val="hy-AM"/>
-        </w:rPr>
-        <w:t xml:space="preserve"> և ժամանակային</w:t>
-      </w:r>
-      <w:r>
-        <w:rPr>
-          <w:rFonts w:ascii="GHEA Grapalat" w:hAnsi="GHEA Grapalat"/>
-          <w:b/>
-          <w:color w:val="auto"/>
-          <w:lang w:val="hy-AM"/>
-        </w:rPr>
-        <w:t xml:space="preserve"> բարդություն</w:t>
-      </w:r>
-    </w:p>
-    <w:p>
-      <w:pPr>
-        <w:pStyle w:val="NormalWeb"/>
-        <w:rPr>
-          <w:rFonts w:ascii="GHEA Grapalat" w:hAnsi="GHEA Grapalat"/>
-          <w:lang w:val="hy-AM"/>
-        </w:rPr>
-      </w:pPr>
-    </w:p>
-    <w:p>
-      <w:pPr>
-        <w:pStyle w:val="NormalWeb"/>
-        <w:rPr>
-          <w:rFonts w:ascii="GHEA Grapalat" w:hAnsi="GHEA Grapalat"/>
-          <w:lang w:val="hy-AM"/>
-        </w:rPr>
-      </w:pPr>
-      <w:r>
-        <w:rPr>
-          <w:rFonts w:ascii="GHEA Grapalat" w:hAnsi="GHEA Grapalat"/>
-          <w:lang w:val="hy-AM"/>
-        </w:rPr>
-        <w:t xml:space="preserve">Երկու ալգորիթմներն էլ պահանջում են տվյալների կառուցվածք՝ ճակատային հանգույցների մասնակի դասավորությունները կառավարելու համար։ Երկուական կույտի (binary heap) առկայության դեպքում մեկ extract-min կամ insert գործողության միջինացված արժեքը O(log |E|) է։ </w:t>
-      </w:r>
-      <w:r>
-        <w:rPr>
-          <w:rFonts w:ascii="GHEA Grapalat" w:hAnsi="GHEA Grapalat"/>
-          <w:lang w:val="hy-AM"/>
-        </w:rPr>
-        <w:t>Դեյքստրայ</w:t>
-      </w:r>
-      <w:r>
-        <w:rPr>
-          <w:rFonts w:ascii="GHEA Grapalat" w:hAnsi="GHEA Grapalat"/>
-          <w:lang w:val="hy-AM"/>
-        </w:rPr>
-        <w:t>ի տեսական ժամանակային սահմանը G(V,E) գրաֆի համար՝ երկուական կույտի դեպքում</w:t>
-      </w:r>
-      <w:r>
-        <w:rPr>
-          <w:rFonts w:ascii="GHEA Grapalat" w:hAnsi="GHEA Grapalat"/>
-          <w:lang w:val="hy-AM"/>
-        </w:rPr>
-        <w:t xml:space="preserve"> ՝ </w:t>
-      </w:r>
-      <w:r>
-        <w:rPr>
-          <w:rFonts w:ascii="GHEA Grapalat" w:hAnsi="GHEA Grapalat"/>
-          <w:lang w:val="hy-AM"/>
-        </w:rPr>
-        <w:t>O((|V|+|E|)·log |V|) է։ Դասական հարևանության մատրիցի իրականացման դեպքում սահմանը վատանում է մինչև O(|E|) յուրաքանչյուր ռելակսացիայի համար, ինչը խիտ գրաֆերի համար տալիս է ընդհանուր O(|V|^2)։</w:t>
+        <w:t xml:space="preserve">ատեքստավորում է գտածոները իրական աշխարհի կիրառությունների սպեկտրի շրջանակներում։ Համակարգվածորեն հակադրելով տեսական երաշխիքները, էմպիրիկ կատարողունակության մետրիկները և իրականացման սահմանափակումները՝ գլուխը տրամադրում է ապացույցների վրա հիմնված հիմք՝ համապատասխան կարճագույն ճանապարհի ալգորիթմը ընտրելու համար տարբեր հաշվողական միջավայրերում։ Ապագա հետազոտությունների ուղղությունները ներառում են ադապտիվ հիբրիդային ֆրեյմվորքներ, որոնք դինամիկորեն անցում են կատարում </w:t>
+      </w:r>
+      <w:r>
+        <w:rPr>
+          <w:rFonts w:ascii="GHEA Grapalat" w:hAnsi="GHEA Grapalat"/>
+          <w:lang w:val="hy-AM"/>
+        </w:rPr>
+        <w:t>Դեյքստրայի</w:t>
+      </w:r>
+      <w:r>
+        <w:rPr>
+          <w:rFonts w:ascii="GHEA Grapalat" w:hAnsi="GHEA Grapalat"/>
+          <w:lang w:val="hy-AM"/>
+        </w:rPr>
+        <w:t xml:space="preserve">-ի նման ճշգրտության և </w:t>
+      </w:r>
+      <w:r>
+        <w:rPr>
+          <w:rFonts w:ascii="GHEA Grapalat" w:hAnsi="GHEA Grapalat"/>
+          <w:lang w:val="hy-AM"/>
+        </w:rPr>
+        <w:t>Ա*</w:t>
+      </w:r>
+      <w:r>
+        <w:rPr>
+          <w:rFonts w:ascii="GHEA Grapalat" w:hAnsi="GHEA Grapalat"/>
+          <w:lang w:val="hy-AM"/>
+        </w:rPr>
+        <w:t>-ով ուղղորդվող էվրիստիկաների միջև՝ հիմնվելով դիտարկված ծախսերի մոդելի կայունության վրա, դրանով իսկ կամրջելով բացը ալգորիթմական տեսության և օպերացիոն տեղակայման միջև։</w:t>
       </w:r>
     </w:p>
     <w:sectPr>
@@ -37158,7 +40488,7 @@
 </file>
 
 <file path=customXml/itemProps1.xml><?xml version="1.0" encoding="utf-8"?>
-<ds:datastoreItem xmlns:ds="http://schemas.openxmlformats.org/officeDocument/2006/customXml" ds:itemID="{79F3B066-542A-4780-A2F8-B18F3AFAB2AF}">
+<ds:datastoreItem xmlns:ds="http://schemas.openxmlformats.org/officeDocument/2006/customXml" ds:itemID="{6E370655-24C3-4461-81E7-DCD30709CEA7}">
   <ds:schemaRefs>
     <ds:schemaRef ds:uri="http://schemas.openxmlformats.org/officeDocument/2006/bibliography"/>
   </ds:schemaRefs>

</xml_diff>